<commit_message>
Ajout de link rel=icon href=data pour PWABuilder
</commit_message>
<xml_diff>
--- a/readme.docx
+++ b/readme.docx
@@ -70,26 +70,16 @@
       <w:pPr>
         <w:pStyle w:val="Sansinterligne"/>
       </w:pPr>
-      <w:proofErr w:type="gramStart"/>
-      <w:r>
-        <w:t>comme</w:t>
-      </w:r>
-      <w:proofErr w:type="gramEnd"/>
-      <w:r>
-        <w:t xml:space="preserve"> une application mobile classique, mais sans avoir besoin de la télécharger</w:t>
-      </w:r>
-    </w:p>
-    <w:p>
-      <w:pPr>
-        <w:pStyle w:val="Sansinterligne"/>
-      </w:pPr>
-      <w:proofErr w:type="gramStart"/>
-      <w:r>
-        <w:t>depuis</w:t>
-      </w:r>
-      <w:proofErr w:type="gramEnd"/>
-      <w:r>
-        <w:t xml:space="preserve"> le Google Play Store ou l'App Store d'Apple.</w:t>
+      <w:r>
+        <w:t>comme une application mobile classique, mais sans avoir besoin de la télécharger</w:t>
+      </w:r>
+    </w:p>
+    <w:p>
+      <w:pPr>
+        <w:pStyle w:val="Sansinterligne"/>
+      </w:pPr>
+      <w:r>
+        <w:t>depuis le Google Play Store ou l'App Store d'Apple.</w:t>
       </w:r>
     </w:p>
     <w:p>
@@ -117,13 +107,8 @@
       <w:pPr>
         <w:pStyle w:val="Sansinterligne"/>
       </w:pPr>
-      <w:proofErr w:type="gramStart"/>
-      <w:r>
-        <w:t>simple</w:t>
-      </w:r>
-      <w:proofErr w:type="gramEnd"/>
-      <w:r>
-        <w:t xml:space="preserve"> raccourci sur l'écran d'accueil du téléphone. C'est pourquoi j'utilise les GitHub Pages.</w:t>
+      <w:r>
+        <w:t>simple raccourci sur l'écran d'accueil du téléphone. C'est pourquoi j'utilise les GitHub Pages.</w:t>
       </w:r>
     </w:p>
     <w:p>
@@ -165,13 +150,8 @@
       <w:pPr>
         <w:pStyle w:val="Sansinterligne"/>
       </w:pPr>
-      <w:proofErr w:type="gramStart"/>
-      <w:r>
-        <w:t>à</w:t>
-      </w:r>
-      <w:proofErr w:type="gramEnd"/>
-      <w:r>
-        <w:t xml:space="preserve"> l'application et permet de l'installer.</w:t>
+      <w:r>
+        <w:t>à l'application et permet de l'installer.</w:t>
       </w:r>
     </w:p>
     <w:p>
@@ -192,31 +172,16 @@
         <w:pStyle w:val="Sansinterligne"/>
       </w:pPr>
       <w:r>
-        <w:t xml:space="preserve">Fichier </w:t>
-      </w:r>
-      <w:proofErr w:type="spellStart"/>
-      <w:proofErr w:type="gramStart"/>
-      <w:r>
-        <w:t>manifest.json</w:t>
-      </w:r>
-      <w:proofErr w:type="spellEnd"/>
-      <w:proofErr w:type="gramEnd"/>
-      <w:r>
-        <w:t xml:space="preserve"> .</w:t>
-      </w:r>
-    </w:p>
-    <w:p>
-      <w:pPr>
-        <w:pStyle w:val="Sansinterligne"/>
-      </w:pPr>
-      <w:r>
-        <w:t xml:space="preserve">Fichier </w:t>
-      </w:r>
-      <w:proofErr w:type="gramStart"/>
-      <w:r>
-        <w:t>service-worker.js .</w:t>
-      </w:r>
-      <w:proofErr w:type="gramEnd"/>
+        <w:t>Fichier manifest.json .</w:t>
+      </w:r>
+    </w:p>
+    <w:p>
+      <w:pPr>
+        <w:pStyle w:val="Sansinterligne"/>
+      </w:pPr>
+      <w:r>
+        <w:t>Fichier service-worker.js .</w:t>
+      </w:r>
     </w:p>
     <w:p>
       <w:pPr>
@@ -230,63 +195,21 @@
       <w:pPr>
         <w:pStyle w:val="Sansinterligne"/>
       </w:pPr>
-      <w:proofErr w:type="spellStart"/>
-      <w:r>
-        <w:t>Fuchier</w:t>
-      </w:r>
-      <w:proofErr w:type="spellEnd"/>
-      <w:r>
-        <w:t xml:space="preserve"> .</w:t>
-      </w:r>
-      <w:proofErr w:type="spellStart"/>
-      <w:r>
-        <w:t>htaccess</w:t>
-      </w:r>
-      <w:proofErr w:type="spellEnd"/>
-      <w:r>
-        <w:t xml:space="preserve"> : force à rester en https (c'était un essai pour héberger sur </w:t>
-      </w:r>
-      <w:proofErr w:type="gramStart"/>
-      <w:r>
-        <w:t>https://choraleknds.42web.io/ )</w:t>
-      </w:r>
-      <w:proofErr w:type="gramEnd"/>
-    </w:p>
-    <w:p>
-      <w:pPr>
-        <w:pStyle w:val="Sansinterligne"/>
-      </w:pPr>
-    </w:p>
-    <w:p>
-      <w:pPr>
-        <w:pStyle w:val="Sansinterligne"/>
-      </w:pPr>
-      <w:r>
-        <w:t xml:space="preserve">Je suis dans </w:t>
-      </w:r>
-      <w:proofErr w:type="gramStart"/>
-      <w:r>
-        <w:t>un fenêtre</w:t>
-      </w:r>
-      <w:proofErr w:type="gramEnd"/>
-      <w:r>
-        <w:t xml:space="preserve"> de commande cmd, dans le répertoire où j'ai les fichiers de mon application. J'ai un compte </w:t>
-      </w:r>
-      <w:proofErr w:type="spellStart"/>
-      <w:r>
-        <w:t>github</w:t>
-      </w:r>
-      <w:proofErr w:type="spellEnd"/>
-      <w:r>
-        <w:t xml:space="preserve">. </w:t>
-      </w:r>
-      <w:proofErr w:type="spellStart"/>
-      <w:r>
-        <w:t>Quells</w:t>
-      </w:r>
-      <w:proofErr w:type="spellEnd"/>
-      <w:r>
-        <w:t xml:space="preserve"> commandes git dois-je exécuter ?</w:t>
+      <w:r>
+        <w:t>Fuchier .htaccess : force à rester en https (c'était un essai pour héberger sur https://choraleknds.42web.io/ )</w:t>
+      </w:r>
+    </w:p>
+    <w:p>
+      <w:pPr>
+        <w:pStyle w:val="Sansinterligne"/>
+      </w:pPr>
+    </w:p>
+    <w:p>
+      <w:pPr>
+        <w:pStyle w:val="Sansinterligne"/>
+      </w:pPr>
+      <w:r>
+        <w:t>Je suis dans un fenêtre de commande cmd, dans le répertoire où j'ai les fichiers de mon application. J'ai un compte github. Quells commandes git dois-je exécuter ?</w:t>
       </w:r>
     </w:p>
     <w:p>
@@ -346,15 +269,7 @@
         <w:pStyle w:val="Sansinterligne"/>
       </w:pPr>
       <w:r>
-        <w:t xml:space="preserve">Nommez-le par exemple </w:t>
-      </w:r>
-      <w:proofErr w:type="spellStart"/>
-      <w:r>
-        <w:t>solfege</w:t>
-      </w:r>
-      <w:proofErr w:type="spellEnd"/>
-      <w:r>
-        <w:t>.</w:t>
+        <w:t>Nommez-le par exemple solfege.</w:t>
       </w:r>
     </w:p>
     <w:p>
@@ -380,41 +295,20 @@
         <w:pStyle w:val="Sansinterligne"/>
       </w:pPr>
       <w:r>
-        <w:t xml:space="preserve">Ne cochez aucune case (ni README, </w:t>
-      </w:r>
-      <w:proofErr w:type="gramStart"/>
-      <w:r>
-        <w:t>ni .</w:t>
-      </w:r>
-      <w:proofErr w:type="spellStart"/>
-      <w:r>
-        <w:t>gitignore</w:t>
-      </w:r>
-      <w:proofErr w:type="spellEnd"/>
-      <w:proofErr w:type="gramEnd"/>
-      <w:r>
-        <w:t>).</w:t>
-      </w:r>
-    </w:p>
-    <w:p>
-      <w:pPr>
-        <w:pStyle w:val="Sansinterligne"/>
-      </w:pPr>
-    </w:p>
-    <w:p>
-      <w:pPr>
-        <w:pStyle w:val="Sansinterligne"/>
-      </w:pPr>
-      <w:r>
-        <w:t xml:space="preserve">Cliquez sur </w:t>
-      </w:r>
-      <w:proofErr w:type="spellStart"/>
-      <w:r>
-        <w:t>Create</w:t>
-      </w:r>
-      <w:proofErr w:type="spellEnd"/>
-      <w:r>
-        <w:t xml:space="preserve"> repository.</w:t>
+        <w:t>Ne cochez aucune case (ni README, ni .gitignore).</w:t>
+      </w:r>
+    </w:p>
+    <w:p>
+      <w:pPr>
+        <w:pStyle w:val="Sansinterligne"/>
+      </w:pPr>
+    </w:p>
+    <w:p>
+      <w:pPr>
+        <w:pStyle w:val="Sansinterligne"/>
+      </w:pPr>
+      <w:r>
+        <w:t>Cliquez sur Create repository.</w:t>
       </w:r>
     </w:p>
     <w:p>
@@ -468,192 +362,100 @@
       <w:pPr>
         <w:pStyle w:val="Sansinterligne"/>
       </w:pPr>
-      <w:proofErr w:type="gramStart"/>
-      <w:r>
-        <w:t>::</w:t>
-      </w:r>
-      <w:proofErr w:type="gramEnd"/>
-      <w:r>
-        <w:t xml:space="preserve"> Initialise le dossier comme un dépôt Git</w:t>
-      </w:r>
-    </w:p>
-    <w:p>
-      <w:pPr>
-        <w:pStyle w:val="Sansinterligne"/>
-      </w:pPr>
-      <w:proofErr w:type="gramStart"/>
-      <w:r>
-        <w:t>git</w:t>
-      </w:r>
-      <w:proofErr w:type="gramEnd"/>
-      <w:r>
-        <w:t xml:space="preserve"> init</w:t>
-      </w:r>
-    </w:p>
-    <w:p>
-      <w:pPr>
-        <w:pStyle w:val="Sansinterligne"/>
-      </w:pPr>
-    </w:p>
-    <w:p>
-      <w:pPr>
-        <w:pStyle w:val="Sansinterligne"/>
-      </w:pPr>
-      <w:proofErr w:type="gramStart"/>
-      <w:r>
-        <w:t>::</w:t>
-      </w:r>
-      <w:proofErr w:type="gramEnd"/>
-      <w:r>
-        <w:t xml:space="preserve"> Ajoute tous vos fichiers (index.html, </w:t>
-      </w:r>
-      <w:proofErr w:type="spellStart"/>
-      <w:r>
-        <w:t>manifest</w:t>
-      </w:r>
-      <w:proofErr w:type="spellEnd"/>
-      <w:r>
-        <w:t xml:space="preserve">, </w:t>
-      </w:r>
-      <w:proofErr w:type="spellStart"/>
-      <w:r>
-        <w:t>icons</w:t>
-      </w:r>
-      <w:proofErr w:type="spellEnd"/>
-      <w:r>
-        <w:t>, etc.)</w:t>
-      </w:r>
-    </w:p>
-    <w:p>
-      <w:pPr>
-        <w:pStyle w:val="Sansinterligne"/>
-      </w:pPr>
-      <w:proofErr w:type="gramStart"/>
-      <w:r>
-        <w:t>git</w:t>
-      </w:r>
-      <w:proofErr w:type="gramEnd"/>
-      <w:r>
-        <w:t xml:space="preserve"> </w:t>
-      </w:r>
-      <w:proofErr w:type="spellStart"/>
-      <w:proofErr w:type="gramStart"/>
-      <w:r>
-        <w:t>add</w:t>
-      </w:r>
-      <w:proofErr w:type="spellEnd"/>
-      <w:r>
-        <w:t xml:space="preserve"> .</w:t>
-      </w:r>
-      <w:proofErr w:type="gramEnd"/>
-    </w:p>
-    <w:p>
-      <w:pPr>
-        <w:pStyle w:val="Sansinterligne"/>
-      </w:pPr>
-    </w:p>
-    <w:p>
-      <w:pPr>
-        <w:pStyle w:val="Sansinterligne"/>
-      </w:pPr>
-      <w:proofErr w:type="gramStart"/>
-      <w:r>
-        <w:t>::</w:t>
-      </w:r>
-      <w:proofErr w:type="gramEnd"/>
-      <w:r>
-        <w:t xml:space="preserve"> Crée votre premier point de sauvegarde</w:t>
-      </w:r>
-    </w:p>
-    <w:p>
-      <w:pPr>
-        <w:pStyle w:val="Sansinterligne"/>
-      </w:pPr>
-      <w:proofErr w:type="gramStart"/>
-      <w:r>
-        <w:t>git</w:t>
-      </w:r>
-      <w:proofErr w:type="gramEnd"/>
-      <w:r>
-        <w:t xml:space="preserve"> commit -m "</w:t>
-      </w:r>
-      <w:proofErr w:type="spellStart"/>
-      <w:r>
-        <w:t>Premiere</w:t>
-      </w:r>
-      <w:proofErr w:type="spellEnd"/>
-      <w:r>
-        <w:t xml:space="preserve"> version PWA"</w:t>
-      </w:r>
-    </w:p>
-    <w:p>
-      <w:pPr>
-        <w:pStyle w:val="Sansinterligne"/>
-      </w:pPr>
-    </w:p>
-    <w:p>
-      <w:pPr>
-        <w:pStyle w:val="Sansinterligne"/>
-      </w:pPr>
-      <w:proofErr w:type="gramStart"/>
-      <w:r>
-        <w:t>::</w:t>
-      </w:r>
-      <w:proofErr w:type="gramEnd"/>
-      <w:r>
-        <w:t xml:space="preserve"> Renomme la branche principale en 'main'</w:t>
-      </w:r>
-    </w:p>
-    <w:p>
-      <w:pPr>
-        <w:pStyle w:val="Sansinterligne"/>
-      </w:pPr>
-      <w:proofErr w:type="gramStart"/>
-      <w:r>
-        <w:t>git</w:t>
-      </w:r>
-      <w:proofErr w:type="gramEnd"/>
-      <w:r>
-        <w:t xml:space="preserve"> </w:t>
-      </w:r>
-      <w:proofErr w:type="spellStart"/>
-      <w:r>
-        <w:t>branch</w:t>
-      </w:r>
-      <w:proofErr w:type="spellEnd"/>
-      <w:r>
-        <w:t xml:space="preserve"> -M main</w:t>
-      </w:r>
-    </w:p>
-    <w:p>
-      <w:pPr>
-        <w:pStyle w:val="Sansinterligne"/>
-      </w:pPr>
-    </w:p>
-    <w:p>
-      <w:pPr>
-        <w:pStyle w:val="Sansinterligne"/>
-      </w:pPr>
-      <w:proofErr w:type="gramStart"/>
-      <w:r>
-        <w:t>::</w:t>
-      </w:r>
-      <w:proofErr w:type="gramEnd"/>
-      <w:r>
-        <w:t xml:space="preserve"> Relie votre dossier local à votre compte GitHub</w:t>
-      </w:r>
-    </w:p>
-    <w:p>
-      <w:pPr>
-        <w:pStyle w:val="Sansinterligne"/>
-      </w:pPr>
-      <w:proofErr w:type="gramStart"/>
-      <w:r>
-        <w:t>::</w:t>
-      </w:r>
-      <w:proofErr w:type="gramEnd"/>
-      <w:r>
-        <w:t xml:space="preserve"> (Remplacez l'URL par celle que vous avez copiée à l'étape 1)</w:t>
+      <w:r>
+        <w:t>:: Initialise le dossier comme un dépôt Git</w:t>
+      </w:r>
+    </w:p>
+    <w:p>
+      <w:pPr>
+        <w:pStyle w:val="Sansinterligne"/>
+      </w:pPr>
+      <w:r>
+        <w:t>git init</w:t>
+      </w:r>
+    </w:p>
+    <w:p>
+      <w:pPr>
+        <w:pStyle w:val="Sansinterligne"/>
+      </w:pPr>
+    </w:p>
+    <w:p>
+      <w:pPr>
+        <w:pStyle w:val="Sansinterligne"/>
+      </w:pPr>
+      <w:r>
+        <w:t>:: Ajoute tous vos fichiers (index.html, manifest, icons, etc.)</w:t>
+      </w:r>
+    </w:p>
+    <w:p>
+      <w:pPr>
+        <w:pStyle w:val="Sansinterligne"/>
+      </w:pPr>
+      <w:r>
+        <w:t>git add .</w:t>
+      </w:r>
+    </w:p>
+    <w:p>
+      <w:pPr>
+        <w:pStyle w:val="Sansinterligne"/>
+      </w:pPr>
+    </w:p>
+    <w:p>
+      <w:pPr>
+        <w:pStyle w:val="Sansinterligne"/>
+      </w:pPr>
+      <w:r>
+        <w:t>:: Crée votre premier point de sauvegarde</w:t>
+      </w:r>
+    </w:p>
+    <w:p>
+      <w:pPr>
+        <w:pStyle w:val="Sansinterligne"/>
+      </w:pPr>
+      <w:r>
+        <w:t>git commit -m "Premiere version PWA"</w:t>
+      </w:r>
+    </w:p>
+    <w:p>
+      <w:pPr>
+        <w:pStyle w:val="Sansinterligne"/>
+      </w:pPr>
+    </w:p>
+    <w:p>
+      <w:pPr>
+        <w:pStyle w:val="Sansinterligne"/>
+      </w:pPr>
+      <w:r>
+        <w:t>:: Renomme la branche principale en 'main'</w:t>
+      </w:r>
+    </w:p>
+    <w:p>
+      <w:pPr>
+        <w:pStyle w:val="Sansinterligne"/>
+      </w:pPr>
+      <w:r>
+        <w:t>git branch -M main</w:t>
+      </w:r>
+    </w:p>
+    <w:p>
+      <w:pPr>
+        <w:pStyle w:val="Sansinterligne"/>
+      </w:pPr>
+    </w:p>
+    <w:p>
+      <w:pPr>
+        <w:pStyle w:val="Sansinterligne"/>
+      </w:pPr>
+      <w:r>
+        <w:t>:: Relie votre dossier local à votre compte GitHub</w:t>
+      </w:r>
+    </w:p>
+    <w:p>
+      <w:pPr>
+        <w:pStyle w:val="Sansinterligne"/>
+      </w:pPr>
+      <w:r>
+        <w:t>:: (Remplacez l'URL par celle que vous avez copiée à l'étape 1)</w:t>
       </w:r>
     </w:p>
     <w:p>
@@ -682,34 +484,16 @@
       <w:pPr>
         <w:pStyle w:val="Sansinterligne"/>
       </w:pPr>
-      <w:proofErr w:type="gramStart"/>
-      <w:r>
-        <w:t>::</w:t>
-      </w:r>
-      <w:proofErr w:type="gramEnd"/>
-      <w:r>
-        <w:t xml:space="preserve"> Envoie vos fichiers sur GitHub</w:t>
-      </w:r>
-    </w:p>
-    <w:p>
-      <w:pPr>
-        <w:pStyle w:val="Sansinterligne"/>
-      </w:pPr>
-      <w:proofErr w:type="gramStart"/>
-      <w:r>
-        <w:t>git</w:t>
-      </w:r>
-      <w:proofErr w:type="gramEnd"/>
-      <w:r>
-        <w:t xml:space="preserve"> push -u </w:t>
-      </w:r>
-      <w:proofErr w:type="spellStart"/>
-      <w:r>
-        <w:t>origin</w:t>
-      </w:r>
-      <w:proofErr w:type="spellEnd"/>
-      <w:r>
-        <w:t xml:space="preserve"> main</w:t>
+      <w:r>
+        <w:t>:: Envoie vos fichiers sur GitHub</w:t>
+      </w:r>
+    </w:p>
+    <w:p>
+      <w:pPr>
+        <w:pStyle w:val="Sansinterligne"/>
+      </w:pPr>
+      <w:r>
+        <w:t>git push -u origin main</w:t>
       </w:r>
     </w:p>
     <w:p>
@@ -777,23 +561,7 @@
         <w:pStyle w:val="Sansinterligne"/>
       </w:pPr>
       <w:r>
-        <w:t>Sous "</w:t>
-      </w:r>
-      <w:proofErr w:type="spellStart"/>
-      <w:r>
-        <w:t>Build</w:t>
-      </w:r>
-      <w:proofErr w:type="spellEnd"/>
-      <w:r>
-        <w:t xml:space="preserve"> and </w:t>
-      </w:r>
-      <w:proofErr w:type="spellStart"/>
-      <w:r>
-        <w:t>deployment</w:t>
-      </w:r>
-      <w:proofErr w:type="spellEnd"/>
-      <w:r>
-        <w:t>", vérifiez que "Branch" est sur main et le dossier sur /(root).</w:t>
+        <w:t>Sous "Build and deployment", vérifiez que "Branch" est sur main et le dossier sur /(root).</w:t>
       </w:r>
     </w:p>
     <w:p>
@@ -852,31 +620,15 @@
         <w:rPr>
           <w:lang w:val="en-GB"/>
         </w:rPr>
-        <w:t xml:space="preserve">git config --global </w:t>
-      </w:r>
-      <w:proofErr w:type="spellStart"/>
-      <w:proofErr w:type="gramStart"/>
-      <w:r>
+        <w:t>git config --global core.autocrlf true</w:t>
+      </w:r>
+    </w:p>
+    <w:p>
+      <w:pPr>
+        <w:pStyle w:val="Sansinterligne"/>
         <w:rPr>
           <w:lang w:val="en-GB"/>
         </w:rPr>
-        <w:t>core.autocrlf</w:t>
-      </w:r>
-      <w:proofErr w:type="spellEnd"/>
-      <w:proofErr w:type="gramEnd"/>
-      <w:r>
-        <w:rPr>
-          <w:lang w:val="en-GB"/>
-        </w:rPr>
-        <w:t xml:space="preserve"> true</w:t>
-      </w:r>
-    </w:p>
-    <w:p>
-      <w:pPr>
-        <w:pStyle w:val="Sansinterligne"/>
-        <w:rPr>
-          <w:lang w:val="en-GB"/>
-        </w:rPr>
       </w:pPr>
     </w:p>
     <w:p>
@@ -901,25 +653,8 @@
       </w:pPr>
       <w:r>
         <w:tab/>
-      </w:r>
-      <w:proofErr w:type="gramStart"/>
-      <w:r>
-        <w:t>git</w:t>
-      </w:r>
-      <w:proofErr w:type="gramEnd"/>
-      <w:r>
-        <w:t xml:space="preserve"> </w:t>
-      </w:r>
-      <w:proofErr w:type="spellStart"/>
-      <w:proofErr w:type="gramStart"/>
-      <w:r>
-        <w:t>add</w:t>
-      </w:r>
-      <w:proofErr w:type="spellEnd"/>
-      <w:r>
-        <w:t xml:space="preserve"> .</w:t>
-      </w:r>
-      <w:proofErr w:type="gramEnd"/>
+        <w:t>git add .</w:t>
+      </w:r>
     </w:p>
     <w:p>
       <w:pPr>
@@ -927,14 +662,7 @@
       </w:pPr>
       <w:r>
         <w:tab/>
-      </w:r>
-      <w:proofErr w:type="gramStart"/>
-      <w:r>
-        <w:t>git</w:t>
-      </w:r>
-      <w:proofErr w:type="gramEnd"/>
-      <w:r>
-        <w:t xml:space="preserve"> commit -m "rapatriement en local du fichier vexflow.js"</w:t>
+        <w:t>git commit -m "rapatriement en local du fichier vexflow.js"</w:t>
       </w:r>
     </w:p>
     <w:p>
@@ -943,22 +671,7 @@
       </w:pPr>
       <w:r>
         <w:tab/>
-      </w:r>
-      <w:proofErr w:type="gramStart"/>
-      <w:r>
-        <w:t>git</w:t>
-      </w:r>
-      <w:proofErr w:type="gramEnd"/>
-      <w:r>
-        <w:t xml:space="preserve"> push </w:t>
-      </w:r>
-      <w:proofErr w:type="spellStart"/>
-      <w:r>
-        <w:t>origin</w:t>
-      </w:r>
-      <w:proofErr w:type="spellEnd"/>
-      <w:r>
-        <w:t xml:space="preserve"> main</w:t>
+        <w:t>git push origin main</w:t>
       </w:r>
     </w:p>
     <w:p>
@@ -990,15 +703,7 @@
         <w:pStyle w:val="Sansinterligne"/>
       </w:pPr>
       <w:r>
-        <w:t xml:space="preserve">- ouvrir Google Chrome (sur smartphone ou PC), Safari sur </w:t>
-      </w:r>
-      <w:proofErr w:type="spellStart"/>
-      <w:r>
-        <w:t>IPhone</w:t>
-      </w:r>
-      <w:proofErr w:type="spellEnd"/>
-      <w:r>
-        <w:t xml:space="preserve"> </w:t>
+        <w:t xml:space="preserve">- ouvrir Google Chrome (sur smartphone ou PC), Safari sur IPhone </w:t>
       </w:r>
     </w:p>
     <w:p>
@@ -1056,33 +761,7 @@
       </w:r>
       <w:r>
         <w:tab/>
-        <w:t xml:space="preserve">   </w:t>
-      </w:r>
-      <w:proofErr w:type="gramStart"/>
-      <w:r>
-        <w:t>par</w:t>
-      </w:r>
-      <w:proofErr w:type="gramEnd"/>
-      <w:r>
-        <w:t xml:space="preserve"> le fichier </w:t>
-      </w:r>
-      <w:proofErr w:type="spellStart"/>
-      <w:proofErr w:type="gramStart"/>
-      <w:r>
-        <w:t>manifest.json</w:t>
-      </w:r>
-      <w:proofErr w:type="spellEnd"/>
-      <w:proofErr w:type="gramEnd"/>
-      <w:r>
-        <w:t>) alors que sur smartphone son nom est "</w:t>
-      </w:r>
-      <w:proofErr w:type="gramStart"/>
-      <w:r>
-        <w:t>solfier</w:t>
-      </w:r>
-      <w:proofErr w:type="gramEnd"/>
-      <w:r>
-        <w:t>" dans la</w:t>
+        <w:t xml:space="preserve">   par le fichier manifest.json) alors que sur smartphone son nom est "solfier" dans la</w:t>
       </w:r>
     </w:p>
     <w:p>
@@ -1094,15 +773,7 @@
       </w:r>
       <w:r>
         <w:tab/>
-        <w:t xml:space="preserve">   </w:t>
-      </w:r>
-      <w:proofErr w:type="gramStart"/>
-      <w:r>
-        <w:t>liste</w:t>
-      </w:r>
-      <w:proofErr w:type="gramEnd"/>
-      <w:r>
-        <w:t xml:space="preserve"> des applications --&gt; à unifier</w:t>
+        <w:t xml:space="preserve">   liste des applications --&gt; à unifier</w:t>
       </w:r>
     </w:p>
     <w:p>
@@ -1198,31 +869,7 @@
         <w:t>Action :</w:t>
       </w:r>
       <w:r>
-        <w:t xml:space="preserve"> Augmentez-la (</w:t>
-      </w:r>
-      <w:proofErr w:type="gramStart"/>
-      <w:r>
-        <w:t>ex:</w:t>
-      </w:r>
-      <w:proofErr w:type="gramEnd"/>
-      <w:r>
-        <w:t xml:space="preserve"> 30) pour forcer un travail de stabilité vocale et de longueur de souffle (idéal pour le travail de </w:t>
-      </w:r>
-      <w:proofErr w:type="spellStart"/>
-      <w:r>
-        <w:t>choeur</w:t>
-      </w:r>
-      <w:proofErr w:type="spellEnd"/>
-      <w:r>
-        <w:t>). Diminuez-la (</w:t>
-      </w:r>
-      <w:proofErr w:type="gramStart"/>
-      <w:r>
-        <w:t>ex:</w:t>
-      </w:r>
-      <w:proofErr w:type="gramEnd"/>
-      <w:r>
-        <w:t xml:space="preserve"> 10) pour une lecture de notes très rapide et nerveuse.</w:t>
+        <w:t xml:space="preserve"> Augmentez-la (ex: 30) pour forcer un travail de stabilité vocale et de longueur de souffle (idéal pour le travail de choeur). Diminuez-la (ex: 10) pour une lecture de notes très rapide et nerveuse.</w:t>
       </w:r>
     </w:p>
     <w:p>
@@ -1239,11 +886,9 @@
         </w:rPr>
         <w:t xml:space="preserve">Le seuil de bruit (dans la fonction </w:t>
       </w:r>
-      <w:proofErr w:type="spellStart"/>
       <w:r>
         <w:t>autoCorrelate</w:t>
       </w:r>
-      <w:proofErr w:type="spellEnd"/>
       <w:r>
         <w:rPr>
           <w:b/>
@@ -1252,23 +897,7 @@
         <w:t>)</w:t>
       </w:r>
       <w:r>
-        <w:t xml:space="preserve"> (actuellement 0.045 à la ligne if (</w:t>
-      </w:r>
-      <w:proofErr w:type="spellStart"/>
-      <w:r>
-        <w:t>Math.sqrt</w:t>
-      </w:r>
-      <w:proofErr w:type="spellEnd"/>
-      <w:r>
-        <w:t>(</w:t>
-      </w:r>
-      <w:proofErr w:type="spellStart"/>
-      <w:r>
-        <w:t>rms</w:t>
-      </w:r>
-      <w:proofErr w:type="spellEnd"/>
-      <w:r>
-        <w:t>/SIZE) &lt; 0.045) return -1;)</w:t>
+        <w:t xml:space="preserve"> (actuellement 0.045 à la ligne if (Math.sqrt(rms/SIZE) &lt; 0.045) return -1;)</w:t>
       </w:r>
     </w:p>
     <w:p>
@@ -1304,15 +933,7 @@
         <w:t>Action :</w:t>
       </w:r>
       <w:r>
-        <w:t xml:space="preserve"> Si l'application détecte des "fausses notes" à cause du bruit ambiant (ventilateur de PC, bruit de fond), augmentez ce seuil (</w:t>
-      </w:r>
-      <w:proofErr w:type="gramStart"/>
-      <w:r>
-        <w:t>ex:</w:t>
-      </w:r>
-      <w:proofErr w:type="gramEnd"/>
-      <w:r>
-        <w:t xml:space="preserve"> 0.06 ou 0.08). Si le micro du Pixel 7a capte mal votre voix quand vous chantez doucement (</w:t>
+        <w:t xml:space="preserve"> Si l'application détecte des "fausses notes" à cause du bruit ambiant (ventilateur de PC, bruit de fond), augmentez ce seuil (ex: 0.06 ou 0.08). Si le micro du Pixel 7a capte mal votre voix quand vous chantez doucement (</w:t>
       </w:r>
       <w:r>
         <w:rPr>
@@ -1332,15 +953,7 @@
         <w:t>pianissimo</w:t>
       </w:r>
       <w:r>
-        <w:t>), baissez-le légèrement (</w:t>
-      </w:r>
-      <w:proofErr w:type="gramStart"/>
-      <w:r>
-        <w:t>ex:</w:t>
-      </w:r>
-      <w:proofErr w:type="gramEnd"/>
-      <w:r>
-        <w:t xml:space="preserve"> 0.03).</w:t>
+        <w:t>), baissez-le légèrement (ex: 0.03).</w:t>
       </w:r>
     </w:p>
     <w:p>
@@ -1357,11 +970,9 @@
         </w:rPr>
         <w:t xml:space="preserve">Le seuil de clarté du signal (dans </w:t>
       </w:r>
-      <w:proofErr w:type="spellStart"/>
       <w:r>
         <w:t>autoCorrelate</w:t>
       </w:r>
-      <w:proofErr w:type="spellEnd"/>
       <w:r>
         <w:rPr>
           <w:b/>
@@ -1370,15 +981,7 @@
         <w:t>)</w:t>
       </w:r>
       <w:r>
-        <w:t xml:space="preserve"> (actuellement 0.2 à la ligne let r1=0, r2=SIZE-1, </w:t>
-      </w:r>
-      <w:proofErr w:type="spellStart"/>
-      <w:r>
-        <w:t>thres</w:t>
-      </w:r>
-      <w:proofErr w:type="spellEnd"/>
-      <w:r>
-        <w:t>=0.2;)</w:t>
+        <w:t xml:space="preserve"> (actuellement 0.2 à la ligne let r1=0, r2=SIZE-1, thres=0.2;)</w:t>
       </w:r>
     </w:p>
     <w:p>
@@ -1425,135 +1028,24 @@
       </w:r>
     </w:p>
     <w:p>
-      <w:pPr>
-        <w:rPr>
-          <w:lang w:val="en-GB"/>
-        </w:rPr>
-      </w:pPr>
-      <w:proofErr w:type="spellStart"/>
-      <w:r>
-        <w:rPr>
-          <w:lang w:val="en-GB"/>
-        </w:rPr>
-        <w:t>const</w:t>
-      </w:r>
-      <w:proofErr w:type="spellEnd"/>
-      <w:r>
-        <w:rPr>
-          <w:lang w:val="en-GB"/>
-        </w:rPr>
-        <w:t xml:space="preserve"> VOICE_RANGES = {</w:t>
-      </w:r>
-    </w:p>
-    <w:p>
-      <w:pPr>
-        <w:rPr>
-          <w:lang w:val="en-GB"/>
-        </w:rPr>
-      </w:pPr>
-      <w:r>
-        <w:rPr>
-          <w:lang w:val="en-GB"/>
-        </w:rPr>
-        <w:t xml:space="preserve">    bass: </w:t>
-      </w:r>
-      <w:proofErr w:type="gramStart"/>
-      <w:r>
-        <w:rPr>
-          <w:lang w:val="en-GB"/>
-        </w:rPr>
-        <w:t xml:space="preserve">   {</w:t>
-      </w:r>
-      <w:proofErr w:type="gramEnd"/>
-      <w:r>
-        <w:rPr>
-          <w:lang w:val="en-GB"/>
-        </w:rPr>
-        <w:t xml:space="preserve"> clef: "bass</w:t>
-      </w:r>
-      <w:proofErr w:type="gramStart"/>
-      <w:r>
-        <w:rPr>
-          <w:lang w:val="en-GB"/>
-        </w:rPr>
-        <w:t xml:space="preserve">",   </w:t>
-      </w:r>
-      <w:proofErr w:type="gramEnd"/>
-      <w:r>
-        <w:rPr>
-          <w:lang w:val="en-GB"/>
-        </w:rPr>
-        <w:t xml:space="preserve"> min: "e/2", max: "e/4", median: "d/3</w:t>
-      </w:r>
-      <w:proofErr w:type="gramStart"/>
-      <w:r>
-        <w:rPr>
-          <w:lang w:val="en-GB"/>
-        </w:rPr>
-        <w:t>" }</w:t>
-      </w:r>
-      <w:proofErr w:type="gramEnd"/>
-      <w:r>
-        <w:rPr>
-          <w:lang w:val="en-GB"/>
-        </w:rPr>
-        <w:t xml:space="preserve">, </w:t>
-      </w:r>
-    </w:p>
-    <w:p>
-      <w:pPr>
-        <w:rPr>
-          <w:lang w:val="en-GB"/>
-        </w:rPr>
-      </w:pPr>
-      <w:r>
-        <w:rPr>
-          <w:lang w:val="en-GB"/>
-        </w:rPr>
+      <w:r>
+        <w:t>const VOICE_RANGES = {</w:t>
+      </w:r>
+    </w:p>
+    <w:p>
+      <w:r>
+        <w:t xml:space="preserve">    bass:    { clef: "bass",    min: "e/2", max: "e/4", median: "d/3" }, </w:t>
+      </w:r>
+    </w:p>
+    <w:p>
+      <w:r>
         <w:lastRenderedPageBreak/>
-        <w:t xml:space="preserve">    tenor:</w:t>
-      </w:r>
-      <w:proofErr w:type="gramStart"/>
-      <w:r>
-        <w:rPr>
-          <w:lang w:val="en-GB"/>
-        </w:rPr>
-        <w:t xml:space="preserve">   {</w:t>
-      </w:r>
-      <w:proofErr w:type="gramEnd"/>
-      <w:r>
-        <w:rPr>
-          <w:lang w:val="en-GB"/>
-        </w:rPr>
-        <w:t xml:space="preserve"> clef: "treble</w:t>
-      </w:r>
-      <w:proofErr w:type="gramStart"/>
-      <w:r>
-        <w:rPr>
-          <w:lang w:val="en-GB"/>
-        </w:rPr>
-        <w:t>",  min</w:t>
-      </w:r>
-      <w:proofErr w:type="gramEnd"/>
-      <w:r>
-        <w:rPr>
-          <w:lang w:val="en-GB"/>
-        </w:rPr>
-        <w:t>: "c/4", max: "c/6", median: "b/4</w:t>
-      </w:r>
-      <w:proofErr w:type="gramStart"/>
-      <w:r>
-        <w:rPr>
-          <w:lang w:val="en-GB"/>
-        </w:rPr>
-        <w:t>" }</w:t>
-      </w:r>
-      <w:proofErr w:type="gramEnd"/>
-      <w:r>
-        <w:rPr>
-          <w:lang w:val="en-GB"/>
-        </w:rPr>
-        <w:t xml:space="preserve">, </w:t>
+        <w:t xml:space="preserve">    tenor:   { clef: "treble",  min: "c/4", max: "c/6", median: "b/4" }, </w:t>
+      </w:r>
+    </w:p>
+    <w:p>
+      <w:r>
+        <w:t xml:space="preserve">    alto:    { clef: "treble",  min: "f/3", max: "f/5", median: "e/4" }, </w:t>
       </w:r>
     </w:p>
     <w:p>
@@ -1563,29 +1055,13 @@
         </w:rPr>
       </w:pPr>
       <w:r>
-        <w:rPr>
-          <w:lang w:val="en-GB"/>
-        </w:rPr>
         <w:t xml:space="preserve">    </w:t>
       </w:r>
       <w:r>
         <w:rPr>
           <w:lang w:val="it-IT"/>
         </w:rPr>
-        <w:t xml:space="preserve">alto:    { clef: "treble",  min: "f/3", max: "f/5", median: "e/4" }, </w:t>
-      </w:r>
-    </w:p>
-    <w:p>
-      <w:pPr>
-        <w:rPr>
-          <w:lang w:val="it-IT"/>
-        </w:rPr>
-      </w:pPr>
-      <w:r>
-        <w:rPr>
-          <w:lang w:val="it-IT"/>
-        </w:rPr>
-        <w:t xml:space="preserve">    soprano: { clef: "treble",  min: "c/4", max: "c/6", median: "b/4" }  </w:t>
+        <w:t xml:space="preserve">soprano: { clef: "treble",  min: "c/4", max: "c/6", median: "b/4" }  </w:t>
       </w:r>
     </w:p>
     <w:p>
@@ -1600,11 +1076,9 @@
           <w:numId w:val="2"/>
         </w:numPr>
       </w:pPr>
-      <w:proofErr w:type="gramStart"/>
       <w:r>
         <w:t>min</w:t>
       </w:r>
-      <w:proofErr w:type="gramEnd"/>
       <w:r>
         <w:rPr>
           <w:b/>
@@ -1623,15 +1097,7 @@
         <w:t xml:space="preserve"> :</w:t>
       </w:r>
       <w:r>
-        <w:t xml:space="preserve"> Définissent les notes extrêmes qui pourront être affichées sur la portée (format </w:t>
-      </w:r>
-      <w:proofErr w:type="spellStart"/>
-      <w:r>
-        <w:t>VexFlow</w:t>
-      </w:r>
-      <w:proofErr w:type="spellEnd"/>
-      <w:r>
-        <w:t xml:space="preserve"> : note/octave). Par exemple, "e/2" est le </w:t>
+        <w:t xml:space="preserve"> Définissent les notes extrêmes qui pourront être affichées sur la portée (format VexFlow : note/octave). Par exemple, "e/2" est le </w:t>
       </w:r>
       <w:r>
         <w:rPr>
@@ -1661,13 +1127,9 @@
           <w:numId w:val="2"/>
         </w:numPr>
       </w:pPr>
-      <w:proofErr w:type="spellStart"/>
-      <w:proofErr w:type="gramStart"/>
       <w:r>
         <w:t>median</w:t>
       </w:r>
-      <w:proofErr w:type="spellEnd"/>
-      <w:proofErr w:type="gramEnd"/>
       <w:r>
         <w:rPr>
           <w:b/>
@@ -1711,26 +1173,16 @@
         </w:rPr>
         <w:t xml:space="preserve">3. La logique des niveaux (dans la fonction </w:t>
       </w:r>
-      <w:proofErr w:type="spellStart"/>
-      <w:proofErr w:type="gramStart"/>
-      <w:r>
-        <w:t>drawNote</w:t>
-      </w:r>
-      <w:proofErr w:type="spellEnd"/>
-      <w:r>
-        <w:t>(</w:t>
-      </w:r>
-      <w:proofErr w:type="gramEnd"/>
-      <w:r>
+      <w:r>
+        <w:t>drawNote()</w:t>
+      </w:r>
+      <w:r>
+        <w:rPr>
+          <w:b/>
+          <w:bCs/>
+        </w:rPr>
         <w:t>)</w:t>
       </w:r>
-      <w:r>
-        <w:rPr>
-          <w:b/>
-          <w:bCs/>
-        </w:rPr>
-        <w:t>)</w:t>
-      </w:r>
     </w:p>
     <w:p>
       <w:r>
@@ -1743,29 +1195,9 @@
       </w:r>
     </w:p>
     <w:p>
-      <w:proofErr w:type="spellStart"/>
-      <w:proofErr w:type="gramStart"/>
-      <w:r>
-        <w:t>const</w:t>
-      </w:r>
-      <w:proofErr w:type="spellEnd"/>
-      <w:proofErr w:type="gramEnd"/>
-      <w:r>
-        <w:t xml:space="preserve"> offset = 2 + (</w:t>
-      </w:r>
-      <w:proofErr w:type="spellStart"/>
-      <w:r>
-        <w:t>level</w:t>
-      </w:r>
-      <w:proofErr w:type="spellEnd"/>
-      <w:r>
-        <w:t xml:space="preserve"> - 1</w:t>
-      </w:r>
-      <w:proofErr w:type="gramStart"/>
-      <w:r>
-        <w:t>);</w:t>
-      </w:r>
-      <w:proofErr w:type="gramEnd"/>
+      <w:r>
+        <w:t>const offset = 2 + (level - 1);</w:t>
+      </w:r>
     </w:p>
     <w:p>
       <w:pPr>
@@ -1782,23 +1214,7 @@
         <w:t>Rôle :</w:t>
       </w:r>
       <w:r>
-        <w:t xml:space="preserve"> Au niveau 1, offset vaut 2. L'application choisit donc des notes situées à maximum 2 crans de la note </w:t>
-      </w:r>
-      <w:proofErr w:type="spellStart"/>
-      <w:r>
-        <w:t>median</w:t>
-      </w:r>
-      <w:proofErr w:type="spellEnd"/>
-      <w:r>
-        <w:t xml:space="preserve"> (dans le tableau </w:t>
-      </w:r>
-      <w:proofErr w:type="spellStart"/>
-      <w:r>
-        <w:t>scale</w:t>
-      </w:r>
-      <w:proofErr w:type="spellEnd"/>
-      <w:r>
-        <w:t>). À chaque niveau supplémentaire, l'écart augmente d'une note vers le haut et d'une note vers le bas.</w:t>
+        <w:t xml:space="preserve"> Au niveau 1, offset vaut 2. L'application choisit donc des notes situées à maximum 2 crans de la note median (dans le tableau scale). À chaque niveau supplémentaire, l'écart augmente d'une note vers le haut et d'une note vers le bas.</w:t>
       </w:r>
     </w:p>
     <w:p>
@@ -1816,31 +1232,7 @@
         <w:t>Action :</w:t>
       </w:r>
       <w:r>
-        <w:t xml:space="preserve"> Si vous trouvez que l'écart entre le Niveau 1 et le Niveau 5 est trop brutal, vous pouvez modifier le coefficient multiplicateur, par exemple : </w:t>
-      </w:r>
-      <w:proofErr w:type="spellStart"/>
-      <w:r>
-        <w:t>const</w:t>
-      </w:r>
-      <w:proofErr w:type="spellEnd"/>
-      <w:r>
-        <w:t xml:space="preserve"> offset = 1 + ((</w:t>
-      </w:r>
-      <w:proofErr w:type="spellStart"/>
-      <w:r>
-        <w:t>level</w:t>
-      </w:r>
-      <w:proofErr w:type="spellEnd"/>
-      <w:r>
-        <w:t xml:space="preserve"> - 1) * 2</w:t>
-      </w:r>
-      <w:proofErr w:type="gramStart"/>
-      <w:r>
-        <w:t>);</w:t>
-      </w:r>
-      <w:proofErr w:type="gramEnd"/>
-      <w:r>
-        <w:t xml:space="preserve"> pour doubler l'écart à chaque palier.</w:t>
+        <w:t xml:space="preserve"> Si vous trouvez que l'écart entre le Niveau 1 et le Niveau 5 est trop brutal, vous pouvez modifier le coefficient multiplicateur, par exemple : const offset = 1 + ((level - 1) * 2); pour doubler l'écart à chaque palier.</w:t>
       </w:r>
     </w:p>
     <w:p>
@@ -1857,11 +1249,9 @@
         </w:rPr>
         <w:t>4. Les paramètres du synthétiseur du clavier (</w:t>
       </w:r>
-      <w:proofErr w:type="spellStart"/>
       <w:r>
         <w:t>playNote</w:t>
       </w:r>
-      <w:proofErr w:type="spellEnd"/>
       <w:r>
         <w:rPr>
           <w:b/>
@@ -1882,15 +1272,8 @@
           <w:numId w:val="4"/>
         </w:numPr>
       </w:pPr>
-      <w:proofErr w:type="spellStart"/>
-      <w:proofErr w:type="gramStart"/>
-      <w:r>
-        <w:t>osc.type</w:t>
-      </w:r>
-      <w:proofErr w:type="spellEnd"/>
-      <w:proofErr w:type="gramEnd"/>
-      <w:r>
-        <w:t xml:space="preserve"> (actuellement 'sine')</w:t>
+      <w:r>
+        <w:t>osc.type (actuellement 'sine')</w:t>
       </w:r>
     </w:p>
     <w:p>
@@ -1926,15 +1309,7 @@
         <w:t>Action :</w:t>
       </w:r>
       <w:r>
-        <w:t xml:space="preserve"> Le sinus ('sine') donne un son très pur de sifflement. Vous pouvez le changer en 'triangle' (plus doux, proche d'une flûte), '</w:t>
-      </w:r>
-      <w:proofErr w:type="spellStart"/>
-      <w:r>
-        <w:t>sawtooth</w:t>
-      </w:r>
-      <w:proofErr w:type="spellEnd"/>
-      <w:r>
-        <w:t>' (onde en dent de scie, très riche en harmoniques, style cordes/violon) ou 'square' (onde carrée, style clarinette/vieux jeux vidéo) pour changer le timbre du repère audio.</w:t>
+        <w:t xml:space="preserve"> Le sinus ('sine') donne un son très pur de sifflement. Vous pouvez le changer en 'triangle' (plus doux, proche d'une flûte), 'sawtooth' (onde en dent de scie, très riche en harmoniques, style cordes/violon) ou 'square' (onde carrée, style clarinette/vieux jeux vidéo) pour changer le timbre du repère audio.</w:t>
       </w:r>
     </w:p>
     <w:p>
@@ -1952,23 +1327,8 @@
         <w:t>Le volume initial</w:t>
       </w:r>
       <w:r>
-        <w:t xml:space="preserve"> (actuellement 0.3 à la ligne </w:t>
-      </w:r>
-      <w:proofErr w:type="spellStart"/>
-      <w:proofErr w:type="gramStart"/>
-      <w:r>
-        <w:t>gainNode.gain.setValueAtTime</w:t>
-      </w:r>
-      <w:proofErr w:type="spellEnd"/>
-      <w:proofErr w:type="gramEnd"/>
-      <w:r>
-        <w:t xml:space="preserve">(0.3, </w:t>
-      </w:r>
-      <w:proofErr w:type="gramStart"/>
-      <w:r>
-        <w:t>...);)</w:t>
-      </w:r>
-      <w:proofErr w:type="gramEnd"/>
+        <w:t xml:space="preserve"> (actuellement 0.3 à la ligne gainNode.gain.setValueAtTime(0.3, ...);)</w:t>
+      </w:r>
     </w:p>
     <w:p>
       <w:pPr>
@@ -2013,13 +1373,8 @@
           <w:numId w:val="4"/>
         </w:numPr>
       </w:pPr>
-      <w:proofErr w:type="gramStart"/>
-      <w:r>
-        <w:t>duration</w:t>
-      </w:r>
-      <w:proofErr w:type="gramEnd"/>
-      <w:r>
-        <w:t xml:space="preserve"> (actuellement 2.5)</w:t>
+      <w:r>
+        <w:t>duration (actuellement 2.5)</w:t>
       </w:r>
     </w:p>
     <w:p>
@@ -2076,41 +1431,208 @@
     </w:p>
     <w:p>
       <w:r>
-        <w:t xml:space="preserve">Les tableaux NOTE_NAMES, </w:t>
-      </w:r>
-      <w:proofErr w:type="spellStart"/>
-      <w:r>
-        <w:t>scale</w:t>
-      </w:r>
-      <w:proofErr w:type="spellEnd"/>
-      <w:r>
-        <w:t xml:space="preserve">, </w:t>
-      </w:r>
-      <w:proofErr w:type="spellStart"/>
-      <w:r>
-        <w:t>toFrench</w:t>
-      </w:r>
-      <w:proofErr w:type="spellEnd"/>
-      <w:r>
-        <w:t xml:space="preserve"> et KEY_ALTERATIONS servent de base de données à l'application pour faire la correspondance entre les fréquences physiques (en Hz), les notations internationales (C, D, </w:t>
-      </w:r>
-      <w:proofErr w:type="gramStart"/>
-      <w:r>
-        <w:t>E...</w:t>
-      </w:r>
-      <w:proofErr w:type="gramEnd"/>
-      <w:r>
-        <w:t xml:space="preserve">) et l'affichage sur la portée de </w:t>
-      </w:r>
-      <w:proofErr w:type="spellStart"/>
-      <w:r>
-        <w:t>VexFlow</w:t>
-      </w:r>
-      <w:proofErr w:type="spellEnd"/>
-      <w:r>
-        <w:t>. Il est préférable de les laisser intacts pour éviter de désynchroniser le moteur graphique du moteur audio.</w:t>
-      </w:r>
-    </w:p>
+        <w:t>Les tableaux NOTE_NAMES, scale, toFrench et KEY_ALTERATIONS servent de base de données à l'application pour faire la correspondance entre les fréquences physiques (en Hz), les notations internationales (C, D, E...) et l'affichage sur la portée de VexFlow. Il est préférable de les laisser intacts pour éviter de désynchroniser le moteur graphique du moteur audio.</w:t>
+      </w:r>
+    </w:p>
+    <w:p/>
+    <w:p>
+      <w:pPr>
+        <w:pStyle w:val="Titre1"/>
+      </w:pPr>
+      <w:r>
+        <w:t>EN FAIRE UN FICHIER APK</w:t>
+      </w:r>
+    </w:p>
+    <w:p>
+      <w:pPr>
+        <w:rPr>
+          <w:b/>
+          <w:bCs/>
+        </w:rPr>
+      </w:pPr>
+      <w:r>
+        <w:rPr>
+          <w:b/>
+          <w:bCs/>
+        </w:rPr>
+        <w:t>Générer l'APK avec PWABuilder</w:t>
+      </w:r>
+    </w:p>
+    <w:p>
+      <w:r>
+        <w:t>Une fois que votre PWA tourne correctement sur son URL GitHub :</w:t>
+      </w:r>
+    </w:p>
+    <w:p>
+      <w:pPr>
+        <w:numPr>
+          <w:ilvl w:val="0"/>
+          <w:numId w:val="5"/>
+        </w:numPr>
+      </w:pPr>
+      <w:r>
+        <w:t xml:space="preserve">Rendez-vous sur le site </w:t>
+      </w:r>
+      <w:hyperlink r:id="rId5" w:tgtFrame="_blank" w:history="1">
+        <w:r>
+          <w:rPr>
+            <w:rStyle w:val="Lienhypertexte"/>
+          </w:rPr>
+          <w:t>PWABuilder.com</w:t>
+        </w:r>
+      </w:hyperlink>
+      <w:r>
+        <w:t>.</w:t>
+      </w:r>
+    </w:p>
+    <w:p>
+      <w:pPr>
+        <w:numPr>
+          <w:ilvl w:val="0"/>
+          <w:numId w:val="5"/>
+        </w:numPr>
+      </w:pPr>
+      <w:r>
+        <w:t>Copiez et collez l'URL de votre application (</w:t>
+      </w:r>
+      <w:r>
+        <w:t xml:space="preserve"> </w:t>
+      </w:r>
+      <w:hyperlink r:id="rId6" w:history="1">
+        <w:r>
+          <w:rPr>
+            <w:rStyle w:val="Lienhypertexte"/>
+          </w:rPr>
+          <w:t>https://tebounet.github.io/solfier/</w:t>
+        </w:r>
+      </w:hyperlink>
+      <w:r>
+        <w:t xml:space="preserve"> </w:t>
+      </w:r>
+      <w:r>
+        <w:t xml:space="preserve">) dans la barre centrale et cliquez sur </w:t>
+      </w:r>
+      <w:r>
+        <w:rPr>
+          <w:b/>
+          <w:bCs/>
+        </w:rPr>
+        <w:t>Start</w:t>
+      </w:r>
+      <w:r>
+        <w:t>.</w:t>
+      </w:r>
+    </w:p>
+    <w:p>
+      <w:pPr>
+        <w:numPr>
+          <w:ilvl w:val="0"/>
+          <w:numId w:val="5"/>
+        </w:numPr>
+      </w:pPr>
+      <w:r>
+        <w:t>L'outil va analyser vos fichiers. Si votre manifeste et vos icônes SVG sont conformes, vous obtiendrez un score vert très élevé.</w:t>
+      </w:r>
+    </w:p>
+    <w:p>
+      <w:pPr>
+        <w:numPr>
+          <w:ilvl w:val="0"/>
+          <w:numId w:val="5"/>
+        </w:numPr>
+      </w:pPr>
+      <w:r>
+        <w:t xml:space="preserve">Cliquez sur le bouton </w:t>
+      </w:r>
+      <w:r>
+        <w:rPr>
+          <w:b/>
+          <w:bCs/>
+        </w:rPr>
+        <w:t>Package for Stores</w:t>
+      </w:r>
+      <w:r>
+        <w:t xml:space="preserve"> puis, sur la ligne </w:t>
+      </w:r>
+      <w:r>
+        <w:rPr>
+          <w:b/>
+          <w:bCs/>
+        </w:rPr>
+        <w:t>Android</w:t>
+      </w:r>
+      <w:r>
+        <w:t xml:space="preserve">, cliquez sur </w:t>
+      </w:r>
+      <w:r>
+        <w:rPr>
+          <w:b/>
+          <w:bCs/>
+        </w:rPr>
+        <w:t>Generate Package</w:t>
+      </w:r>
+      <w:r>
+        <w:t>.</w:t>
+      </w:r>
+    </w:p>
+    <w:p>
+      <w:pPr>
+        <w:numPr>
+          <w:ilvl w:val="0"/>
+          <w:numId w:val="5"/>
+        </w:numPr>
+      </w:pPr>
+      <w:r>
+        <w:t xml:space="preserve">Une fenêtre d'options s'ouvre. Pour une distribution privée à votre entourage, vous pouvez laisser les options par défaut, mais veillez bien à télécharger le fichier de </w:t>
+      </w:r>
+      <w:r>
+        <w:rPr>
+          <w:b/>
+          <w:bCs/>
+        </w:rPr>
+        <w:t>clés de signature</w:t>
+      </w:r>
+      <w:r>
+        <w:t xml:space="preserve"> (signing key) que le site vous propose de sauvegarder. Elle sera indispensable pour faire de futures mises à jour.</w:t>
+      </w:r>
+    </w:p>
+    <w:p>
+      <w:pPr>
+        <w:numPr>
+          <w:ilvl w:val="0"/>
+          <w:numId w:val="5"/>
+        </w:numPr>
+      </w:pPr>
+      <w:r>
+        <w:t xml:space="preserve">Cliquez sur </w:t>
+      </w:r>
+      <w:r>
+        <w:rPr>
+          <w:b/>
+          <w:bCs/>
+        </w:rPr>
+        <w:t>Download</w:t>
+      </w:r>
+      <w:r>
+        <w:t>. Vous obtiendrez un fichier compressé .zip.</w:t>
+      </w:r>
+    </w:p>
+    <w:p>
+      <w:r>
+        <w:t xml:space="preserve">Dans ce fichier .zip, vous trouverez un fichier nommé </w:t>
+      </w:r>
+      <w:r>
+        <w:rPr>
+          <w:b/>
+          <w:bCs/>
+        </w:rPr>
+        <w:t>app-release-unsigned.apk</w:t>
+      </w:r>
+      <w:r>
+        <w:t xml:space="preserve"> (ou parfois simplement avec l'extension .apk). C'est ce précieux fichier qu'il faut envoyer à vos proches.</w:t>
+      </w:r>
+    </w:p>
+    <w:p/>
     <w:p/>
     <w:sectPr>
       <w:pgSz w:w="11906" w:h="16838"/>
@@ -2125,6 +1647,119 @@
 <file path=word/numbering.xml><?xml version="1.0" encoding="utf-8"?>
 <w:numbering xmlns:wpc="http://schemas.microsoft.com/office/word/2010/wordprocessingCanvas" xmlns:cx="http://schemas.microsoft.com/office/drawing/2014/chartex" xmlns:cx1="http://schemas.microsoft.com/office/drawing/2015/9/8/chartex" xmlns:cx2="http://schemas.microsoft.com/office/drawing/2015/10/21/chartex" xmlns:cx3="http://schemas.microsoft.com/office/drawing/2016/5/9/chartex" xmlns:cx4="http://schemas.microsoft.com/office/drawing/2016/5/10/chartex" xmlns:cx5="http://schemas.microsoft.com/office/drawing/2016/5/11/chartex" xmlns:cx6="http://schemas.microsoft.com/office/drawing/2016/5/12/chartex" xmlns:cx7="http://schemas.microsoft.com/office/drawing/2016/5/13/chartex" xmlns:cx8="http://schemas.microsoft.com/office/drawing/2016/5/14/chartex" xmlns:mc="http://schemas.openxmlformats.org/markup-compatibility/2006" xmlns:aink="http://schemas.microsoft.com/office/drawing/2016/ink" xmlns:am3d="http://schemas.microsoft.com/office/drawing/2017/model3d" xmlns:o="urn:schemas-microsoft-com:office:office" xmlns:oel="http://schemas.microsoft.com/office/2019/extlst" xmlns:r="http://schemas.openxmlformats.org/officeDocument/2006/relationships" xmlns:m="http://schemas.openxmlformats.org/officeDocument/2006/math" xmlns:v="urn:schemas-microsoft-com:vml" xmlns:wp14="http://schemas.microsoft.com/office/word/2010/wordprocessingDrawing" xmlns:wp="http://schemas.openxmlformats.org/drawingml/2006/wordprocessingDrawing" xmlns:w10="urn:schemas-microsoft-com:office:word" xmlns:w="http://schemas.openxmlformats.org/wordprocessingml/2006/main" xmlns:w14="http://schemas.microsoft.com/office/word/2010/wordml" xmlns:w15="http://schemas.microsoft.com/office/word/2012/wordml" xmlns:w16cex="http://schemas.microsoft.com/office/word/2018/wordml/cex" xmlns:w16cid="http://schemas.microsoft.com/office/word/2016/wordml/cid" xmlns:w16="http://schemas.microsoft.com/office/word/2018/wordml" xmlns:w16du="http://schemas.microsoft.com/office/word/2023/wordml/word16du" xmlns:w16sdtdh="http://schemas.microsoft.com/office/word/2020/wordml/sdtdatahash" xmlns:w16sdtfl="http://schemas.microsoft.com/office/word/2024/wordml/sdtformatlock" xmlns:w16se="http://schemas.microsoft.com/office/word/2015/wordml/symex" xmlns:wpg="http://schemas.microsoft.com/office/word/2010/wordprocessingGroup" xmlns:wpi="http://schemas.microsoft.com/office/word/2010/wordprocessingInk" xmlns:wne="http://schemas.microsoft.com/office/word/2006/wordml" xmlns:wps="http://schemas.microsoft.com/office/word/2010/wordprocessingShape" mc:Ignorable="w14 w15 w16se w16cid w16 w16cex w16sdtdh w16sdtfl w16du wp14">
   <w:abstractNum w:abstractNumId="0" w15:restartNumberingAfterBreak="0">
+    <w:nsid w:val="04474176"/>
+    <w:multiLevelType w:val="multilevel"/>
+    <w:tmpl w:val="31FE47F2"/>
+    <w:lvl w:ilvl="0">
+      <w:start w:val="1"/>
+      <w:numFmt w:val="decimal"/>
+      <w:lvlText w:val="%1."/>
+      <w:lvlJc w:val="left"/>
+      <w:pPr>
+        <w:tabs>
+          <w:tab w:val="num" w:pos="720"/>
+        </w:tabs>
+        <w:ind w:left="720" w:hanging="360"/>
+      </w:pPr>
+    </w:lvl>
+    <w:lvl w:ilvl="1" w:tentative="1">
+      <w:start w:val="1"/>
+      <w:numFmt w:val="decimal"/>
+      <w:lvlText w:val="%2."/>
+      <w:lvlJc w:val="left"/>
+      <w:pPr>
+        <w:tabs>
+          <w:tab w:val="num" w:pos="1440"/>
+        </w:tabs>
+        <w:ind w:left="1440" w:hanging="360"/>
+      </w:pPr>
+    </w:lvl>
+    <w:lvl w:ilvl="2" w:tentative="1">
+      <w:start w:val="1"/>
+      <w:numFmt w:val="decimal"/>
+      <w:lvlText w:val="%3."/>
+      <w:lvlJc w:val="left"/>
+      <w:pPr>
+        <w:tabs>
+          <w:tab w:val="num" w:pos="2160"/>
+        </w:tabs>
+        <w:ind w:left="2160" w:hanging="360"/>
+      </w:pPr>
+    </w:lvl>
+    <w:lvl w:ilvl="3" w:tentative="1">
+      <w:start w:val="1"/>
+      <w:numFmt w:val="decimal"/>
+      <w:lvlText w:val="%4."/>
+      <w:lvlJc w:val="left"/>
+      <w:pPr>
+        <w:tabs>
+          <w:tab w:val="num" w:pos="2880"/>
+        </w:tabs>
+        <w:ind w:left="2880" w:hanging="360"/>
+      </w:pPr>
+    </w:lvl>
+    <w:lvl w:ilvl="4" w:tentative="1">
+      <w:start w:val="1"/>
+      <w:numFmt w:val="decimal"/>
+      <w:lvlText w:val="%5."/>
+      <w:lvlJc w:val="left"/>
+      <w:pPr>
+        <w:tabs>
+          <w:tab w:val="num" w:pos="3600"/>
+        </w:tabs>
+        <w:ind w:left="3600" w:hanging="360"/>
+      </w:pPr>
+    </w:lvl>
+    <w:lvl w:ilvl="5" w:tentative="1">
+      <w:start w:val="1"/>
+      <w:numFmt w:val="decimal"/>
+      <w:lvlText w:val="%6."/>
+      <w:lvlJc w:val="left"/>
+      <w:pPr>
+        <w:tabs>
+          <w:tab w:val="num" w:pos="4320"/>
+        </w:tabs>
+        <w:ind w:left="4320" w:hanging="360"/>
+      </w:pPr>
+    </w:lvl>
+    <w:lvl w:ilvl="6" w:tentative="1">
+      <w:start w:val="1"/>
+      <w:numFmt w:val="decimal"/>
+      <w:lvlText w:val="%7."/>
+      <w:lvlJc w:val="left"/>
+      <w:pPr>
+        <w:tabs>
+          <w:tab w:val="num" w:pos="5040"/>
+        </w:tabs>
+        <w:ind w:left="5040" w:hanging="360"/>
+      </w:pPr>
+    </w:lvl>
+    <w:lvl w:ilvl="7" w:tentative="1">
+      <w:start w:val="1"/>
+      <w:numFmt w:val="decimal"/>
+      <w:lvlText w:val="%8."/>
+      <w:lvlJc w:val="left"/>
+      <w:pPr>
+        <w:tabs>
+          <w:tab w:val="num" w:pos="5760"/>
+        </w:tabs>
+        <w:ind w:left="5760" w:hanging="360"/>
+      </w:pPr>
+    </w:lvl>
+    <w:lvl w:ilvl="8" w:tentative="1">
+      <w:start w:val="1"/>
+      <w:numFmt w:val="decimal"/>
+      <w:lvlText w:val="%9."/>
+      <w:lvlJc w:val="left"/>
+      <w:pPr>
+        <w:tabs>
+          <w:tab w:val="num" w:pos="6480"/>
+        </w:tabs>
+        <w:ind w:left="6480" w:hanging="360"/>
+      </w:pPr>
+    </w:lvl>
+  </w:abstractNum>
+  <w:abstractNum w:abstractNumId="1" w15:restartNumberingAfterBreak="0">
     <w:nsid w:val="1FAE20A0"/>
     <w:multiLevelType w:val="multilevel"/>
     <w:tmpl w:val="8AE4F136"/>
@@ -2273,7 +1908,7 @@
       </w:rPr>
     </w:lvl>
   </w:abstractNum>
-  <w:abstractNum w:abstractNumId="1" w15:restartNumberingAfterBreak="0">
+  <w:abstractNum w:abstractNumId="2" w15:restartNumberingAfterBreak="0">
     <w:nsid w:val="365A643C"/>
     <w:multiLevelType w:val="multilevel"/>
     <w:tmpl w:val="2E943742"/>
@@ -2422,7 +2057,7 @@
       </w:rPr>
     </w:lvl>
   </w:abstractNum>
-  <w:abstractNum w:abstractNumId="2" w15:restartNumberingAfterBreak="0">
+  <w:abstractNum w:abstractNumId="3" w15:restartNumberingAfterBreak="0">
     <w:nsid w:val="5FBE4F53"/>
     <w:multiLevelType w:val="multilevel"/>
     <w:tmpl w:val="B8147BAC"/>
@@ -2571,7 +2206,7 @@
       </w:rPr>
     </w:lvl>
   </w:abstractNum>
-  <w:abstractNum w:abstractNumId="3" w15:restartNumberingAfterBreak="0">
+  <w:abstractNum w:abstractNumId="4" w15:restartNumberingAfterBreak="0">
     <w:nsid w:val="6A4F2020"/>
     <w:multiLevelType w:val="multilevel"/>
     <w:tmpl w:val="4A0ADFE8"/>
@@ -2721,15 +2356,18 @@
     </w:lvl>
   </w:abstractNum>
   <w:num w:numId="1" w16cid:durableId="2516222">
+    <w:abstractNumId w:val="3"/>
+  </w:num>
+  <w:num w:numId="2" w16cid:durableId="426266471">
     <w:abstractNumId w:val="2"/>
   </w:num>
-  <w:num w:numId="2" w16cid:durableId="426266471">
+  <w:num w:numId="3" w16cid:durableId="674767911">
+    <w:abstractNumId w:val="4"/>
+  </w:num>
+  <w:num w:numId="4" w16cid:durableId="483006734">
     <w:abstractNumId w:val="1"/>
   </w:num>
-  <w:num w:numId="3" w16cid:durableId="674767911">
-    <w:abstractNumId w:val="3"/>
-  </w:num>
-  <w:num w:numId="4" w16cid:durableId="483006734">
+  <w:num w:numId="5" w16cid:durableId="1090734232">
     <w:abstractNumId w:val="0"/>
   </w:num>
 </w:numbering>
@@ -3337,7 +2975,6 @@
   <w:style w:type="character" w:default="1" w:styleId="Policepardfaut">
     <w:name w:val="Default Paragraph Font"/>
     <w:uiPriority w:val="1"/>
-    <w:semiHidden/>
     <w:unhideWhenUsed/>
   </w:style>
   <w:style w:type="table" w:default="1" w:styleId="TableauNormal">
@@ -3659,6 +3296,29 @@
       <w:spacing w:after="0" w:line="240" w:lineRule="auto"/>
     </w:pPr>
   </w:style>
+  <w:style w:type="character" w:styleId="Lienhypertexte">
+    <w:name w:val="Hyperlink"/>
+    <w:basedOn w:val="Policepardfaut"/>
+    <w:uiPriority w:val="99"/>
+    <w:unhideWhenUsed/>
+    <w:rsid w:val="0083638A"/>
+    <w:rPr>
+      <w:color w:val="0563C1" w:themeColor="hyperlink"/>
+      <w:u w:val="single"/>
+    </w:rPr>
+  </w:style>
+  <w:style w:type="character" w:styleId="Mentionnonrsolue">
+    <w:name w:val="Unresolved Mention"/>
+    <w:basedOn w:val="Policepardfaut"/>
+    <w:uiPriority w:val="99"/>
+    <w:semiHidden/>
+    <w:unhideWhenUsed/>
+    <w:rsid w:val="0083638A"/>
+    <w:rPr>
+      <w:color w:val="605E5C"/>
+      <w:shd w:val="clear" w:color="auto" w:fill="E1DFDD"/>
+    </w:rPr>
+  </w:style>
 </w:styles>
 </file>
 

</xml_diff>

<commit_message>
Ajustement index.html pour PWABuilder
</commit_message>
<xml_diff>
--- a/readme.docx
+++ b/readme.docx
@@ -70,16 +70,26 @@
       <w:pPr>
         <w:pStyle w:val="Sansinterligne"/>
       </w:pPr>
-      <w:r>
-        <w:t>comme une application mobile classique, mais sans avoir besoin de la télécharger</w:t>
-      </w:r>
-    </w:p>
-    <w:p>
-      <w:pPr>
-        <w:pStyle w:val="Sansinterligne"/>
-      </w:pPr>
-      <w:r>
-        <w:t>depuis le Google Play Store ou l'App Store d'Apple.</w:t>
+      <w:proofErr w:type="gramStart"/>
+      <w:r>
+        <w:t>comme</w:t>
+      </w:r>
+      <w:proofErr w:type="gramEnd"/>
+      <w:r>
+        <w:t xml:space="preserve"> une application mobile classique, mais sans avoir besoin de la télécharger</w:t>
+      </w:r>
+    </w:p>
+    <w:p>
+      <w:pPr>
+        <w:pStyle w:val="Sansinterligne"/>
+      </w:pPr>
+      <w:proofErr w:type="gramStart"/>
+      <w:r>
+        <w:t>depuis</w:t>
+      </w:r>
+      <w:proofErr w:type="gramEnd"/>
+      <w:r>
+        <w:t xml:space="preserve"> le Google Play Store ou l'App Store d'Apple.</w:t>
       </w:r>
     </w:p>
     <w:p>
@@ -107,8 +117,13 @@
       <w:pPr>
         <w:pStyle w:val="Sansinterligne"/>
       </w:pPr>
-      <w:r>
-        <w:t>simple raccourci sur l'écran d'accueil du téléphone. C'est pourquoi j'utilise les GitHub Pages.</w:t>
+      <w:proofErr w:type="gramStart"/>
+      <w:r>
+        <w:t>simple</w:t>
+      </w:r>
+      <w:proofErr w:type="gramEnd"/>
+      <w:r>
+        <w:t xml:space="preserve"> raccourci sur l'écran d'accueil du téléphone. C'est pourquoi j'utilise les GitHub Pages.</w:t>
       </w:r>
     </w:p>
     <w:p>
@@ -150,8 +165,13 @@
       <w:pPr>
         <w:pStyle w:val="Sansinterligne"/>
       </w:pPr>
-      <w:r>
-        <w:t>à l'application et permet de l'installer.</w:t>
+      <w:proofErr w:type="gramStart"/>
+      <w:r>
+        <w:t>à</w:t>
+      </w:r>
+      <w:proofErr w:type="gramEnd"/>
+      <w:r>
+        <w:t xml:space="preserve"> l'application et permet de l'installer.</w:t>
       </w:r>
     </w:p>
     <w:p>
@@ -175,10 +195,12 @@
         <w:t xml:space="preserve">Fichier </w:t>
       </w:r>
       <w:proofErr w:type="spellStart"/>
+      <w:proofErr w:type="gramStart"/>
       <w:r>
         <w:t>manifest.json</w:t>
       </w:r>
       <w:proofErr w:type="spellEnd"/>
+      <w:proofErr w:type="gramEnd"/>
       <w:r>
         <w:t xml:space="preserve"> .</w:t>
       </w:r>
@@ -188,8 +210,13 @@
         <w:pStyle w:val="Sansinterligne"/>
       </w:pPr>
       <w:r>
-        <w:t>Fichier service-worker.js .</w:t>
-      </w:r>
+        <w:t xml:space="preserve">Fichier </w:t>
+      </w:r>
+      <w:proofErr w:type="gramStart"/>
+      <w:r>
+        <w:t>service-worker.js .</w:t>
+      </w:r>
+      <w:proofErr w:type="gramEnd"/>
     </w:p>
     <w:p>
       <w:pPr>
@@ -217,20 +244,33 @@
       </w:r>
       <w:proofErr w:type="spellEnd"/>
       <w:r>
-        <w:t xml:space="preserve"> : force à rester en https (c'était un essai pour héberger sur https://choraleknds.42web.io/ )</w:t>
-      </w:r>
-    </w:p>
-    <w:p>
-      <w:pPr>
-        <w:pStyle w:val="Sansinterligne"/>
-      </w:pPr>
-    </w:p>
-    <w:p>
-      <w:pPr>
-        <w:pStyle w:val="Sansinterligne"/>
-      </w:pPr>
-      <w:r>
-        <w:t xml:space="preserve">Je suis dans un fenêtre de commande cmd, dans le répertoire où j'ai les fichiers de mon application. J'ai un compte </w:t>
+        <w:t xml:space="preserve"> : force à rester en https (c'était un essai pour héberger sur </w:t>
+      </w:r>
+      <w:proofErr w:type="gramStart"/>
+      <w:r>
+        <w:t>https://choraleknds.42web.io/ )</w:t>
+      </w:r>
+      <w:proofErr w:type="gramEnd"/>
+    </w:p>
+    <w:p>
+      <w:pPr>
+        <w:pStyle w:val="Sansinterligne"/>
+      </w:pPr>
+    </w:p>
+    <w:p>
+      <w:pPr>
+        <w:pStyle w:val="Sansinterligne"/>
+      </w:pPr>
+      <w:r>
+        <w:t xml:space="preserve">Je suis dans </w:t>
+      </w:r>
+      <w:proofErr w:type="gramStart"/>
+      <w:r>
+        <w:t>un fenêtre</w:t>
+      </w:r>
+      <w:proofErr w:type="gramEnd"/>
+      <w:r>
+        <w:t xml:space="preserve"> de commande cmd, dans le répertoire où j'ai les fichiers de mon application. J'ai un compte </w:t>
       </w:r>
       <w:proofErr w:type="spellStart"/>
       <w:r>
@@ -340,13 +380,18 @@
         <w:pStyle w:val="Sansinterligne"/>
       </w:pPr>
       <w:r>
-        <w:t>Ne cochez aucune case (ni README, ni .</w:t>
+        <w:t xml:space="preserve">Ne cochez aucune case (ni README, </w:t>
+      </w:r>
+      <w:proofErr w:type="gramStart"/>
+      <w:r>
+        <w:t>ni .</w:t>
       </w:r>
       <w:proofErr w:type="spellStart"/>
       <w:r>
         <w:t>gitignore</w:t>
       </w:r>
       <w:proofErr w:type="spellEnd"/>
+      <w:proofErr w:type="gramEnd"/>
       <w:r>
         <w:t>).</w:t>
       </w:r>
@@ -423,29 +468,44 @@
       <w:pPr>
         <w:pStyle w:val="Sansinterligne"/>
       </w:pPr>
-      <w:r>
-        <w:t>:: Initialise le dossier comme un dépôt Git</w:t>
-      </w:r>
-    </w:p>
-    <w:p>
-      <w:pPr>
-        <w:pStyle w:val="Sansinterligne"/>
-      </w:pPr>
-      <w:r>
-        <w:t>git init</w:t>
-      </w:r>
-    </w:p>
-    <w:p>
-      <w:pPr>
-        <w:pStyle w:val="Sansinterligne"/>
-      </w:pPr>
-    </w:p>
-    <w:p>
-      <w:pPr>
-        <w:pStyle w:val="Sansinterligne"/>
-      </w:pPr>
-      <w:r>
-        <w:t xml:space="preserve">:: Ajoute tous vos fichiers (index.html, </w:t>
+      <w:proofErr w:type="gramStart"/>
+      <w:r>
+        <w:t>::</w:t>
+      </w:r>
+      <w:proofErr w:type="gramEnd"/>
+      <w:r>
+        <w:t xml:space="preserve"> Initialise le dossier comme un dépôt Git</w:t>
+      </w:r>
+    </w:p>
+    <w:p>
+      <w:pPr>
+        <w:pStyle w:val="Sansinterligne"/>
+      </w:pPr>
+      <w:proofErr w:type="gramStart"/>
+      <w:r>
+        <w:t>git</w:t>
+      </w:r>
+      <w:proofErr w:type="gramEnd"/>
+      <w:r>
+        <w:t xml:space="preserve"> init</w:t>
+      </w:r>
+    </w:p>
+    <w:p>
+      <w:pPr>
+        <w:pStyle w:val="Sansinterligne"/>
+      </w:pPr>
+    </w:p>
+    <w:p>
+      <w:pPr>
+        <w:pStyle w:val="Sansinterligne"/>
+      </w:pPr>
+      <w:proofErr w:type="gramStart"/>
+      <w:r>
+        <w:t>::</w:t>
+      </w:r>
+      <w:proofErr w:type="gramEnd"/>
+      <w:r>
+        <w:t xml:space="preserve"> Ajoute tous vos fichiers (index.html, </w:t>
       </w:r>
       <w:proofErr w:type="spellStart"/>
       <w:r>
@@ -468,10 +528,16 @@
       <w:pPr>
         <w:pStyle w:val="Sansinterligne"/>
       </w:pPr>
-      <w:r>
-        <w:t xml:space="preserve">git </w:t>
-      </w:r>
-      <w:proofErr w:type="spellStart"/>
+      <w:proofErr w:type="gramStart"/>
+      <w:r>
+        <w:t>git</w:t>
+      </w:r>
+      <w:proofErr w:type="gramEnd"/>
+      <w:r>
+        <w:t xml:space="preserve"> </w:t>
+      </w:r>
+      <w:proofErr w:type="spellStart"/>
+      <w:proofErr w:type="gramStart"/>
       <w:r>
         <w:t>add</w:t>
       </w:r>
@@ -479,26 +545,37 @@
       <w:r>
         <w:t xml:space="preserve"> .</w:t>
       </w:r>
-    </w:p>
-    <w:p>
-      <w:pPr>
-        <w:pStyle w:val="Sansinterligne"/>
-      </w:pPr>
-    </w:p>
-    <w:p>
-      <w:pPr>
-        <w:pStyle w:val="Sansinterligne"/>
-      </w:pPr>
-      <w:r>
-        <w:t>:: Crée votre premier point de sauvegarde</w:t>
-      </w:r>
-    </w:p>
-    <w:p>
-      <w:pPr>
-        <w:pStyle w:val="Sansinterligne"/>
-      </w:pPr>
-      <w:r>
-        <w:t>git commit -m "</w:t>
+      <w:proofErr w:type="gramEnd"/>
+    </w:p>
+    <w:p>
+      <w:pPr>
+        <w:pStyle w:val="Sansinterligne"/>
+      </w:pPr>
+    </w:p>
+    <w:p>
+      <w:pPr>
+        <w:pStyle w:val="Sansinterligne"/>
+      </w:pPr>
+      <w:proofErr w:type="gramStart"/>
+      <w:r>
+        <w:t>::</w:t>
+      </w:r>
+      <w:proofErr w:type="gramEnd"/>
+      <w:r>
+        <w:t xml:space="preserve"> Crée votre premier point de sauvegarde</w:t>
+      </w:r>
+    </w:p>
+    <w:p>
+      <w:pPr>
+        <w:pStyle w:val="Sansinterligne"/>
+      </w:pPr>
+      <w:proofErr w:type="gramStart"/>
+      <w:r>
+        <w:t>git</w:t>
+      </w:r>
+      <w:proofErr w:type="gramEnd"/>
+      <w:r>
+        <w:t xml:space="preserve"> commit -m "</w:t>
       </w:r>
       <w:proofErr w:type="spellStart"/>
       <w:r>
@@ -518,16 +595,26 @@
       <w:pPr>
         <w:pStyle w:val="Sansinterligne"/>
       </w:pPr>
-      <w:r>
-        <w:t>:: Renomme la branche principale en 'main'</w:t>
-      </w:r>
-    </w:p>
-    <w:p>
-      <w:pPr>
-        <w:pStyle w:val="Sansinterligne"/>
-      </w:pPr>
-      <w:r>
-        <w:t xml:space="preserve">git </w:t>
+      <w:proofErr w:type="gramStart"/>
+      <w:r>
+        <w:t>::</w:t>
+      </w:r>
+      <w:proofErr w:type="gramEnd"/>
+      <w:r>
+        <w:t xml:space="preserve"> Renomme la branche principale en 'main'</w:t>
+      </w:r>
+    </w:p>
+    <w:p>
+      <w:pPr>
+        <w:pStyle w:val="Sansinterligne"/>
+      </w:pPr>
+      <w:proofErr w:type="gramStart"/>
+      <w:r>
+        <w:t>git</w:t>
+      </w:r>
+      <w:proofErr w:type="gramEnd"/>
+      <w:r>
+        <w:t xml:space="preserve"> </w:t>
       </w:r>
       <w:proofErr w:type="spellStart"/>
       <w:r>
@@ -547,16 +634,26 @@
       <w:pPr>
         <w:pStyle w:val="Sansinterligne"/>
       </w:pPr>
-      <w:r>
-        <w:t>:: Relie votre dossier local à votre compte GitHub</w:t>
-      </w:r>
-    </w:p>
-    <w:p>
-      <w:pPr>
-        <w:pStyle w:val="Sansinterligne"/>
-      </w:pPr>
-      <w:r>
-        <w:t>:: (Remplacez l'URL par celle que vous avez copiée à l'étape 1)</w:t>
+      <w:proofErr w:type="gramStart"/>
+      <w:r>
+        <w:t>::</w:t>
+      </w:r>
+      <w:proofErr w:type="gramEnd"/>
+      <w:r>
+        <w:t xml:space="preserve"> Relie votre dossier local à votre compte GitHub</w:t>
+      </w:r>
+    </w:p>
+    <w:p>
+      <w:pPr>
+        <w:pStyle w:val="Sansinterligne"/>
+      </w:pPr>
+      <w:proofErr w:type="gramStart"/>
+      <w:r>
+        <w:t>::</w:t>
+      </w:r>
+      <w:proofErr w:type="gramEnd"/>
+      <w:r>
+        <w:t xml:space="preserve"> (Remplacez l'URL par celle que vous avez copiée à l'étape 1)</w:t>
       </w:r>
     </w:p>
     <w:p>
@@ -585,16 +682,26 @@
       <w:pPr>
         <w:pStyle w:val="Sansinterligne"/>
       </w:pPr>
-      <w:r>
-        <w:t>:: Envoie vos fichiers sur GitHub</w:t>
-      </w:r>
-    </w:p>
-    <w:p>
-      <w:pPr>
-        <w:pStyle w:val="Sansinterligne"/>
-      </w:pPr>
-      <w:r>
-        <w:t xml:space="preserve">git push -u </w:t>
+      <w:proofErr w:type="gramStart"/>
+      <w:r>
+        <w:t>::</w:t>
+      </w:r>
+      <w:proofErr w:type="gramEnd"/>
+      <w:r>
+        <w:t xml:space="preserve"> Envoie vos fichiers sur GitHub</w:t>
+      </w:r>
+    </w:p>
+    <w:p>
+      <w:pPr>
+        <w:pStyle w:val="Sansinterligne"/>
+      </w:pPr>
+      <w:proofErr w:type="gramStart"/>
+      <w:r>
+        <w:t>git</w:t>
+      </w:r>
+      <w:proofErr w:type="gramEnd"/>
+      <w:r>
+        <w:t xml:space="preserve"> push -u </w:t>
       </w:r>
       <w:proofErr w:type="spellStart"/>
       <w:r>
@@ -748,6 +855,7 @@
         <w:t xml:space="preserve">git config --global </w:t>
       </w:r>
       <w:proofErr w:type="spellStart"/>
+      <w:proofErr w:type="gramStart"/>
       <w:r>
         <w:rPr>
           <w:lang w:val="en-GB"/>
@@ -755,6 +863,7 @@
         <w:t>core.autocrlf</w:t>
       </w:r>
       <w:proofErr w:type="spellEnd"/>
+      <w:proofErr w:type="gramEnd"/>
       <w:r>
         <w:rPr>
           <w:lang w:val="en-GB"/>
@@ -792,9 +901,17 @@
       </w:pPr>
       <w:r>
         <w:tab/>
-        <w:t xml:space="preserve">git </w:t>
-      </w:r>
-      <w:proofErr w:type="spellStart"/>
+      </w:r>
+      <w:proofErr w:type="gramStart"/>
+      <w:r>
+        <w:t>git</w:t>
+      </w:r>
+      <w:proofErr w:type="gramEnd"/>
+      <w:r>
+        <w:t xml:space="preserve"> </w:t>
+      </w:r>
+      <w:proofErr w:type="spellStart"/>
+      <w:proofErr w:type="gramStart"/>
       <w:r>
         <w:t>add</w:t>
       </w:r>
@@ -802,6 +919,7 @@
       <w:r>
         <w:t xml:space="preserve"> .</w:t>
       </w:r>
+      <w:proofErr w:type="gramEnd"/>
     </w:p>
     <w:p>
       <w:pPr>
@@ -809,7 +927,14 @@
       </w:pPr>
       <w:r>
         <w:tab/>
-        <w:t>git commit -m "rapatriement en local du fichier vexflow.js"</w:t>
+      </w:r>
+      <w:proofErr w:type="gramStart"/>
+      <w:r>
+        <w:t>git</w:t>
+      </w:r>
+      <w:proofErr w:type="gramEnd"/>
+      <w:r>
+        <w:t xml:space="preserve"> commit -m "rapatriement en local du fichier vexflow.js"</w:t>
       </w:r>
     </w:p>
     <w:p>
@@ -818,7 +943,14 @@
       </w:pPr>
       <w:r>
         <w:tab/>
-        <w:t xml:space="preserve">git push </w:t>
+      </w:r>
+      <w:proofErr w:type="gramStart"/>
+      <w:r>
+        <w:t>git</w:t>
+      </w:r>
+      <w:proofErr w:type="gramEnd"/>
+      <w:r>
+        <w:t xml:space="preserve"> push </w:t>
       </w:r>
       <w:proofErr w:type="spellStart"/>
       <w:r>
@@ -924,15 +1056,33 @@
       </w:r>
       <w:r>
         <w:tab/>
-        <w:t xml:space="preserve">   par le fichier </w:t>
-      </w:r>
-      <w:proofErr w:type="spellStart"/>
+        <w:t xml:space="preserve">   </w:t>
+      </w:r>
+      <w:proofErr w:type="gramStart"/>
+      <w:r>
+        <w:t>par</w:t>
+      </w:r>
+      <w:proofErr w:type="gramEnd"/>
+      <w:r>
+        <w:t xml:space="preserve"> le fichier </w:t>
+      </w:r>
+      <w:proofErr w:type="spellStart"/>
+      <w:proofErr w:type="gramStart"/>
       <w:r>
         <w:t>manifest.json</w:t>
       </w:r>
       <w:proofErr w:type="spellEnd"/>
-      <w:r>
-        <w:t>) alors que sur smartphone son nom est "solfier" dans la</w:t>
+      <w:proofErr w:type="gramEnd"/>
+      <w:r>
+        <w:t>) alors que sur smartphone son nom est "</w:t>
+      </w:r>
+      <w:proofErr w:type="gramStart"/>
+      <w:r>
+        <w:t>solfier</w:t>
+      </w:r>
+      <w:proofErr w:type="gramEnd"/>
+      <w:r>
+        <w:t>" dans la</w:t>
       </w:r>
     </w:p>
     <w:p>
@@ -944,7 +1094,15 @@
       </w:r>
       <w:r>
         <w:tab/>
-        <w:t xml:space="preserve">   liste des applications --&gt; à unifier</w:t>
+        <w:t xml:space="preserve">   </w:t>
+      </w:r>
+      <w:proofErr w:type="gramStart"/>
+      <w:r>
+        <w:t>liste</w:t>
+      </w:r>
+      <w:proofErr w:type="gramEnd"/>
+      <w:r>
+        <w:t xml:space="preserve"> des applications --&gt; à unifier</w:t>
       </w:r>
     </w:p>
     <w:p>
@@ -1040,7 +1198,15 @@
         <w:t>Action :</w:t>
       </w:r>
       <w:r>
-        <w:t xml:space="preserve"> Augmentez-la (ex: 30) pour forcer un travail de stabilité vocale et de longueur de souffle (idéal pour le travail de </w:t>
+        <w:t xml:space="preserve"> Augmentez-la (</w:t>
+      </w:r>
+      <w:proofErr w:type="gramStart"/>
+      <w:r>
+        <w:t>ex:</w:t>
+      </w:r>
+      <w:proofErr w:type="gramEnd"/>
+      <w:r>
+        <w:t xml:space="preserve"> 30) pour forcer un travail de stabilité vocale et de longueur de souffle (idéal pour le travail de </w:t>
       </w:r>
       <w:proofErr w:type="spellStart"/>
       <w:r>
@@ -1048,7 +1214,15 @@
       </w:r>
       <w:proofErr w:type="spellEnd"/>
       <w:r>
-        <w:t>). Diminuez-la (ex: 10) pour une lecture de notes très rapide et nerveuse.</w:t>
+        <w:t>). Diminuez-la (</w:t>
+      </w:r>
+      <w:proofErr w:type="gramStart"/>
+      <w:r>
+        <w:t>ex:</w:t>
+      </w:r>
+      <w:proofErr w:type="gramEnd"/>
+      <w:r>
+        <w:t xml:space="preserve"> 10) pour une lecture de notes très rapide et nerveuse.</w:t>
       </w:r>
     </w:p>
     <w:p>
@@ -1130,7 +1304,15 @@
         <w:t>Action :</w:t>
       </w:r>
       <w:r>
-        <w:t xml:space="preserve"> Si l'application détecte des "fausses notes" à cause du bruit ambiant (ventilateur de PC, bruit de fond), augmentez ce seuil (ex: 0.06 ou 0.08). Si le micro du Pixel 7a capte mal votre voix quand vous chantez doucement (</w:t>
+        <w:t xml:space="preserve"> Si l'application détecte des "fausses notes" à cause du bruit ambiant (ventilateur de PC, bruit de fond), augmentez ce seuil (</w:t>
+      </w:r>
+      <w:proofErr w:type="gramStart"/>
+      <w:r>
+        <w:t>ex:</w:t>
+      </w:r>
+      <w:proofErr w:type="gramEnd"/>
+      <w:r>
+        <w:t xml:space="preserve"> 0.06 ou 0.08). Si le micro du Pixel 7a capte mal votre voix quand vous chantez doucement (</w:t>
       </w:r>
       <w:r>
         <w:rPr>
@@ -1150,7 +1332,15 @@
         <w:t>pianissimo</w:t>
       </w:r>
       <w:r>
-        <w:t>), baissez-le légèrement (ex: 0.03).</w:t>
+        <w:t>), baissez-le légèrement (</w:t>
+      </w:r>
+      <w:proofErr w:type="gramStart"/>
+      <w:r>
+        <w:t>ex:</w:t>
+      </w:r>
+      <w:proofErr w:type="gramEnd"/>
+      <w:r>
+        <w:t xml:space="preserve"> 0.03).</w:t>
       </w:r>
     </w:p>
     <w:p>
@@ -1236,10 +1426,12 @@
     </w:p>
     <w:p>
       <w:proofErr w:type="spellStart"/>
+      <w:proofErr w:type="gramStart"/>
       <w:r>
         <w:t>const</w:t>
       </w:r>
       <w:proofErr w:type="spellEnd"/>
+      <w:proofErr w:type="gramEnd"/>
       <w:r>
         <w:t xml:space="preserve"> VOICE_RANGES = {</w:t>
       </w:r>
@@ -1249,28 +1441,83 @@
         <w:t xml:space="preserve">    </w:t>
       </w:r>
       <w:proofErr w:type="spellStart"/>
+      <w:proofErr w:type="gramStart"/>
       <w:r>
         <w:t>bass</w:t>
       </w:r>
       <w:proofErr w:type="spellEnd"/>
       <w:r>
-        <w:t>:    { clef: "</w:t>
+        <w:t>:</w:t>
+      </w:r>
+      <w:proofErr w:type="gramEnd"/>
+      <w:r>
+        <w:t xml:space="preserve"> </w:t>
+      </w:r>
+      <w:proofErr w:type="gramStart"/>
+      <w:r>
+        <w:t xml:space="preserve">   {</w:t>
+      </w:r>
+      <w:proofErr w:type="gramEnd"/>
+      <w:r>
+        <w:t xml:space="preserve"> </w:t>
+      </w:r>
+      <w:proofErr w:type="gramStart"/>
+      <w:r>
+        <w:t>clef:</w:t>
+      </w:r>
+      <w:proofErr w:type="gramEnd"/>
+      <w:r>
+        <w:t xml:space="preserve"> "</w:t>
       </w:r>
       <w:proofErr w:type="spellStart"/>
       <w:r>
         <w:t>bass</w:t>
       </w:r>
       <w:proofErr w:type="spellEnd"/>
-      <w:r>
-        <w:t xml:space="preserve">",    min: "e/2", max: "e/4", </w:t>
-      </w:r>
-      <w:proofErr w:type="spellStart"/>
+      <w:proofErr w:type="gramStart"/>
+      <w:r>
+        <w:t xml:space="preserve">",   </w:t>
+      </w:r>
+      <w:proofErr w:type="gramEnd"/>
+      <w:r>
+        <w:t xml:space="preserve"> </w:t>
+      </w:r>
+      <w:proofErr w:type="gramStart"/>
+      <w:r>
+        <w:t>min:</w:t>
+      </w:r>
+      <w:proofErr w:type="gramEnd"/>
+      <w:r>
+        <w:t xml:space="preserve"> "e/2", </w:t>
+      </w:r>
+      <w:proofErr w:type="gramStart"/>
+      <w:r>
+        <w:t>max:</w:t>
+      </w:r>
+      <w:proofErr w:type="gramEnd"/>
+      <w:r>
+        <w:t xml:space="preserve"> "e/4", </w:t>
+      </w:r>
+      <w:proofErr w:type="spellStart"/>
+      <w:proofErr w:type="gramStart"/>
       <w:r>
         <w:t>median</w:t>
       </w:r>
       <w:proofErr w:type="spellEnd"/>
       <w:r>
-        <w:t xml:space="preserve">: "d/3" }, </w:t>
+        <w:t>:</w:t>
+      </w:r>
+      <w:proofErr w:type="gramEnd"/>
+      <w:r>
+        <w:t xml:space="preserve"> "d/3</w:t>
+      </w:r>
+      <w:proofErr w:type="gramStart"/>
+      <w:r>
+        <w:t>" }</w:t>
+      </w:r>
+      <w:proofErr w:type="gramEnd"/>
+      <w:r>
+        <w:t xml:space="preserve">, </w:t>
       </w:r>
     </w:p>
     <w:p>
@@ -1279,49 +1526,67 @@
         <w:t xml:space="preserve">    </w:t>
       </w:r>
       <w:proofErr w:type="spellStart"/>
+      <w:proofErr w:type="gramStart"/>
       <w:r>
         <w:t>tenor</w:t>
       </w:r>
       <w:proofErr w:type="spellEnd"/>
       <w:r>
-        <w:t>:   { clef: "</w:t>
+        <w:t>:   {</w:t>
+      </w:r>
+      <w:proofErr w:type="gramEnd"/>
+      <w:r>
+        <w:t xml:space="preserve"> </w:t>
+      </w:r>
+      <w:proofErr w:type="gramStart"/>
+      <w:r>
+        <w:t>clef:</w:t>
+      </w:r>
+      <w:proofErr w:type="gramEnd"/>
+      <w:r>
+        <w:t xml:space="preserve"> "</w:t>
       </w:r>
       <w:proofErr w:type="spellStart"/>
       <w:r>
         <w:t>treble</w:t>
       </w:r>
       <w:proofErr w:type="spellEnd"/>
-      <w:r>
-        <w:t xml:space="preserve">",  min: "c/4", max: "c/6", </w:t>
-      </w:r>
-      <w:proofErr w:type="spellStart"/>
+      <w:proofErr w:type="gramStart"/>
+      <w:r>
+        <w:t>",  min</w:t>
+      </w:r>
+      <w:proofErr w:type="gramEnd"/>
+      <w:r>
+        <w:t xml:space="preserve">: "c/4", </w:t>
+      </w:r>
+      <w:proofErr w:type="gramStart"/>
+      <w:r>
+        <w:t>max:</w:t>
+      </w:r>
+      <w:proofErr w:type="gramEnd"/>
+      <w:r>
+        <w:t xml:space="preserve"> "c/6", </w:t>
+      </w:r>
+      <w:proofErr w:type="spellStart"/>
+      <w:proofErr w:type="gramStart"/>
       <w:r>
         <w:t>median</w:t>
       </w:r>
       <w:proofErr w:type="spellEnd"/>
       <w:r>
-        <w:t xml:space="preserve">: "b/4" }, </w:t>
-      </w:r>
-    </w:p>
-    <w:p>
-      <w:r>
-        <w:t xml:space="preserve">    alto:    { clef: "</w:t>
-      </w:r>
-      <w:proofErr w:type="spellStart"/>
-      <w:r>
-        <w:t>treble</w:t>
-      </w:r>
-      <w:proofErr w:type="spellEnd"/>
-      <w:r>
-        <w:t xml:space="preserve">",  min: "f/3", max: "f/5", </w:t>
-      </w:r>
-      <w:proofErr w:type="spellStart"/>
-      <w:r>
-        <w:t>median</w:t>
-      </w:r>
-      <w:proofErr w:type="spellEnd"/>
-      <w:r>
-        <w:t xml:space="preserve">: "e/4" }, </w:t>
+        <w:t>:</w:t>
+      </w:r>
+      <w:proofErr w:type="gramEnd"/>
+      <w:r>
+        <w:t xml:space="preserve"> "b/4</w:t>
+      </w:r>
+      <w:proofErr w:type="gramStart"/>
+      <w:r>
+        <w:t>" }</w:t>
+      </w:r>
+      <w:proofErr w:type="gramEnd"/>
+      <w:r>
+        <w:t xml:space="preserve">, </w:t>
       </w:r>
     </w:p>
     <w:p>
@@ -1331,6 +1596,25 @@
         </w:rPr>
       </w:pPr>
       <w:r>
+        <w:t xml:space="preserve">    </w:t>
+      </w:r>
+      <w:r>
+        <w:rPr>
+          <w:lang w:val="it-IT"/>
+        </w:rPr>
+        <w:t xml:space="preserve">alto:    { clef: "treble",  min: "f/3", max: "f/5", median: "e/4" }, </w:t>
+      </w:r>
+    </w:p>
+    <w:p>
+      <w:pPr>
+        <w:rPr>
+          <w:lang w:val="it-IT"/>
+        </w:rPr>
+      </w:pPr>
+      <w:r>
+        <w:rPr>
+          <w:lang w:val="it-IT"/>
+        </w:rPr>
         <w:t xml:space="preserve">    </w:t>
       </w:r>
       <w:r>
@@ -1352,9 +1636,11 @@
           <w:numId w:val="2"/>
         </w:numPr>
       </w:pPr>
+      <w:proofErr w:type="gramStart"/>
       <w:r>
         <w:t>min</w:t>
       </w:r>
+      <w:proofErr w:type="gramEnd"/>
       <w:r>
         <w:rPr>
           <w:b/>
@@ -1412,10 +1698,12 @@
         </w:numPr>
       </w:pPr>
       <w:proofErr w:type="spellStart"/>
+      <w:proofErr w:type="gramStart"/>
       <w:r>
         <w:t>median</w:t>
       </w:r>
       <w:proofErr w:type="spellEnd"/>
+      <w:proofErr w:type="gramEnd"/>
       <w:r>
         <w:rPr>
           <w:b/>
@@ -1460,20 +1748,25 @@
         <w:t xml:space="preserve">3. La logique des niveaux (dans la fonction </w:t>
       </w:r>
       <w:proofErr w:type="spellStart"/>
+      <w:proofErr w:type="gramStart"/>
       <w:r>
         <w:t>drawNote</w:t>
       </w:r>
       <w:proofErr w:type="spellEnd"/>
       <w:r>
-        <w:t>()</w:t>
-      </w:r>
-      <w:r>
-        <w:rPr>
-          <w:b/>
-          <w:bCs/>
-        </w:rPr>
+        <w:t>(</w:t>
+      </w:r>
+      <w:proofErr w:type="gramEnd"/>
+      <w:r>
         <w:t>)</w:t>
       </w:r>
+      <w:r>
+        <w:rPr>
+          <w:b/>
+          <w:bCs/>
+        </w:rPr>
+        <w:t>)</w:t>
+      </w:r>
     </w:p>
     <w:p>
       <w:r>
@@ -1487,10 +1780,12 @@
     </w:p>
     <w:p>
       <w:proofErr w:type="spellStart"/>
+      <w:proofErr w:type="gramStart"/>
       <w:r>
         <w:t>const</w:t>
       </w:r>
       <w:proofErr w:type="spellEnd"/>
+      <w:proofErr w:type="gramEnd"/>
       <w:r>
         <w:t xml:space="preserve"> offset = 2 + (</w:t>
       </w:r>
@@ -1500,8 +1795,13 @@
       </w:r>
       <w:proofErr w:type="spellEnd"/>
       <w:r>
-        <w:t xml:space="preserve"> - 1);</w:t>
-      </w:r>
+        <w:t xml:space="preserve"> - 1</w:t>
+      </w:r>
+      <w:proofErr w:type="gramStart"/>
+      <w:r>
+        <w:t>);</w:t>
+      </w:r>
+      <w:proofErr w:type="gramEnd"/>
     </w:p>
     <w:p>
       <w:pPr>
@@ -1568,7 +1868,15 @@
       </w:r>
       <w:proofErr w:type="spellEnd"/>
       <w:r>
-        <w:t xml:space="preserve"> - 1) * 2); pour doubler l'écart à chaque palier.</w:t>
+        <w:t xml:space="preserve"> - 1) * 2</w:t>
+      </w:r>
+      <w:proofErr w:type="gramStart"/>
+      <w:r>
+        <w:t>);</w:t>
+      </w:r>
+      <w:proofErr w:type="gramEnd"/>
+      <w:r>
+        <w:t xml:space="preserve"> pour doubler l'écart à chaque palier.</w:t>
       </w:r>
     </w:p>
     <w:p>
@@ -1611,10 +1919,12 @@
         </w:numPr>
       </w:pPr>
       <w:proofErr w:type="spellStart"/>
+      <w:proofErr w:type="gramStart"/>
       <w:r>
         <w:t>osc.type</w:t>
       </w:r>
       <w:proofErr w:type="spellEnd"/>
+      <w:proofErr w:type="gramEnd"/>
       <w:r>
         <w:t xml:space="preserve"> (actuellement 'sine')</w:t>
       </w:r>
@@ -1681,13 +1991,20 @@
         <w:t xml:space="preserve"> (actuellement 0.3 à la ligne </w:t>
       </w:r>
       <w:proofErr w:type="spellStart"/>
+      <w:proofErr w:type="gramStart"/>
       <w:r>
         <w:t>gainNode.gain.setValueAtTime</w:t>
       </w:r>
       <w:proofErr w:type="spellEnd"/>
-      <w:r>
-        <w:t>(0.3, ...);)</w:t>
-      </w:r>
+      <w:proofErr w:type="gramEnd"/>
+      <w:r>
+        <w:t xml:space="preserve">(0.3, </w:t>
+      </w:r>
+      <w:proofErr w:type="gramStart"/>
+      <w:r>
+        <w:t>...);)</w:t>
+      </w:r>
+      <w:proofErr w:type="gramEnd"/>
     </w:p>
     <w:p>
       <w:pPr>
@@ -1732,8 +2049,13 @@
           <w:numId w:val="4"/>
         </w:numPr>
       </w:pPr>
-      <w:r>
-        <w:t>duration (actuellement 2.5)</w:t>
+      <w:proofErr w:type="gramStart"/>
+      <w:r>
+        <w:t>duration</w:t>
+      </w:r>
+      <w:proofErr w:type="gramEnd"/>
+      <w:r>
+        <w:t xml:space="preserve"> (actuellement 2.5)</w:t>
       </w:r>
     </w:p>
     <w:p>
@@ -1806,7 +2128,15 @@
       </w:r>
       <w:proofErr w:type="spellEnd"/>
       <w:r>
-        <w:t xml:space="preserve"> et KEY_ALTERATIONS servent de base de données à l'application pour faire la correspondance entre les fréquences physiques (en Hz), les notations internationales (C, D, E...) et l'affichage sur la portée de </w:t>
+        <w:t xml:space="preserve"> et KEY_ALTERATIONS servent de base de données à l'application pour faire la correspondance entre les fréquences physiques (en Hz), les notations internationales (C, D, </w:t>
+      </w:r>
+      <w:proofErr w:type="gramStart"/>
+      <w:r>
+        <w:t>E...</w:t>
+      </w:r>
+      <w:proofErr w:type="gramEnd"/>
+      <w:r>
+        <w:t xml:space="preserve">) et l'affichage sur la portée de </w:t>
       </w:r>
       <w:proofErr w:type="spellStart"/>
       <w:r>
@@ -1821,17 +2151,642 @@
     <w:p>
       <w:pPr>
         <w:pStyle w:val="Titre1"/>
-      </w:pPr>
-      <w:r>
+        <w:rPr>
+          <w:b/>
+          <w:bCs/>
+        </w:rPr>
+      </w:pPr>
+      <w:r>
+        <w:rPr>
+          <w:b/>
+          <w:bCs/>
+        </w:rPr>
         <w:t>EN FAIRE UN FICHIER APK</w:t>
       </w:r>
     </w:p>
     <w:p>
       <w:pPr>
-        <w:rPr>
-          <w:b/>
-          <w:bCs/>
-        </w:rPr>
+        <w:pStyle w:val="Titre2"/>
+        <w:rPr>
+          <w:b/>
+          <w:bCs/>
+        </w:rPr>
+      </w:pPr>
+      <w:r>
+        <w:rPr>
+          <w:b/>
+          <w:bCs/>
+        </w:rPr>
+        <w:t xml:space="preserve">Ajustements pour permettre </w:t>
+      </w:r>
+      <w:proofErr w:type="spellStart"/>
+      <w:r>
+        <w:rPr>
+          <w:b/>
+          <w:bCs/>
+        </w:rPr>
+        <w:t>PWABuilder</w:t>
+      </w:r>
+      <w:proofErr w:type="spellEnd"/>
+    </w:p>
+    <w:p>
+      <w:pPr>
+        <w:pStyle w:val="Paragraphedeliste"/>
+        <w:numPr>
+          <w:ilvl w:val="0"/>
+          <w:numId w:val="6"/>
+        </w:numPr>
+      </w:pPr>
+      <w:r>
+        <w:rPr>
+          <w:u w:val="single"/>
+        </w:rPr>
+        <w:t>A</w:t>
+      </w:r>
+      <w:r>
+        <w:t>jout dans index.html pour contourner l'erreur d'absence de favicon.ico</w:t>
+      </w:r>
+      <w:r>
+        <w:br/>
+        <w:t xml:space="preserve"> </w:t>
+      </w:r>
+      <w:r>
+        <w:tab/>
+      </w:r>
+      <w:r>
+        <w:rPr>
+          <w:rFonts w:ascii="Courier New" w:hAnsi="Courier New" w:cs="Courier New"/>
+          <w:sz w:val="20"/>
+          <w:szCs w:val="20"/>
+        </w:rPr>
+        <w:t>&lt;</w:t>
+      </w:r>
+      <w:proofErr w:type="spellStart"/>
+      <w:r>
+        <w:rPr>
+          <w:rFonts w:ascii="Courier New" w:hAnsi="Courier New" w:cs="Courier New"/>
+          <w:sz w:val="20"/>
+          <w:szCs w:val="20"/>
+        </w:rPr>
+        <w:t>link</w:t>
+      </w:r>
+      <w:proofErr w:type="spellEnd"/>
+      <w:r>
+        <w:rPr>
+          <w:rFonts w:ascii="Courier New" w:hAnsi="Courier New" w:cs="Courier New"/>
+          <w:sz w:val="20"/>
+          <w:szCs w:val="20"/>
+        </w:rPr>
+        <w:t xml:space="preserve"> rel="</w:t>
+      </w:r>
+      <w:proofErr w:type="spellStart"/>
+      <w:r>
+        <w:rPr>
+          <w:rFonts w:ascii="Courier New" w:hAnsi="Courier New" w:cs="Courier New"/>
+          <w:sz w:val="20"/>
+          <w:szCs w:val="20"/>
+        </w:rPr>
+        <w:t>icon</w:t>
+      </w:r>
+      <w:proofErr w:type="spellEnd"/>
+      <w:r>
+        <w:rPr>
+          <w:rFonts w:ascii="Courier New" w:hAnsi="Courier New" w:cs="Courier New"/>
+          <w:sz w:val="20"/>
+          <w:szCs w:val="20"/>
+        </w:rPr>
+        <w:t>" href="</w:t>
+      </w:r>
+      <w:proofErr w:type="gramStart"/>
+      <w:r>
+        <w:rPr>
+          <w:rFonts w:ascii="Courier New" w:hAnsi="Courier New" w:cs="Courier New"/>
+          <w:sz w:val="20"/>
+          <w:szCs w:val="20"/>
+        </w:rPr>
+        <w:t>data:,</w:t>
+      </w:r>
+      <w:proofErr w:type="gramEnd"/>
+      <w:r>
+        <w:rPr>
+          <w:rFonts w:ascii="Courier New" w:hAnsi="Courier New" w:cs="Courier New"/>
+          <w:sz w:val="20"/>
+          <w:szCs w:val="20"/>
+        </w:rPr>
+        <w:t>"&gt;</w:t>
+      </w:r>
+    </w:p>
+    <w:p>
+      <w:pPr>
+        <w:pStyle w:val="Paragraphedeliste"/>
+        <w:numPr>
+          <w:ilvl w:val="0"/>
+          <w:numId w:val="6"/>
+        </w:numPr>
+      </w:pPr>
+      <w:r>
+        <w:t xml:space="preserve">Remplacer les 2 icones au format </w:t>
+      </w:r>
+      <w:proofErr w:type="spellStart"/>
+      <w:r>
+        <w:t>svg</w:t>
+      </w:r>
+      <w:proofErr w:type="spellEnd"/>
+      <w:r>
+        <w:t xml:space="preserve"> </w:t>
+      </w:r>
+      <w:r>
+        <w:t xml:space="preserve">par </w:t>
+      </w:r>
+      <w:r>
+        <w:t>icon-192.png et icon-512.png</w:t>
+      </w:r>
+      <w:r>
+        <w:t xml:space="preserve">, et mettre à jour </w:t>
+      </w:r>
+      <w:proofErr w:type="spellStart"/>
+      <w:proofErr w:type="gramStart"/>
+      <w:r>
+        <w:t>manifest.json</w:t>
+      </w:r>
+      <w:proofErr w:type="spellEnd"/>
+      <w:proofErr w:type="gramEnd"/>
+      <w:r>
+        <w:t xml:space="preserve"> en conséquence</w:t>
+      </w:r>
+    </w:p>
+    <w:p>
+      <w:pPr>
+        <w:pStyle w:val="Paragraphedeliste"/>
+        <w:numPr>
+          <w:ilvl w:val="0"/>
+          <w:numId w:val="6"/>
+        </w:numPr>
+      </w:pPr>
+      <w:proofErr w:type="spellStart"/>
+      <w:r>
+        <w:t>PWABuilder</w:t>
+      </w:r>
+      <w:proofErr w:type="spellEnd"/>
+      <w:r>
+        <w:t xml:space="preserve"> </w:t>
+      </w:r>
+      <w:r>
+        <w:t>exige de trouver dans i</w:t>
+      </w:r>
+      <w:r>
+        <w:t xml:space="preserve">ndex.html </w:t>
+      </w:r>
+      <w:r>
+        <w:t xml:space="preserve">un </w:t>
+      </w:r>
+      <w:r>
+        <w:t>script qui ordonne au navigateur d'enregistrer le fichier service-worker.js</w:t>
+      </w:r>
+      <w:r>
+        <w:t xml:space="preserve"> ; avant la balise &lt;/script&gt; en fin de fichier, entre la fonction </w:t>
+      </w:r>
+      <w:proofErr w:type="spellStart"/>
+      <w:proofErr w:type="gramStart"/>
+      <w:r>
+        <w:rPr>
+          <w:rFonts w:ascii="Courier New" w:hAnsi="Courier New" w:cs="Courier New"/>
+          <w:sz w:val="20"/>
+          <w:szCs w:val="20"/>
+        </w:rPr>
+        <w:t>window.stop</w:t>
+      </w:r>
+      <w:proofErr w:type="spellEnd"/>
+      <w:proofErr w:type="gramEnd"/>
+      <w:r>
+        <w:t xml:space="preserve"> et la ligne </w:t>
+      </w:r>
+      <w:proofErr w:type="spellStart"/>
+      <w:proofErr w:type="gramStart"/>
+      <w:r>
+        <w:rPr>
+          <w:rFonts w:ascii="Courier New" w:hAnsi="Courier New" w:cs="Courier New"/>
+          <w:sz w:val="20"/>
+          <w:szCs w:val="20"/>
+        </w:rPr>
+        <w:t>initVisual</w:t>
+      </w:r>
+      <w:proofErr w:type="spellEnd"/>
+      <w:r>
+        <w:rPr>
+          <w:rFonts w:ascii="Courier New" w:hAnsi="Courier New" w:cs="Courier New"/>
+          <w:sz w:val="20"/>
+          <w:szCs w:val="20"/>
+        </w:rPr>
+        <w:t>(</w:t>
+      </w:r>
+      <w:proofErr w:type="gramEnd"/>
+      <w:r>
+        <w:rPr>
+          <w:rFonts w:ascii="Courier New" w:hAnsi="Courier New" w:cs="Courier New"/>
+          <w:sz w:val="20"/>
+          <w:szCs w:val="20"/>
+        </w:rPr>
+        <w:t>)</w:t>
+      </w:r>
+      <w:r>
+        <w:t xml:space="preserve"> insérer le code suivant :</w:t>
+      </w:r>
+    </w:p>
+    <w:p>
+      <w:pPr>
+        <w:spacing w:after="0"/>
+        <w:ind w:left="1418"/>
+        <w:rPr>
+          <w:rFonts w:ascii="Courier New" w:hAnsi="Courier New" w:cs="Courier New"/>
+          <w:sz w:val="20"/>
+          <w:szCs w:val="20"/>
+        </w:rPr>
+      </w:pPr>
+      <w:r>
+        <w:rPr>
+          <w:rFonts w:ascii="Courier New" w:hAnsi="Courier New" w:cs="Courier New"/>
+          <w:sz w:val="20"/>
+          <w:szCs w:val="20"/>
+        </w:rPr>
+        <w:t>// Enregistrement du Service Worker pour la PWA</w:t>
+      </w:r>
+    </w:p>
+    <w:p>
+      <w:pPr>
+        <w:spacing w:after="0"/>
+        <w:ind w:left="1418"/>
+        <w:rPr>
+          <w:rFonts w:ascii="Courier New" w:hAnsi="Courier New" w:cs="Courier New"/>
+          <w:sz w:val="20"/>
+          <w:szCs w:val="20"/>
+          <w:lang w:val="en-GB"/>
+        </w:rPr>
+      </w:pPr>
+      <w:r>
+        <w:rPr>
+          <w:rFonts w:ascii="Courier New" w:hAnsi="Courier New" w:cs="Courier New"/>
+          <w:sz w:val="20"/>
+          <w:szCs w:val="20"/>
+          <w:lang w:val="en-GB"/>
+        </w:rPr>
+        <w:t>if ('</w:t>
+      </w:r>
+      <w:proofErr w:type="spellStart"/>
+      <w:r>
+        <w:rPr>
+          <w:rFonts w:ascii="Courier New" w:hAnsi="Courier New" w:cs="Courier New"/>
+          <w:sz w:val="20"/>
+          <w:szCs w:val="20"/>
+          <w:lang w:val="en-GB"/>
+        </w:rPr>
+        <w:t>serviceWorker</w:t>
+      </w:r>
+      <w:proofErr w:type="spellEnd"/>
+      <w:r>
+        <w:rPr>
+          <w:rFonts w:ascii="Courier New" w:hAnsi="Courier New" w:cs="Courier New"/>
+          <w:sz w:val="20"/>
+          <w:szCs w:val="20"/>
+          <w:lang w:val="en-GB"/>
+        </w:rPr>
+        <w:t>' in navigator) {</w:t>
+      </w:r>
+    </w:p>
+    <w:p>
+      <w:pPr>
+        <w:spacing w:after="0"/>
+        <w:ind w:left="1418"/>
+        <w:rPr>
+          <w:rFonts w:ascii="Courier New" w:hAnsi="Courier New" w:cs="Courier New"/>
+          <w:sz w:val="20"/>
+          <w:szCs w:val="20"/>
+          <w:lang w:val="en-GB"/>
+        </w:rPr>
+      </w:pPr>
+      <w:r>
+        <w:rPr>
+          <w:rFonts w:ascii="Courier New" w:hAnsi="Courier New" w:cs="Courier New"/>
+          <w:sz w:val="20"/>
+          <w:szCs w:val="20"/>
+          <w:lang w:val="en-GB"/>
+        </w:rPr>
+        <w:t xml:space="preserve">    </w:t>
+      </w:r>
+      <w:proofErr w:type="spellStart"/>
+      <w:proofErr w:type="gramStart"/>
+      <w:r>
+        <w:rPr>
+          <w:rFonts w:ascii="Courier New" w:hAnsi="Courier New" w:cs="Courier New"/>
+          <w:sz w:val="20"/>
+          <w:szCs w:val="20"/>
+          <w:lang w:val="en-GB"/>
+        </w:rPr>
+        <w:t>window.addEventListener</w:t>
+      </w:r>
+      <w:proofErr w:type="spellEnd"/>
+      <w:proofErr w:type="gramEnd"/>
+      <w:r>
+        <w:rPr>
+          <w:rFonts w:ascii="Courier New" w:hAnsi="Courier New" w:cs="Courier New"/>
+          <w:sz w:val="20"/>
+          <w:szCs w:val="20"/>
+          <w:lang w:val="en-GB"/>
+        </w:rPr>
+        <w:t>('load', () =&gt; {</w:t>
+      </w:r>
+    </w:p>
+    <w:p>
+      <w:pPr>
+        <w:spacing w:after="0"/>
+        <w:ind w:left="1418"/>
+        <w:rPr>
+          <w:rFonts w:ascii="Courier New" w:hAnsi="Courier New" w:cs="Courier New"/>
+          <w:sz w:val="20"/>
+          <w:szCs w:val="20"/>
+          <w:lang w:val="en-GB"/>
+        </w:rPr>
+      </w:pPr>
+      <w:r>
+        <w:rPr>
+          <w:rFonts w:ascii="Courier New" w:hAnsi="Courier New" w:cs="Courier New"/>
+          <w:sz w:val="20"/>
+          <w:szCs w:val="20"/>
+          <w:lang w:val="en-GB"/>
+        </w:rPr>
+        <w:t xml:space="preserve">        </w:t>
+      </w:r>
+      <w:proofErr w:type="spellStart"/>
+      <w:proofErr w:type="gramStart"/>
+      <w:r>
+        <w:rPr>
+          <w:rFonts w:ascii="Courier New" w:hAnsi="Courier New" w:cs="Courier New"/>
+          <w:sz w:val="20"/>
+          <w:szCs w:val="20"/>
+          <w:lang w:val="en-GB"/>
+        </w:rPr>
+        <w:t>navigator.serviceWorker.register</w:t>
+      </w:r>
+      <w:proofErr w:type="spellEnd"/>
+      <w:proofErr w:type="gramEnd"/>
+      <w:r>
+        <w:rPr>
+          <w:rFonts w:ascii="Courier New" w:hAnsi="Courier New" w:cs="Courier New"/>
+          <w:sz w:val="20"/>
+          <w:szCs w:val="20"/>
+          <w:lang w:val="en-GB"/>
+        </w:rPr>
+        <w:t>('service-worker.js')</w:t>
+      </w:r>
+    </w:p>
+    <w:p>
+      <w:pPr>
+        <w:spacing w:after="0"/>
+        <w:ind w:left="1418"/>
+        <w:rPr>
+          <w:rFonts w:ascii="Courier New" w:hAnsi="Courier New" w:cs="Courier New"/>
+          <w:sz w:val="20"/>
+          <w:szCs w:val="20"/>
+        </w:rPr>
+      </w:pPr>
+      <w:r>
+        <w:rPr>
+          <w:rFonts w:ascii="Courier New" w:hAnsi="Courier New" w:cs="Courier New"/>
+          <w:sz w:val="20"/>
+          <w:szCs w:val="20"/>
+          <w:lang w:val="en-GB"/>
+        </w:rPr>
+        <w:t xml:space="preserve">            </w:t>
+      </w:r>
+      <w:proofErr w:type="gramStart"/>
+      <w:r>
+        <w:rPr>
+          <w:rFonts w:ascii="Courier New" w:hAnsi="Courier New" w:cs="Courier New"/>
+          <w:sz w:val="20"/>
+          <w:szCs w:val="20"/>
+        </w:rPr>
+        <w:t>.</w:t>
+      </w:r>
+      <w:proofErr w:type="spellStart"/>
+      <w:r>
+        <w:rPr>
+          <w:rFonts w:ascii="Courier New" w:hAnsi="Courier New" w:cs="Courier New"/>
+          <w:sz w:val="20"/>
+          <w:szCs w:val="20"/>
+        </w:rPr>
+        <w:t>then</w:t>
+      </w:r>
+      <w:proofErr w:type="spellEnd"/>
+      <w:proofErr w:type="gramEnd"/>
+      <w:r>
+        <w:rPr>
+          <w:rFonts w:ascii="Courier New" w:hAnsi="Courier New" w:cs="Courier New"/>
+          <w:sz w:val="20"/>
+          <w:szCs w:val="20"/>
+        </w:rPr>
+        <w:t xml:space="preserve">(reg =&gt; </w:t>
+      </w:r>
+      <w:proofErr w:type="gramStart"/>
+      <w:r>
+        <w:rPr>
+          <w:rFonts w:ascii="Courier New" w:hAnsi="Courier New" w:cs="Courier New"/>
+          <w:sz w:val="20"/>
+          <w:szCs w:val="20"/>
+        </w:rPr>
+        <w:t>console.log(</w:t>
+      </w:r>
+      <w:proofErr w:type="gramEnd"/>
+      <w:r>
+        <w:rPr>
+          <w:rFonts w:ascii="Courier New" w:hAnsi="Courier New" w:cs="Courier New"/>
+          <w:sz w:val="20"/>
+          <w:szCs w:val="20"/>
+        </w:rPr>
+        <w:t xml:space="preserve">'Service Worker enregistré avec succès !', </w:t>
+      </w:r>
+      <w:proofErr w:type="spellStart"/>
+      <w:proofErr w:type="gramStart"/>
+      <w:r>
+        <w:rPr>
+          <w:rFonts w:ascii="Courier New" w:hAnsi="Courier New" w:cs="Courier New"/>
+          <w:sz w:val="20"/>
+          <w:szCs w:val="20"/>
+        </w:rPr>
+        <w:t>reg.scope</w:t>
+      </w:r>
+      <w:proofErr w:type="spellEnd"/>
+      <w:proofErr w:type="gramEnd"/>
+      <w:r>
+        <w:rPr>
+          <w:rFonts w:ascii="Courier New" w:hAnsi="Courier New" w:cs="Courier New"/>
+          <w:sz w:val="20"/>
+          <w:szCs w:val="20"/>
+        </w:rPr>
+        <w:t>))</w:t>
+      </w:r>
+    </w:p>
+    <w:p>
+      <w:pPr>
+        <w:spacing w:after="0"/>
+        <w:ind w:left="1418"/>
+        <w:rPr>
+          <w:rFonts w:ascii="Courier New" w:hAnsi="Courier New" w:cs="Courier New"/>
+          <w:sz w:val="20"/>
+          <w:szCs w:val="20"/>
+        </w:rPr>
+      </w:pPr>
+      <w:r>
+        <w:rPr>
+          <w:rFonts w:ascii="Courier New" w:hAnsi="Courier New" w:cs="Courier New"/>
+          <w:sz w:val="20"/>
+          <w:szCs w:val="20"/>
+        </w:rPr>
+        <w:t xml:space="preserve">            </w:t>
+      </w:r>
+      <w:proofErr w:type="gramStart"/>
+      <w:r>
+        <w:rPr>
+          <w:rFonts w:ascii="Courier New" w:hAnsi="Courier New" w:cs="Courier New"/>
+          <w:sz w:val="20"/>
+          <w:szCs w:val="20"/>
+        </w:rPr>
+        <w:t>.catch</w:t>
+      </w:r>
+      <w:proofErr w:type="gramEnd"/>
+      <w:r>
+        <w:rPr>
+          <w:rFonts w:ascii="Courier New" w:hAnsi="Courier New" w:cs="Courier New"/>
+          <w:sz w:val="20"/>
+          <w:szCs w:val="20"/>
+        </w:rPr>
+        <w:t>(</w:t>
+      </w:r>
+      <w:proofErr w:type="spellStart"/>
+      <w:r>
+        <w:rPr>
+          <w:rFonts w:ascii="Courier New" w:hAnsi="Courier New" w:cs="Courier New"/>
+          <w:sz w:val="20"/>
+          <w:szCs w:val="20"/>
+        </w:rPr>
+        <w:t>err</w:t>
+      </w:r>
+      <w:proofErr w:type="spellEnd"/>
+      <w:r>
+        <w:rPr>
+          <w:rFonts w:ascii="Courier New" w:hAnsi="Courier New" w:cs="Courier New"/>
+          <w:sz w:val="20"/>
+          <w:szCs w:val="20"/>
+        </w:rPr>
+        <w:t xml:space="preserve"> =&gt; </w:t>
+      </w:r>
+      <w:proofErr w:type="spellStart"/>
+      <w:proofErr w:type="gramStart"/>
+      <w:r>
+        <w:rPr>
+          <w:rFonts w:ascii="Courier New" w:hAnsi="Courier New" w:cs="Courier New"/>
+          <w:sz w:val="20"/>
+          <w:szCs w:val="20"/>
+        </w:rPr>
+        <w:t>console.error</w:t>
+      </w:r>
+      <w:proofErr w:type="spellEnd"/>
+      <w:proofErr w:type="gramEnd"/>
+      <w:r>
+        <w:rPr>
+          <w:rFonts w:ascii="Courier New" w:hAnsi="Courier New" w:cs="Courier New"/>
+          <w:sz w:val="20"/>
+          <w:szCs w:val="20"/>
+        </w:rPr>
+        <w:t xml:space="preserve">('Échec de </w:t>
+      </w:r>
+      <w:proofErr w:type="spellStart"/>
+      <w:r>
+        <w:rPr>
+          <w:rFonts w:ascii="Courier New" w:hAnsi="Courier New" w:cs="Courier New"/>
+          <w:sz w:val="20"/>
+          <w:szCs w:val="20"/>
+        </w:rPr>
+        <w:t>l</w:t>
+      </w:r>
+      <w:proofErr w:type="spellEnd"/>
+      <w:r>
+        <w:rPr>
+          <w:rFonts w:ascii="Courier New" w:hAnsi="Courier New" w:cs="Courier New"/>
+          <w:sz w:val="20"/>
+          <w:szCs w:val="20"/>
+        </w:rPr>
+        <w:t xml:space="preserve">\'enregistrement du Service Worker :', </w:t>
+      </w:r>
+      <w:proofErr w:type="spellStart"/>
+      <w:r>
+        <w:rPr>
+          <w:rFonts w:ascii="Courier New" w:hAnsi="Courier New" w:cs="Courier New"/>
+          <w:sz w:val="20"/>
+          <w:szCs w:val="20"/>
+        </w:rPr>
+        <w:t>err</w:t>
+      </w:r>
+      <w:proofErr w:type="spellEnd"/>
+      <w:r>
+        <w:rPr>
+          <w:rFonts w:ascii="Courier New" w:hAnsi="Courier New" w:cs="Courier New"/>
+          <w:sz w:val="20"/>
+          <w:szCs w:val="20"/>
+        </w:rPr>
+        <w:t>)</w:t>
+      </w:r>
+      <w:proofErr w:type="gramStart"/>
+      <w:r>
+        <w:rPr>
+          <w:rFonts w:ascii="Courier New" w:hAnsi="Courier New" w:cs="Courier New"/>
+          <w:sz w:val="20"/>
+          <w:szCs w:val="20"/>
+        </w:rPr>
+        <w:t>);</w:t>
+      </w:r>
+      <w:proofErr w:type="gramEnd"/>
+    </w:p>
+    <w:p>
+      <w:pPr>
+        <w:spacing w:after="0"/>
+        <w:ind w:left="1418"/>
+        <w:rPr>
+          <w:rFonts w:ascii="Courier New" w:hAnsi="Courier New" w:cs="Courier New"/>
+          <w:sz w:val="20"/>
+          <w:szCs w:val="20"/>
+        </w:rPr>
+      </w:pPr>
+      <w:r>
+        <w:rPr>
+          <w:rFonts w:ascii="Courier New" w:hAnsi="Courier New" w:cs="Courier New"/>
+          <w:sz w:val="20"/>
+          <w:szCs w:val="20"/>
+        </w:rPr>
+        <w:t xml:space="preserve">    });</w:t>
+      </w:r>
+    </w:p>
+    <w:p>
+      <w:pPr>
+        <w:spacing w:after="0"/>
+        <w:ind w:left="1418"/>
+        <w:rPr>
+          <w:rFonts w:ascii="Courier New" w:hAnsi="Courier New" w:cs="Courier New"/>
+          <w:sz w:val="20"/>
+          <w:szCs w:val="20"/>
+        </w:rPr>
+      </w:pPr>
+      <w:r>
+        <w:rPr>
+          <w:rFonts w:ascii="Courier New" w:hAnsi="Courier New" w:cs="Courier New"/>
+          <w:sz w:val="20"/>
+          <w:szCs w:val="20"/>
+        </w:rPr>
+        <w:t>}</w:t>
+      </w:r>
+    </w:p>
+    <w:p>
+      <w:pPr>
+        <w:pStyle w:val="Titre2"/>
       </w:pPr>
       <w:r>
         <w:rPr>
@@ -1925,45 +2880,6 @@
       <w:r>
         <w:t>L'outil va analyser vos fichiers. Si votre manifeste et vos icônes SVG sont conformes, vous obtiendrez un score vert très élevé.</w:t>
       </w:r>
-      <w:r>
-        <w:br/>
-        <w:t xml:space="preserve"> </w:t>
-      </w:r>
-      <w:r>
-        <w:rPr>
-          <w:u w:val="single"/>
-        </w:rPr>
-        <w:t>Remarque :</w:t>
-      </w:r>
-      <w:r>
-        <w:t xml:space="preserve"> ajout dans index.html pour contourner l'erreur d'absence de favicon.ico</w:t>
-      </w:r>
-      <w:r>
-        <w:br/>
-        <w:t xml:space="preserve"> </w:t>
-      </w:r>
-      <w:r>
-        <w:tab/>
-      </w:r>
-      <w:r>
-        <w:t>&lt;</w:t>
-      </w:r>
-      <w:proofErr w:type="spellStart"/>
-      <w:r>
-        <w:t>link</w:t>
-      </w:r>
-      <w:proofErr w:type="spellEnd"/>
-      <w:r>
-        <w:t xml:space="preserve"> rel="</w:t>
-      </w:r>
-      <w:proofErr w:type="spellStart"/>
-      <w:r>
-        <w:t>icon</w:t>
-      </w:r>
-      <w:proofErr w:type="spellEnd"/>
-      <w:r>
-        <w:t>" href="data:,"&gt;</w:t>
-      </w:r>
     </w:p>
     <w:p>
       <w:pPr>
@@ -2067,6 +2983,7 @@
     </w:p>
     <w:p>
       <w:r>
+        <w:lastRenderedPageBreak/>
         <w:t xml:space="preserve">Dans ce fichier .zip, vous trouverez un fichier nommé </w:t>
       </w:r>
       <w:r>
@@ -2374,6 +3291,92 @@
     </w:lvl>
   </w:abstractNum>
   <w:abstractNum w:abstractNumId="2" w15:restartNumberingAfterBreak="0">
+    <w:nsid w:val="2DB8380E"/>
+    <w:multiLevelType w:val="hybridMultilevel"/>
+    <w:tmpl w:val="7C4CE5E4"/>
+    <w:lvl w:ilvl="0" w:tplc="040C000F">
+      <w:start w:val="1"/>
+      <w:numFmt w:val="decimal"/>
+      <w:lvlText w:val="%1."/>
+      <w:lvlJc w:val="left"/>
+      <w:pPr>
+        <w:ind w:left="720" w:hanging="360"/>
+      </w:pPr>
+    </w:lvl>
+    <w:lvl w:ilvl="1" w:tplc="040C0019" w:tentative="1">
+      <w:start w:val="1"/>
+      <w:numFmt w:val="lowerLetter"/>
+      <w:lvlText w:val="%2."/>
+      <w:lvlJc w:val="left"/>
+      <w:pPr>
+        <w:ind w:left="1440" w:hanging="360"/>
+      </w:pPr>
+    </w:lvl>
+    <w:lvl w:ilvl="2" w:tplc="040C001B" w:tentative="1">
+      <w:start w:val="1"/>
+      <w:numFmt w:val="lowerRoman"/>
+      <w:lvlText w:val="%3."/>
+      <w:lvlJc w:val="right"/>
+      <w:pPr>
+        <w:ind w:left="2160" w:hanging="180"/>
+      </w:pPr>
+    </w:lvl>
+    <w:lvl w:ilvl="3" w:tplc="040C000F" w:tentative="1">
+      <w:start w:val="1"/>
+      <w:numFmt w:val="decimal"/>
+      <w:lvlText w:val="%4."/>
+      <w:lvlJc w:val="left"/>
+      <w:pPr>
+        <w:ind w:left="2880" w:hanging="360"/>
+      </w:pPr>
+    </w:lvl>
+    <w:lvl w:ilvl="4" w:tplc="040C0019" w:tentative="1">
+      <w:start w:val="1"/>
+      <w:numFmt w:val="lowerLetter"/>
+      <w:lvlText w:val="%5."/>
+      <w:lvlJc w:val="left"/>
+      <w:pPr>
+        <w:ind w:left="3600" w:hanging="360"/>
+      </w:pPr>
+    </w:lvl>
+    <w:lvl w:ilvl="5" w:tplc="040C001B" w:tentative="1">
+      <w:start w:val="1"/>
+      <w:numFmt w:val="lowerRoman"/>
+      <w:lvlText w:val="%6."/>
+      <w:lvlJc w:val="right"/>
+      <w:pPr>
+        <w:ind w:left="4320" w:hanging="180"/>
+      </w:pPr>
+    </w:lvl>
+    <w:lvl w:ilvl="6" w:tplc="040C000F" w:tentative="1">
+      <w:start w:val="1"/>
+      <w:numFmt w:val="decimal"/>
+      <w:lvlText w:val="%7."/>
+      <w:lvlJc w:val="left"/>
+      <w:pPr>
+        <w:ind w:left="5040" w:hanging="360"/>
+      </w:pPr>
+    </w:lvl>
+    <w:lvl w:ilvl="7" w:tplc="040C0019" w:tentative="1">
+      <w:start w:val="1"/>
+      <w:numFmt w:val="lowerLetter"/>
+      <w:lvlText w:val="%8."/>
+      <w:lvlJc w:val="left"/>
+      <w:pPr>
+        <w:ind w:left="5760" w:hanging="360"/>
+      </w:pPr>
+    </w:lvl>
+    <w:lvl w:ilvl="8" w:tplc="040C001B" w:tentative="1">
+      <w:start w:val="1"/>
+      <w:numFmt w:val="lowerRoman"/>
+      <w:lvlText w:val="%9."/>
+      <w:lvlJc w:val="right"/>
+      <w:pPr>
+        <w:ind w:left="6480" w:hanging="180"/>
+      </w:pPr>
+    </w:lvl>
+  </w:abstractNum>
+  <w:abstractNum w:abstractNumId="3" w15:restartNumberingAfterBreak="0">
     <w:nsid w:val="365A643C"/>
     <w:multiLevelType w:val="multilevel"/>
     <w:tmpl w:val="2E943742"/>
@@ -2522,7 +3525,7 @@
       </w:rPr>
     </w:lvl>
   </w:abstractNum>
-  <w:abstractNum w:abstractNumId="3" w15:restartNumberingAfterBreak="0">
+  <w:abstractNum w:abstractNumId="4" w15:restartNumberingAfterBreak="0">
     <w:nsid w:val="5FBE4F53"/>
     <w:multiLevelType w:val="multilevel"/>
     <w:tmpl w:val="B8147BAC"/>
@@ -2671,7 +3674,7 @@
       </w:rPr>
     </w:lvl>
   </w:abstractNum>
-  <w:abstractNum w:abstractNumId="4" w15:restartNumberingAfterBreak="0">
+  <w:abstractNum w:abstractNumId="5" w15:restartNumberingAfterBreak="0">
     <w:nsid w:val="6A4F2020"/>
     <w:multiLevelType w:val="multilevel"/>
     <w:tmpl w:val="4A0ADFE8"/>
@@ -2821,19 +3824,22 @@
     </w:lvl>
   </w:abstractNum>
   <w:num w:numId="1" w16cid:durableId="2516222">
+    <w:abstractNumId w:val="4"/>
+  </w:num>
+  <w:num w:numId="2" w16cid:durableId="426266471">
     <w:abstractNumId w:val="3"/>
   </w:num>
-  <w:num w:numId="2" w16cid:durableId="426266471">
-    <w:abstractNumId w:val="2"/>
-  </w:num>
   <w:num w:numId="3" w16cid:durableId="674767911">
-    <w:abstractNumId w:val="4"/>
+    <w:abstractNumId w:val="5"/>
   </w:num>
   <w:num w:numId="4" w16cid:durableId="483006734">
     <w:abstractNumId w:val="1"/>
   </w:num>
   <w:num w:numId="5" w16cid:durableId="1090734232">
     <w:abstractNumId w:val="0"/>
+  </w:num>
+  <w:num w:numId="6" w16cid:durableId="1843814977">
+    <w:abstractNumId w:val="2"/>
   </w:num>
 </w:numbering>
 </file>

</xml_diff>

<commit_message>
Ajustement icones pour PWABuilder
</commit_message>
<xml_diff>
--- a/readme.docx
+++ b/readme.docx
@@ -70,26 +70,16 @@
       <w:pPr>
         <w:pStyle w:val="Sansinterligne"/>
       </w:pPr>
-      <w:proofErr w:type="gramStart"/>
-      <w:r>
-        <w:t>comme</w:t>
-      </w:r>
-      <w:proofErr w:type="gramEnd"/>
-      <w:r>
-        <w:t xml:space="preserve"> une application mobile classique, mais sans avoir besoin de la télécharger</w:t>
-      </w:r>
-    </w:p>
-    <w:p>
-      <w:pPr>
-        <w:pStyle w:val="Sansinterligne"/>
-      </w:pPr>
-      <w:proofErr w:type="gramStart"/>
-      <w:r>
-        <w:t>depuis</w:t>
-      </w:r>
-      <w:proofErr w:type="gramEnd"/>
-      <w:r>
-        <w:t xml:space="preserve"> le Google Play Store ou l'App Store d'Apple.</w:t>
+      <w:r>
+        <w:t>comme une application mobile classique, mais sans avoir besoin de la télécharger</w:t>
+      </w:r>
+    </w:p>
+    <w:p>
+      <w:pPr>
+        <w:pStyle w:val="Sansinterligne"/>
+      </w:pPr>
+      <w:r>
+        <w:t>depuis le Google Play Store ou l'App Store d'Apple.</w:t>
       </w:r>
     </w:p>
     <w:p>
@@ -117,13 +107,8 @@
       <w:pPr>
         <w:pStyle w:val="Sansinterligne"/>
       </w:pPr>
-      <w:proofErr w:type="gramStart"/>
-      <w:r>
-        <w:t>simple</w:t>
-      </w:r>
-      <w:proofErr w:type="gramEnd"/>
-      <w:r>
-        <w:t xml:space="preserve"> raccourci sur l'écran d'accueil du téléphone. C'est pourquoi j'utilise les GitHub Pages.</w:t>
+      <w:r>
+        <w:t>simple raccourci sur l'écran d'accueil du téléphone. C'est pourquoi j'utilise les GitHub Pages.</w:t>
       </w:r>
     </w:p>
     <w:p>
@@ -165,13 +150,8 @@
       <w:pPr>
         <w:pStyle w:val="Sansinterligne"/>
       </w:pPr>
-      <w:proofErr w:type="gramStart"/>
-      <w:r>
-        <w:t>à</w:t>
-      </w:r>
-      <w:proofErr w:type="gramEnd"/>
-      <w:r>
-        <w:t xml:space="preserve"> l'application et permet de l'installer.</w:t>
+      <w:r>
+        <w:t>à l'application et permet de l'installer.</w:t>
       </w:r>
     </w:p>
     <w:p>
@@ -195,12 +175,10 @@
         <w:t xml:space="preserve">Fichier </w:t>
       </w:r>
       <w:proofErr w:type="spellStart"/>
-      <w:proofErr w:type="gramStart"/>
       <w:r>
         <w:t>manifest.json</w:t>
       </w:r>
       <w:proofErr w:type="spellEnd"/>
-      <w:proofErr w:type="gramEnd"/>
       <w:r>
         <w:t xml:space="preserve"> .</w:t>
       </w:r>
@@ -210,13 +188,8 @@
         <w:pStyle w:val="Sansinterligne"/>
       </w:pPr>
       <w:r>
-        <w:t xml:space="preserve">Fichier </w:t>
-      </w:r>
-      <w:proofErr w:type="gramStart"/>
-      <w:r>
-        <w:t>service-worker.js .</w:t>
-      </w:r>
-      <w:proofErr w:type="gramEnd"/>
+        <w:t>Fichier service-worker.js .</w:t>
+      </w:r>
     </w:p>
     <w:p>
       <w:pPr>
@@ -244,33 +217,20 @@
       </w:r>
       <w:proofErr w:type="spellEnd"/>
       <w:r>
-        <w:t xml:space="preserve"> : force à rester en https (c'était un essai pour héberger sur </w:t>
-      </w:r>
-      <w:proofErr w:type="gramStart"/>
-      <w:r>
-        <w:t>https://choraleknds.42web.io/ )</w:t>
-      </w:r>
-      <w:proofErr w:type="gramEnd"/>
-    </w:p>
-    <w:p>
-      <w:pPr>
-        <w:pStyle w:val="Sansinterligne"/>
-      </w:pPr>
-    </w:p>
-    <w:p>
-      <w:pPr>
-        <w:pStyle w:val="Sansinterligne"/>
-      </w:pPr>
-      <w:r>
-        <w:t xml:space="preserve">Je suis dans </w:t>
-      </w:r>
-      <w:proofErr w:type="gramStart"/>
-      <w:r>
-        <w:t>un fenêtre</w:t>
-      </w:r>
-      <w:proofErr w:type="gramEnd"/>
-      <w:r>
-        <w:t xml:space="preserve"> de commande cmd, dans le répertoire où j'ai les fichiers de mon application. J'ai un compte </w:t>
+        <w:t xml:space="preserve"> : force à rester en https (c'était un essai pour héberger sur https://choraleknds.42web.io/ )</w:t>
+      </w:r>
+    </w:p>
+    <w:p>
+      <w:pPr>
+        <w:pStyle w:val="Sansinterligne"/>
+      </w:pPr>
+    </w:p>
+    <w:p>
+      <w:pPr>
+        <w:pStyle w:val="Sansinterligne"/>
+      </w:pPr>
+      <w:r>
+        <w:t xml:space="preserve">Je suis dans un fenêtre de commande cmd, dans le répertoire où j'ai les fichiers de mon application. J'ai un compte </w:t>
       </w:r>
       <w:proofErr w:type="spellStart"/>
       <w:r>
@@ -380,18 +340,13 @@
         <w:pStyle w:val="Sansinterligne"/>
       </w:pPr>
       <w:r>
-        <w:t xml:space="preserve">Ne cochez aucune case (ni README, </w:t>
-      </w:r>
-      <w:proofErr w:type="gramStart"/>
-      <w:r>
-        <w:t>ni .</w:t>
+        <w:t>Ne cochez aucune case (ni README, ni .</w:t>
       </w:r>
       <w:proofErr w:type="spellStart"/>
       <w:r>
         <w:t>gitignore</w:t>
       </w:r>
       <w:proofErr w:type="spellEnd"/>
-      <w:proofErr w:type="gramEnd"/>
       <w:r>
         <w:t>).</w:t>
       </w:r>
@@ -468,44 +423,29 @@
       <w:pPr>
         <w:pStyle w:val="Sansinterligne"/>
       </w:pPr>
-      <w:proofErr w:type="gramStart"/>
-      <w:r>
-        <w:t>::</w:t>
-      </w:r>
-      <w:proofErr w:type="gramEnd"/>
-      <w:r>
-        <w:t xml:space="preserve"> Initialise le dossier comme un dépôt Git</w:t>
-      </w:r>
-    </w:p>
-    <w:p>
-      <w:pPr>
-        <w:pStyle w:val="Sansinterligne"/>
-      </w:pPr>
-      <w:proofErr w:type="gramStart"/>
-      <w:r>
-        <w:t>git</w:t>
-      </w:r>
-      <w:proofErr w:type="gramEnd"/>
-      <w:r>
-        <w:t xml:space="preserve"> init</w:t>
-      </w:r>
-    </w:p>
-    <w:p>
-      <w:pPr>
-        <w:pStyle w:val="Sansinterligne"/>
-      </w:pPr>
-    </w:p>
-    <w:p>
-      <w:pPr>
-        <w:pStyle w:val="Sansinterligne"/>
-      </w:pPr>
-      <w:proofErr w:type="gramStart"/>
-      <w:r>
-        <w:t>::</w:t>
-      </w:r>
-      <w:proofErr w:type="gramEnd"/>
-      <w:r>
-        <w:t xml:space="preserve"> Ajoute tous vos fichiers (index.html, </w:t>
+      <w:r>
+        <w:t>:: Initialise le dossier comme un dépôt Git</w:t>
+      </w:r>
+    </w:p>
+    <w:p>
+      <w:pPr>
+        <w:pStyle w:val="Sansinterligne"/>
+      </w:pPr>
+      <w:r>
+        <w:t>git init</w:t>
+      </w:r>
+    </w:p>
+    <w:p>
+      <w:pPr>
+        <w:pStyle w:val="Sansinterligne"/>
+      </w:pPr>
+    </w:p>
+    <w:p>
+      <w:pPr>
+        <w:pStyle w:val="Sansinterligne"/>
+      </w:pPr>
+      <w:r>
+        <w:t xml:space="preserve">:: Ajoute tous vos fichiers (index.html, </w:t>
       </w:r>
       <w:proofErr w:type="spellStart"/>
       <w:r>
@@ -528,16 +468,10 @@
       <w:pPr>
         <w:pStyle w:val="Sansinterligne"/>
       </w:pPr>
-      <w:proofErr w:type="gramStart"/>
-      <w:r>
-        <w:t>git</w:t>
-      </w:r>
-      <w:proofErr w:type="gramEnd"/>
-      <w:r>
-        <w:t xml:space="preserve"> </w:t>
-      </w:r>
-      <w:proofErr w:type="spellStart"/>
-      <w:proofErr w:type="gramStart"/>
+      <w:r>
+        <w:t xml:space="preserve">git </w:t>
+      </w:r>
+      <w:proofErr w:type="spellStart"/>
       <w:r>
         <w:t>add</w:t>
       </w:r>
@@ -545,37 +479,26 @@
       <w:r>
         <w:t xml:space="preserve"> .</w:t>
       </w:r>
-      <w:proofErr w:type="gramEnd"/>
-    </w:p>
-    <w:p>
-      <w:pPr>
-        <w:pStyle w:val="Sansinterligne"/>
-      </w:pPr>
-    </w:p>
-    <w:p>
-      <w:pPr>
-        <w:pStyle w:val="Sansinterligne"/>
-      </w:pPr>
-      <w:proofErr w:type="gramStart"/>
-      <w:r>
-        <w:t>::</w:t>
-      </w:r>
-      <w:proofErr w:type="gramEnd"/>
-      <w:r>
-        <w:t xml:space="preserve"> Crée votre premier point de sauvegarde</w:t>
-      </w:r>
-    </w:p>
-    <w:p>
-      <w:pPr>
-        <w:pStyle w:val="Sansinterligne"/>
-      </w:pPr>
-      <w:proofErr w:type="gramStart"/>
-      <w:r>
-        <w:t>git</w:t>
-      </w:r>
-      <w:proofErr w:type="gramEnd"/>
-      <w:r>
-        <w:t xml:space="preserve"> commit -m "</w:t>
+    </w:p>
+    <w:p>
+      <w:pPr>
+        <w:pStyle w:val="Sansinterligne"/>
+      </w:pPr>
+    </w:p>
+    <w:p>
+      <w:pPr>
+        <w:pStyle w:val="Sansinterligne"/>
+      </w:pPr>
+      <w:r>
+        <w:t>:: Crée votre premier point de sauvegarde</w:t>
+      </w:r>
+    </w:p>
+    <w:p>
+      <w:pPr>
+        <w:pStyle w:val="Sansinterligne"/>
+      </w:pPr>
+      <w:r>
+        <w:t>git commit -m "</w:t>
       </w:r>
       <w:proofErr w:type="spellStart"/>
       <w:r>
@@ -595,26 +518,16 @@
       <w:pPr>
         <w:pStyle w:val="Sansinterligne"/>
       </w:pPr>
-      <w:proofErr w:type="gramStart"/>
-      <w:r>
-        <w:t>::</w:t>
-      </w:r>
-      <w:proofErr w:type="gramEnd"/>
-      <w:r>
-        <w:t xml:space="preserve"> Renomme la branche principale en 'main'</w:t>
-      </w:r>
-    </w:p>
-    <w:p>
-      <w:pPr>
-        <w:pStyle w:val="Sansinterligne"/>
-      </w:pPr>
-      <w:proofErr w:type="gramStart"/>
-      <w:r>
-        <w:t>git</w:t>
-      </w:r>
-      <w:proofErr w:type="gramEnd"/>
-      <w:r>
-        <w:t xml:space="preserve"> </w:t>
+      <w:r>
+        <w:t>:: Renomme la branche principale en 'main'</w:t>
+      </w:r>
+    </w:p>
+    <w:p>
+      <w:pPr>
+        <w:pStyle w:val="Sansinterligne"/>
+      </w:pPr>
+      <w:r>
+        <w:t xml:space="preserve">git </w:t>
       </w:r>
       <w:proofErr w:type="spellStart"/>
       <w:r>
@@ -634,26 +547,16 @@
       <w:pPr>
         <w:pStyle w:val="Sansinterligne"/>
       </w:pPr>
-      <w:proofErr w:type="gramStart"/>
-      <w:r>
-        <w:t>::</w:t>
-      </w:r>
-      <w:proofErr w:type="gramEnd"/>
-      <w:r>
-        <w:t xml:space="preserve"> Relie votre dossier local à votre compte GitHub</w:t>
-      </w:r>
-    </w:p>
-    <w:p>
-      <w:pPr>
-        <w:pStyle w:val="Sansinterligne"/>
-      </w:pPr>
-      <w:proofErr w:type="gramStart"/>
-      <w:r>
-        <w:t>::</w:t>
-      </w:r>
-      <w:proofErr w:type="gramEnd"/>
-      <w:r>
-        <w:t xml:space="preserve"> (Remplacez l'URL par celle que vous avez copiée à l'étape 1)</w:t>
+      <w:r>
+        <w:t>:: Relie votre dossier local à votre compte GitHub</w:t>
+      </w:r>
+    </w:p>
+    <w:p>
+      <w:pPr>
+        <w:pStyle w:val="Sansinterligne"/>
+      </w:pPr>
+      <w:r>
+        <w:t>:: (Remplacez l'URL par celle que vous avez copiée à l'étape 1)</w:t>
       </w:r>
     </w:p>
     <w:p>
@@ -682,26 +585,16 @@
       <w:pPr>
         <w:pStyle w:val="Sansinterligne"/>
       </w:pPr>
-      <w:proofErr w:type="gramStart"/>
-      <w:r>
-        <w:t>::</w:t>
-      </w:r>
-      <w:proofErr w:type="gramEnd"/>
-      <w:r>
-        <w:t xml:space="preserve"> Envoie vos fichiers sur GitHub</w:t>
-      </w:r>
-    </w:p>
-    <w:p>
-      <w:pPr>
-        <w:pStyle w:val="Sansinterligne"/>
-      </w:pPr>
-      <w:proofErr w:type="gramStart"/>
-      <w:r>
-        <w:t>git</w:t>
-      </w:r>
-      <w:proofErr w:type="gramEnd"/>
-      <w:r>
-        <w:t xml:space="preserve"> push -u </w:t>
+      <w:r>
+        <w:t>:: Envoie vos fichiers sur GitHub</w:t>
+      </w:r>
+    </w:p>
+    <w:p>
+      <w:pPr>
+        <w:pStyle w:val="Sansinterligne"/>
+      </w:pPr>
+      <w:r>
+        <w:t xml:space="preserve">git push -u </w:t>
       </w:r>
       <w:proofErr w:type="spellStart"/>
       <w:r>
@@ -855,7 +748,6 @@
         <w:t xml:space="preserve">git config --global </w:t>
       </w:r>
       <w:proofErr w:type="spellStart"/>
-      <w:proofErr w:type="gramStart"/>
       <w:r>
         <w:rPr>
           <w:lang w:val="en-GB"/>
@@ -863,7 +755,6 @@
         <w:t>core.autocrlf</w:t>
       </w:r>
       <w:proofErr w:type="spellEnd"/>
-      <w:proofErr w:type="gramEnd"/>
       <w:r>
         <w:rPr>
           <w:lang w:val="en-GB"/>
@@ -901,17 +792,9 @@
       </w:pPr>
       <w:r>
         <w:tab/>
-      </w:r>
-      <w:proofErr w:type="gramStart"/>
-      <w:r>
-        <w:t>git</w:t>
-      </w:r>
-      <w:proofErr w:type="gramEnd"/>
-      <w:r>
-        <w:t xml:space="preserve"> </w:t>
-      </w:r>
-      <w:proofErr w:type="spellStart"/>
-      <w:proofErr w:type="gramStart"/>
+        <w:t xml:space="preserve">git </w:t>
+      </w:r>
+      <w:proofErr w:type="spellStart"/>
       <w:r>
         <w:t>add</w:t>
       </w:r>
@@ -919,7 +802,6 @@
       <w:r>
         <w:t xml:space="preserve"> .</w:t>
       </w:r>
-      <w:proofErr w:type="gramEnd"/>
     </w:p>
     <w:p>
       <w:pPr>
@@ -927,14 +809,7 @@
       </w:pPr>
       <w:r>
         <w:tab/>
-      </w:r>
-      <w:proofErr w:type="gramStart"/>
-      <w:r>
-        <w:t>git</w:t>
-      </w:r>
-      <w:proofErr w:type="gramEnd"/>
-      <w:r>
-        <w:t xml:space="preserve"> commit -m "rapatriement en local du fichier vexflow.js"</w:t>
+        <w:t>git commit -m "rapatriement en local du fichier vexflow.js"</w:t>
       </w:r>
     </w:p>
     <w:p>
@@ -943,14 +818,7 @@
       </w:pPr>
       <w:r>
         <w:tab/>
-      </w:r>
-      <w:proofErr w:type="gramStart"/>
-      <w:r>
-        <w:t>git</w:t>
-      </w:r>
-      <w:proofErr w:type="gramEnd"/>
-      <w:r>
-        <w:t xml:space="preserve"> push </w:t>
+        <w:t xml:space="preserve">git push </w:t>
       </w:r>
       <w:proofErr w:type="spellStart"/>
       <w:r>
@@ -1056,33 +924,15 @@
       </w:r>
       <w:r>
         <w:tab/>
-        <w:t xml:space="preserve">   </w:t>
-      </w:r>
-      <w:proofErr w:type="gramStart"/>
-      <w:r>
-        <w:t>par</w:t>
-      </w:r>
-      <w:proofErr w:type="gramEnd"/>
-      <w:r>
-        <w:t xml:space="preserve"> le fichier </w:t>
-      </w:r>
-      <w:proofErr w:type="spellStart"/>
-      <w:proofErr w:type="gramStart"/>
+        <w:t xml:space="preserve">   par le fichier </w:t>
+      </w:r>
+      <w:proofErr w:type="spellStart"/>
       <w:r>
         <w:t>manifest.json</w:t>
       </w:r>
       <w:proofErr w:type="spellEnd"/>
-      <w:proofErr w:type="gramEnd"/>
-      <w:r>
-        <w:t>) alors que sur smartphone son nom est "</w:t>
-      </w:r>
-      <w:proofErr w:type="gramStart"/>
-      <w:r>
-        <w:t>solfier</w:t>
-      </w:r>
-      <w:proofErr w:type="gramEnd"/>
-      <w:r>
-        <w:t>" dans la</w:t>
+      <w:r>
+        <w:t>) alors que sur smartphone son nom est "solfier" dans la</w:t>
       </w:r>
     </w:p>
     <w:p>
@@ -1094,15 +944,7 @@
       </w:r>
       <w:r>
         <w:tab/>
-        <w:t xml:space="preserve">   </w:t>
-      </w:r>
-      <w:proofErr w:type="gramStart"/>
-      <w:r>
-        <w:t>liste</w:t>
-      </w:r>
-      <w:proofErr w:type="gramEnd"/>
-      <w:r>
-        <w:t xml:space="preserve"> des applications --&gt; à unifier</w:t>
+        <w:t xml:space="preserve">   liste des applications --&gt; à unifier</w:t>
       </w:r>
     </w:p>
     <w:p>
@@ -1198,15 +1040,7 @@
         <w:t>Action :</w:t>
       </w:r>
       <w:r>
-        <w:t xml:space="preserve"> Augmentez-la (</w:t>
-      </w:r>
-      <w:proofErr w:type="gramStart"/>
-      <w:r>
-        <w:t>ex:</w:t>
-      </w:r>
-      <w:proofErr w:type="gramEnd"/>
-      <w:r>
-        <w:t xml:space="preserve"> 30) pour forcer un travail de stabilité vocale et de longueur de souffle (idéal pour le travail de </w:t>
+        <w:t xml:space="preserve"> Augmentez-la (ex: 30) pour forcer un travail de stabilité vocale et de longueur de souffle (idéal pour le travail de </w:t>
       </w:r>
       <w:proofErr w:type="spellStart"/>
       <w:r>
@@ -1214,15 +1048,7 @@
       </w:r>
       <w:proofErr w:type="spellEnd"/>
       <w:r>
-        <w:t>). Diminuez-la (</w:t>
-      </w:r>
-      <w:proofErr w:type="gramStart"/>
-      <w:r>
-        <w:t>ex:</w:t>
-      </w:r>
-      <w:proofErr w:type="gramEnd"/>
-      <w:r>
-        <w:t xml:space="preserve"> 10) pour une lecture de notes très rapide et nerveuse.</w:t>
+        <w:t>). Diminuez-la (ex: 10) pour une lecture de notes très rapide et nerveuse.</w:t>
       </w:r>
     </w:p>
     <w:p>
@@ -1304,15 +1130,7 @@
         <w:t>Action :</w:t>
       </w:r>
       <w:r>
-        <w:t xml:space="preserve"> Si l'application détecte des "fausses notes" à cause du bruit ambiant (ventilateur de PC, bruit de fond), augmentez ce seuil (</w:t>
-      </w:r>
-      <w:proofErr w:type="gramStart"/>
-      <w:r>
-        <w:t>ex:</w:t>
-      </w:r>
-      <w:proofErr w:type="gramEnd"/>
-      <w:r>
-        <w:t xml:space="preserve"> 0.06 ou 0.08). Si le micro du Pixel 7a capte mal votre voix quand vous chantez doucement (</w:t>
+        <w:t xml:space="preserve"> Si l'application détecte des "fausses notes" à cause du bruit ambiant (ventilateur de PC, bruit de fond), augmentez ce seuil (ex: 0.06 ou 0.08). Si le micro du Pixel 7a capte mal votre voix quand vous chantez doucement (</w:t>
       </w:r>
       <w:r>
         <w:rPr>
@@ -1332,15 +1150,7 @@
         <w:t>pianissimo</w:t>
       </w:r>
       <w:r>
-        <w:t>), baissez-le légèrement (</w:t>
-      </w:r>
-      <w:proofErr w:type="gramStart"/>
-      <w:r>
-        <w:t>ex:</w:t>
-      </w:r>
-      <w:proofErr w:type="gramEnd"/>
-      <w:r>
-        <w:t xml:space="preserve"> 0.03).</w:t>
+        <w:t>), baissez-le légèrement (ex: 0.03).</w:t>
       </w:r>
     </w:p>
     <w:p>
@@ -1425,168 +1235,51 @@
       </w:r>
     </w:p>
     <w:p>
-      <w:proofErr w:type="spellStart"/>
-      <w:proofErr w:type="gramStart"/>
-      <w:r>
+      <w:pPr>
+        <w:rPr>
+          <w:lang w:val="en-GB"/>
+        </w:rPr>
+      </w:pPr>
+      <w:proofErr w:type="spellStart"/>
+      <w:r>
+        <w:rPr>
+          <w:lang w:val="en-GB"/>
+        </w:rPr>
         <w:t>const</w:t>
       </w:r>
       <w:proofErr w:type="spellEnd"/>
-      <w:proofErr w:type="gramEnd"/>
-      <w:r>
+      <w:r>
+        <w:rPr>
+          <w:lang w:val="en-GB"/>
+        </w:rPr>
         <w:t xml:space="preserve"> VOICE_RANGES = {</w:t>
       </w:r>
     </w:p>
     <w:p>
-      <w:r>
-        <w:t xml:space="preserve">    </w:t>
-      </w:r>
-      <w:proofErr w:type="spellStart"/>
-      <w:proofErr w:type="gramStart"/>
-      <w:r>
-        <w:t>bass</w:t>
-      </w:r>
-      <w:proofErr w:type="spellEnd"/>
-      <w:r>
-        <w:t>:</w:t>
-      </w:r>
-      <w:proofErr w:type="gramEnd"/>
-      <w:r>
-        <w:t xml:space="preserve"> </w:t>
-      </w:r>
-      <w:proofErr w:type="gramStart"/>
-      <w:r>
-        <w:t xml:space="preserve">   {</w:t>
-      </w:r>
-      <w:proofErr w:type="gramEnd"/>
-      <w:r>
-        <w:t xml:space="preserve"> </w:t>
-      </w:r>
-      <w:proofErr w:type="gramStart"/>
-      <w:r>
-        <w:t>clef:</w:t>
-      </w:r>
-      <w:proofErr w:type="gramEnd"/>
-      <w:r>
-        <w:t xml:space="preserve"> "</w:t>
-      </w:r>
-      <w:proofErr w:type="spellStart"/>
-      <w:r>
-        <w:t>bass</w:t>
-      </w:r>
-      <w:proofErr w:type="spellEnd"/>
-      <w:proofErr w:type="gramStart"/>
-      <w:r>
-        <w:t xml:space="preserve">",   </w:t>
-      </w:r>
-      <w:proofErr w:type="gramEnd"/>
-      <w:r>
-        <w:t xml:space="preserve"> </w:t>
-      </w:r>
-      <w:proofErr w:type="gramStart"/>
-      <w:r>
-        <w:t>min:</w:t>
-      </w:r>
-      <w:proofErr w:type="gramEnd"/>
-      <w:r>
-        <w:t xml:space="preserve"> "e/2", </w:t>
-      </w:r>
-      <w:proofErr w:type="gramStart"/>
-      <w:r>
-        <w:t>max:</w:t>
-      </w:r>
-      <w:proofErr w:type="gramEnd"/>
-      <w:r>
-        <w:t xml:space="preserve"> "e/4", </w:t>
-      </w:r>
-      <w:proofErr w:type="spellStart"/>
-      <w:proofErr w:type="gramStart"/>
-      <w:r>
-        <w:t>median</w:t>
-      </w:r>
-      <w:proofErr w:type="spellEnd"/>
-      <w:r>
-        <w:t>:</w:t>
-      </w:r>
-      <w:proofErr w:type="gramEnd"/>
-      <w:r>
-        <w:t xml:space="preserve"> "d/3</w:t>
-      </w:r>
-      <w:proofErr w:type="gramStart"/>
-      <w:r>
-        <w:t>" }</w:t>
-      </w:r>
-      <w:proofErr w:type="gramEnd"/>
-      <w:r>
-        <w:t xml:space="preserve">, </w:t>
-      </w:r>
-    </w:p>
-    <w:p>
-      <w:r>
+      <w:pPr>
+        <w:rPr>
+          <w:lang w:val="en-GB"/>
+        </w:rPr>
+      </w:pPr>
+      <w:r>
+        <w:rPr>
+          <w:lang w:val="en-GB"/>
+        </w:rPr>
+        <w:t xml:space="preserve">    bass:    { clef: "bass",    min: "e/2", max: "e/4", median: "d/3" }, </w:t>
+      </w:r>
+    </w:p>
+    <w:p>
+      <w:pPr>
+        <w:rPr>
+          <w:lang w:val="en-GB"/>
+        </w:rPr>
+      </w:pPr>
+      <w:r>
+        <w:rPr>
+          <w:lang w:val="en-GB"/>
+        </w:rPr>
         <w:lastRenderedPageBreak/>
-        <w:t xml:space="preserve">    </w:t>
-      </w:r>
-      <w:proofErr w:type="spellStart"/>
-      <w:proofErr w:type="gramStart"/>
-      <w:r>
-        <w:t>tenor</w:t>
-      </w:r>
-      <w:proofErr w:type="spellEnd"/>
-      <w:r>
-        <w:t>:   {</w:t>
-      </w:r>
-      <w:proofErr w:type="gramEnd"/>
-      <w:r>
-        <w:t xml:space="preserve"> </w:t>
-      </w:r>
-      <w:proofErr w:type="gramStart"/>
-      <w:r>
-        <w:t>clef:</w:t>
-      </w:r>
-      <w:proofErr w:type="gramEnd"/>
-      <w:r>
-        <w:t xml:space="preserve"> "</w:t>
-      </w:r>
-      <w:proofErr w:type="spellStart"/>
-      <w:r>
-        <w:t>treble</w:t>
-      </w:r>
-      <w:proofErr w:type="spellEnd"/>
-      <w:proofErr w:type="gramStart"/>
-      <w:r>
-        <w:t>",  min</w:t>
-      </w:r>
-      <w:proofErr w:type="gramEnd"/>
-      <w:r>
-        <w:t xml:space="preserve">: "c/4", </w:t>
-      </w:r>
-      <w:proofErr w:type="gramStart"/>
-      <w:r>
-        <w:t>max:</w:t>
-      </w:r>
-      <w:proofErr w:type="gramEnd"/>
-      <w:r>
-        <w:t xml:space="preserve"> "c/6", </w:t>
-      </w:r>
-      <w:proofErr w:type="spellStart"/>
-      <w:proofErr w:type="gramStart"/>
-      <w:r>
-        <w:t>median</w:t>
-      </w:r>
-      <w:proofErr w:type="spellEnd"/>
-      <w:r>
-        <w:t>:</w:t>
-      </w:r>
-      <w:proofErr w:type="gramEnd"/>
-      <w:r>
-        <w:t xml:space="preserve"> "b/4</w:t>
-      </w:r>
-      <w:proofErr w:type="gramStart"/>
-      <w:r>
-        <w:t>" }</w:t>
-      </w:r>
-      <w:proofErr w:type="gramEnd"/>
-      <w:r>
-        <w:t xml:space="preserve">, </w:t>
+        <w:t xml:space="preserve">    tenor:   { clef: "treble",  min: "c/4", max: "c/6", median: "b/4" }, </w:t>
       </w:r>
     </w:p>
     <w:p>
@@ -1596,6 +1289,9 @@
         </w:rPr>
       </w:pPr>
       <w:r>
+        <w:rPr>
+          <w:lang w:val="en-GB"/>
+        </w:rPr>
         <w:t xml:space="preserve">    </w:t>
       </w:r>
       <w:r>
@@ -1636,11 +1332,9 @@
           <w:numId w:val="2"/>
         </w:numPr>
       </w:pPr>
-      <w:proofErr w:type="gramStart"/>
       <w:r>
         <w:t>min</w:t>
       </w:r>
-      <w:proofErr w:type="gramEnd"/>
       <w:r>
         <w:rPr>
           <w:b/>
@@ -1698,12 +1392,10 @@
         </w:numPr>
       </w:pPr>
       <w:proofErr w:type="spellStart"/>
-      <w:proofErr w:type="gramStart"/>
       <w:r>
         <w:t>median</w:t>
       </w:r>
       <w:proofErr w:type="spellEnd"/>
-      <w:proofErr w:type="gramEnd"/>
       <w:r>
         <w:rPr>
           <w:b/>
@@ -1748,25 +1440,20 @@
         <w:t xml:space="preserve">3. La logique des niveaux (dans la fonction </w:t>
       </w:r>
       <w:proofErr w:type="spellStart"/>
-      <w:proofErr w:type="gramStart"/>
       <w:r>
         <w:t>drawNote</w:t>
       </w:r>
       <w:proofErr w:type="spellEnd"/>
       <w:r>
-        <w:t>(</w:t>
-      </w:r>
-      <w:proofErr w:type="gramEnd"/>
-      <w:r>
+        <w:t>()</w:t>
+      </w:r>
+      <w:r>
+        <w:rPr>
+          <w:b/>
+          <w:bCs/>
+        </w:rPr>
         <w:t>)</w:t>
       </w:r>
-      <w:r>
-        <w:rPr>
-          <w:b/>
-          <w:bCs/>
-        </w:rPr>
-        <w:t>)</w:t>
-      </w:r>
     </w:p>
     <w:p>
       <w:r>
@@ -1780,12 +1467,10 @@
     </w:p>
     <w:p>
       <w:proofErr w:type="spellStart"/>
-      <w:proofErr w:type="gramStart"/>
       <w:r>
         <w:t>const</w:t>
       </w:r>
       <w:proofErr w:type="spellEnd"/>
-      <w:proofErr w:type="gramEnd"/>
       <w:r>
         <w:t xml:space="preserve"> offset = 2 + (</w:t>
       </w:r>
@@ -1795,13 +1480,8 @@
       </w:r>
       <w:proofErr w:type="spellEnd"/>
       <w:r>
-        <w:t xml:space="preserve"> - 1</w:t>
-      </w:r>
-      <w:proofErr w:type="gramStart"/>
-      <w:r>
-        <w:t>);</w:t>
-      </w:r>
-      <w:proofErr w:type="gramEnd"/>
+        <w:t xml:space="preserve"> - 1);</w:t>
+      </w:r>
     </w:p>
     <w:p>
       <w:pPr>
@@ -1868,15 +1548,7 @@
       </w:r>
       <w:proofErr w:type="spellEnd"/>
       <w:r>
-        <w:t xml:space="preserve"> - 1) * 2</w:t>
-      </w:r>
-      <w:proofErr w:type="gramStart"/>
-      <w:r>
-        <w:t>);</w:t>
-      </w:r>
-      <w:proofErr w:type="gramEnd"/>
-      <w:r>
-        <w:t xml:space="preserve"> pour doubler l'écart à chaque palier.</w:t>
+        <w:t xml:space="preserve"> - 1) * 2); pour doubler l'écart à chaque palier.</w:t>
       </w:r>
     </w:p>
     <w:p>
@@ -1919,12 +1591,10 @@
         </w:numPr>
       </w:pPr>
       <w:proofErr w:type="spellStart"/>
-      <w:proofErr w:type="gramStart"/>
       <w:r>
         <w:t>osc.type</w:t>
       </w:r>
       <w:proofErr w:type="spellEnd"/>
-      <w:proofErr w:type="gramEnd"/>
       <w:r>
         <w:t xml:space="preserve"> (actuellement 'sine')</w:t>
       </w:r>
@@ -1991,20 +1661,13 @@
         <w:t xml:space="preserve"> (actuellement 0.3 à la ligne </w:t>
       </w:r>
       <w:proofErr w:type="spellStart"/>
-      <w:proofErr w:type="gramStart"/>
       <w:r>
         <w:t>gainNode.gain.setValueAtTime</w:t>
       </w:r>
       <w:proofErr w:type="spellEnd"/>
-      <w:proofErr w:type="gramEnd"/>
-      <w:r>
-        <w:t xml:space="preserve">(0.3, </w:t>
-      </w:r>
-      <w:proofErr w:type="gramStart"/>
-      <w:r>
-        <w:t>...);)</w:t>
-      </w:r>
-      <w:proofErr w:type="gramEnd"/>
+      <w:r>
+        <w:t>(0.3, ...);)</w:t>
+      </w:r>
     </w:p>
     <w:p>
       <w:pPr>
@@ -2049,13 +1712,8 @@
           <w:numId w:val="4"/>
         </w:numPr>
       </w:pPr>
-      <w:proofErr w:type="gramStart"/>
-      <w:r>
-        <w:t>duration</w:t>
-      </w:r>
-      <w:proofErr w:type="gramEnd"/>
-      <w:r>
-        <w:t xml:space="preserve"> (actuellement 2.5)</w:t>
+      <w:r>
+        <w:t>duration (actuellement 2.5)</w:t>
       </w:r>
     </w:p>
     <w:p>
@@ -2128,15 +1786,7 @@
       </w:r>
       <w:proofErr w:type="spellEnd"/>
       <w:r>
-        <w:t xml:space="preserve"> et KEY_ALTERATIONS servent de base de données à l'application pour faire la correspondance entre les fréquences physiques (en Hz), les notations internationales (C, D, </w:t>
-      </w:r>
-      <w:proofErr w:type="gramStart"/>
-      <w:r>
-        <w:t>E...</w:t>
-      </w:r>
-      <w:proofErr w:type="gramEnd"/>
-      <w:r>
-        <w:t xml:space="preserve">) et l'affichage sur la portée de </w:t>
+        <w:t xml:space="preserve"> et KEY_ALTERATIONS servent de base de données à l'application pour faire la correspondance entre les fréquences physiques (en Hz), les notations internationales (C, D, E...) et l'affichage sur la portée de </w:t>
       </w:r>
       <w:proofErr w:type="spellStart"/>
       <w:r>
@@ -2255,25 +1905,7 @@
           <w:sz w:val="20"/>
           <w:szCs w:val="20"/>
         </w:rPr>
-        <w:t>" href="</w:t>
-      </w:r>
-      <w:proofErr w:type="gramStart"/>
-      <w:r>
-        <w:rPr>
-          <w:rFonts w:ascii="Courier New" w:hAnsi="Courier New" w:cs="Courier New"/>
-          <w:sz w:val="20"/>
-          <w:szCs w:val="20"/>
-        </w:rPr>
-        <w:t>data:,</w:t>
-      </w:r>
-      <w:proofErr w:type="gramEnd"/>
-      <w:r>
-        <w:rPr>
-          <w:rFonts w:ascii="Courier New" w:hAnsi="Courier New" w:cs="Courier New"/>
-          <w:sz w:val="20"/>
-          <w:szCs w:val="20"/>
-        </w:rPr>
-        <w:t>"&gt;</w:t>
+        <w:t>" href="data:,"&gt;</w:t>
       </w:r>
     </w:p>
     <w:p>
@@ -2305,15 +1937,200 @@
         <w:t xml:space="preserve">, et mettre à jour </w:t>
       </w:r>
       <w:proofErr w:type="spellStart"/>
-      <w:proofErr w:type="gramStart"/>
       <w:r>
         <w:t>manifest.json</w:t>
       </w:r>
       <w:proofErr w:type="spellEnd"/>
-      <w:proofErr w:type="gramEnd"/>
       <w:r>
         <w:t xml:space="preserve"> en conséquence</w:t>
       </w:r>
+      <w:r>
+        <w:t xml:space="preserve"> ; conversion en ligne de commande avec </w:t>
+      </w:r>
+      <w:proofErr w:type="spellStart"/>
+      <w:r>
+        <w:t>Inkscape</w:t>
+      </w:r>
+      <w:proofErr w:type="spellEnd"/>
+      <w:r>
+        <w:t xml:space="preserve"> :</w:t>
+      </w:r>
+    </w:p>
+    <w:p>
+      <w:pPr>
+        <w:spacing w:after="0"/>
+        <w:ind w:left="1418"/>
+        <w:rPr>
+          <w:rFonts w:ascii="Courier New" w:hAnsi="Courier New" w:cs="Courier New"/>
+          <w:sz w:val="20"/>
+          <w:szCs w:val="20"/>
+        </w:rPr>
+      </w:pPr>
+      <w:r>
+        <w:rPr>
+          <w:rFonts w:ascii="Courier New" w:hAnsi="Courier New" w:cs="Courier New"/>
+          <w:sz w:val="20"/>
+          <w:szCs w:val="20"/>
+        </w:rPr>
+        <w:t>&amp; "C:\Program Files\</w:t>
+      </w:r>
+      <w:proofErr w:type="spellStart"/>
+      <w:r>
+        <w:rPr>
+          <w:rFonts w:ascii="Courier New" w:hAnsi="Courier New" w:cs="Courier New"/>
+          <w:sz w:val="20"/>
+          <w:szCs w:val="20"/>
+        </w:rPr>
+        <w:t>Inkscape</w:t>
+      </w:r>
+      <w:proofErr w:type="spellEnd"/>
+      <w:r>
+        <w:rPr>
+          <w:rFonts w:ascii="Courier New" w:hAnsi="Courier New" w:cs="Courier New"/>
+          <w:sz w:val="20"/>
+          <w:szCs w:val="20"/>
+        </w:rPr>
+        <w:t xml:space="preserve">\bin\inkscape.exe" </w:t>
+      </w:r>
+      <w:proofErr w:type="spellStart"/>
+      <w:r>
+        <w:rPr>
+          <w:rFonts w:ascii="Courier New" w:hAnsi="Courier New" w:cs="Courier New"/>
+          <w:sz w:val="20"/>
+          <w:szCs w:val="20"/>
+        </w:rPr>
+        <w:t>icon.svg</w:t>
+      </w:r>
+      <w:proofErr w:type="spellEnd"/>
+      <w:r>
+        <w:rPr>
+          <w:rFonts w:ascii="Courier New" w:hAnsi="Courier New" w:cs="Courier New"/>
+          <w:sz w:val="20"/>
+          <w:szCs w:val="20"/>
+        </w:rPr>
+        <w:t xml:space="preserve"> -w 192 -h 192 -o icon-192.png</w:t>
+      </w:r>
+    </w:p>
+    <w:p>
+      <w:pPr>
+        <w:spacing w:after="0"/>
+        <w:ind w:left="1418"/>
+        <w:rPr>
+          <w:rFonts w:ascii="Courier New" w:hAnsi="Courier New" w:cs="Courier New"/>
+          <w:sz w:val="20"/>
+          <w:szCs w:val="20"/>
+        </w:rPr>
+      </w:pPr>
+      <w:r>
+        <w:rPr>
+          <w:rFonts w:ascii="Courier New" w:hAnsi="Courier New" w:cs="Courier New"/>
+          <w:sz w:val="20"/>
+          <w:szCs w:val="20"/>
+        </w:rPr>
+        <w:t>&amp; "C:\Program Files\</w:t>
+      </w:r>
+      <w:proofErr w:type="spellStart"/>
+      <w:r>
+        <w:rPr>
+          <w:rFonts w:ascii="Courier New" w:hAnsi="Courier New" w:cs="Courier New"/>
+          <w:sz w:val="20"/>
+          <w:szCs w:val="20"/>
+        </w:rPr>
+        <w:t>Inkscape</w:t>
+      </w:r>
+      <w:proofErr w:type="spellEnd"/>
+      <w:r>
+        <w:rPr>
+          <w:rFonts w:ascii="Courier New" w:hAnsi="Courier New" w:cs="Courier New"/>
+          <w:sz w:val="20"/>
+          <w:szCs w:val="20"/>
+        </w:rPr>
+        <w:t xml:space="preserve">\bin\inkscape.exe" </w:t>
+      </w:r>
+      <w:proofErr w:type="spellStart"/>
+      <w:r>
+        <w:rPr>
+          <w:rFonts w:ascii="Courier New" w:hAnsi="Courier New" w:cs="Courier New"/>
+          <w:sz w:val="20"/>
+          <w:szCs w:val="20"/>
+        </w:rPr>
+        <w:t>icon.svg</w:t>
+      </w:r>
+      <w:proofErr w:type="spellEnd"/>
+      <w:r>
+        <w:rPr>
+          <w:rFonts w:ascii="Courier New" w:hAnsi="Courier New" w:cs="Courier New"/>
+          <w:sz w:val="20"/>
+          <w:szCs w:val="20"/>
+        </w:rPr>
+        <w:t xml:space="preserve"> -w 512 -h 512 -o icon-512.png</w:t>
+      </w:r>
+    </w:p>
+    <w:p>
+      <w:pPr>
+        <w:spacing w:after="0"/>
+        <w:ind w:left="1418"/>
+        <w:rPr>
+          <w:rFonts w:ascii="Courier New" w:hAnsi="Courier New" w:cs="Courier New"/>
+          <w:sz w:val="20"/>
+          <w:szCs w:val="20"/>
+        </w:rPr>
+      </w:pPr>
+      <w:r>
+        <w:rPr>
+          <w:rFonts w:ascii="Courier New" w:hAnsi="Courier New" w:cs="Courier New"/>
+          <w:sz w:val="20"/>
+          <w:szCs w:val="20"/>
+        </w:rPr>
+        <w:t>&amp; "C:\Program Files\</w:t>
+      </w:r>
+      <w:proofErr w:type="spellStart"/>
+      <w:r>
+        <w:rPr>
+          <w:rFonts w:ascii="Courier New" w:hAnsi="Courier New" w:cs="Courier New"/>
+          <w:sz w:val="20"/>
+          <w:szCs w:val="20"/>
+        </w:rPr>
+        <w:t>Inkscape</w:t>
+      </w:r>
+      <w:proofErr w:type="spellEnd"/>
+      <w:r>
+        <w:rPr>
+          <w:rFonts w:ascii="Courier New" w:hAnsi="Courier New" w:cs="Courier New"/>
+          <w:sz w:val="20"/>
+          <w:szCs w:val="20"/>
+        </w:rPr>
+        <w:t>\bin\inkscape.exe" logo-</w:t>
+      </w:r>
+      <w:proofErr w:type="spellStart"/>
+      <w:r>
+        <w:rPr>
+          <w:rFonts w:ascii="Courier New" w:hAnsi="Courier New" w:cs="Courier New"/>
+          <w:sz w:val="20"/>
+          <w:szCs w:val="20"/>
+        </w:rPr>
+        <w:t>header.svg</w:t>
+      </w:r>
+      <w:proofErr w:type="spellEnd"/>
+      <w:r>
+        <w:rPr>
+          <w:rFonts w:ascii="Courier New" w:hAnsi="Courier New" w:cs="Courier New"/>
+          <w:sz w:val="20"/>
+          <w:szCs w:val="20"/>
+        </w:rPr>
+        <w:t xml:space="preserve"> -o logo-header.png</w:t>
+      </w:r>
+    </w:p>
+    <w:p>
+      <w:pPr>
+        <w:spacing w:after="0"/>
+        <w:ind w:left="1418"/>
+        <w:rPr>
+          <w:rFonts w:ascii="Courier New" w:hAnsi="Courier New" w:cs="Courier New"/>
+          <w:sz w:val="20"/>
+          <w:szCs w:val="20"/>
+        </w:rPr>
+      </w:pPr>
     </w:p>
     <w:p>
       <w:pPr>
@@ -2347,7 +2164,6 @@
         <w:t xml:space="preserve"> ; avant la balise &lt;/script&gt; en fin de fichier, entre la fonction </w:t>
       </w:r>
       <w:proofErr w:type="spellStart"/>
-      <w:proofErr w:type="gramStart"/>
       <w:r>
         <w:rPr>
           <w:rFonts w:ascii="Courier New" w:hAnsi="Courier New" w:cs="Courier New"/>
@@ -2357,12 +2173,10 @@
         <w:t>window.stop</w:t>
       </w:r>
       <w:proofErr w:type="spellEnd"/>
-      <w:proofErr w:type="gramEnd"/>
       <w:r>
         <w:t xml:space="preserve"> et la ligne </w:t>
       </w:r>
       <w:proofErr w:type="spellStart"/>
-      <w:proofErr w:type="gramStart"/>
       <w:r>
         <w:rPr>
           <w:rFonts w:ascii="Courier New" w:hAnsi="Courier New" w:cs="Courier New"/>
@@ -2378,16 +2192,7 @@
           <w:sz w:val="20"/>
           <w:szCs w:val="20"/>
         </w:rPr>
-        <w:t>(</w:t>
-      </w:r>
-      <w:proofErr w:type="gramEnd"/>
-      <w:r>
-        <w:rPr>
-          <w:rFonts w:ascii="Courier New" w:hAnsi="Courier New" w:cs="Courier New"/>
-          <w:sz w:val="20"/>
-          <w:szCs w:val="20"/>
-        </w:rPr>
-        <w:t>)</w:t>
+        <w:t>()</w:t>
       </w:r>
       <w:r>
         <w:t xml:space="preserve"> insérer le code suivant :</w:t>
@@ -2474,7 +2279,6 @@
         <w:t xml:space="preserve">    </w:t>
       </w:r>
       <w:proofErr w:type="spellStart"/>
-      <w:proofErr w:type="gramStart"/>
       <w:r>
         <w:rPr>
           <w:rFonts w:ascii="Courier New" w:hAnsi="Courier New" w:cs="Courier New"/>
@@ -2485,7 +2289,6 @@
         <w:t>window.addEventListener</w:t>
       </w:r>
       <w:proofErr w:type="spellEnd"/>
-      <w:proofErr w:type="gramEnd"/>
       <w:r>
         <w:rPr>
           <w:rFonts w:ascii="Courier New" w:hAnsi="Courier New" w:cs="Courier New"/>
@@ -2517,7 +2320,6 @@
         <w:t xml:space="preserve">        </w:t>
       </w:r>
       <w:proofErr w:type="spellStart"/>
-      <w:proofErr w:type="gramStart"/>
       <w:r>
         <w:rPr>
           <w:rFonts w:ascii="Courier New" w:hAnsi="Courier New" w:cs="Courier New"/>
@@ -2528,7 +2330,6 @@
         <w:t>navigator.serviceWorker.register</w:t>
       </w:r>
       <w:proofErr w:type="spellEnd"/>
-      <w:proofErr w:type="gramEnd"/>
       <w:r>
         <w:rPr>
           <w:rFonts w:ascii="Courier New" w:hAnsi="Courier New" w:cs="Courier New"/>
@@ -2558,7 +2359,6 @@
         </w:rPr>
         <w:t xml:space="preserve">            </w:t>
       </w:r>
-      <w:proofErr w:type="gramStart"/>
       <w:r>
         <w:rPr>
           <w:rFonts w:ascii="Courier New" w:hAnsi="Courier New" w:cs="Courier New"/>
@@ -2577,35 +2377,15 @@
         <w:t>then</w:t>
       </w:r>
       <w:proofErr w:type="spellEnd"/>
-      <w:proofErr w:type="gramEnd"/>
-      <w:r>
-        <w:rPr>
-          <w:rFonts w:ascii="Courier New" w:hAnsi="Courier New" w:cs="Courier New"/>
-          <w:sz w:val="20"/>
-          <w:szCs w:val="20"/>
-        </w:rPr>
-        <w:t xml:space="preserve">(reg =&gt; </w:t>
-      </w:r>
-      <w:proofErr w:type="gramStart"/>
-      <w:r>
-        <w:rPr>
-          <w:rFonts w:ascii="Courier New" w:hAnsi="Courier New" w:cs="Courier New"/>
-          <w:sz w:val="20"/>
-          <w:szCs w:val="20"/>
-        </w:rPr>
-        <w:t>console.log(</w:t>
-      </w:r>
-      <w:proofErr w:type="gramEnd"/>
-      <w:r>
-        <w:rPr>
-          <w:rFonts w:ascii="Courier New" w:hAnsi="Courier New" w:cs="Courier New"/>
-          <w:sz w:val="20"/>
-          <w:szCs w:val="20"/>
-        </w:rPr>
-        <w:t xml:space="preserve">'Service Worker enregistré avec succès !', </w:t>
-      </w:r>
-      <w:proofErr w:type="spellStart"/>
-      <w:proofErr w:type="gramStart"/>
+      <w:r>
+        <w:rPr>
+          <w:rFonts w:ascii="Courier New" w:hAnsi="Courier New" w:cs="Courier New"/>
+          <w:sz w:val="20"/>
+          <w:szCs w:val="20"/>
+        </w:rPr>
+        <w:t xml:space="preserve">(reg =&gt; console.log('Service Worker enregistré avec succès !', </w:t>
+      </w:r>
+      <w:proofErr w:type="spellStart"/>
       <w:r>
         <w:rPr>
           <w:rFonts w:ascii="Courier New" w:hAnsi="Courier New" w:cs="Courier New"/>
@@ -2615,7 +2395,6 @@
         <w:t>reg.scope</w:t>
       </w:r>
       <w:proofErr w:type="spellEnd"/>
-      <w:proofErr w:type="gramEnd"/>
       <w:r>
         <w:rPr>
           <w:rFonts w:ascii="Courier New" w:hAnsi="Courier New" w:cs="Courier New"/>
@@ -2641,25 +2420,7 @@
           <w:sz w:val="20"/>
           <w:szCs w:val="20"/>
         </w:rPr>
-        <w:t xml:space="preserve">            </w:t>
-      </w:r>
-      <w:proofErr w:type="gramStart"/>
-      <w:r>
-        <w:rPr>
-          <w:rFonts w:ascii="Courier New" w:hAnsi="Courier New" w:cs="Courier New"/>
-          <w:sz w:val="20"/>
-          <w:szCs w:val="20"/>
-        </w:rPr>
-        <w:t>.catch</w:t>
-      </w:r>
-      <w:proofErr w:type="gramEnd"/>
-      <w:r>
-        <w:rPr>
-          <w:rFonts w:ascii="Courier New" w:hAnsi="Courier New" w:cs="Courier New"/>
-          <w:sz w:val="20"/>
-          <w:szCs w:val="20"/>
-        </w:rPr>
-        <w:t>(</w:t>
+        <w:t xml:space="preserve">            .catch(</w:t>
       </w:r>
       <w:proofErr w:type="spellStart"/>
       <w:r>
@@ -2680,7 +2441,6 @@
         <w:t xml:space="preserve"> =&gt; </w:t>
       </w:r>
       <w:proofErr w:type="spellStart"/>
-      <w:proofErr w:type="gramStart"/>
       <w:r>
         <w:rPr>
           <w:rFonts w:ascii="Courier New" w:hAnsi="Courier New" w:cs="Courier New"/>
@@ -2690,7 +2450,6 @@
         <w:t>console.error</w:t>
       </w:r>
       <w:proofErr w:type="spellEnd"/>
-      <w:proofErr w:type="gramEnd"/>
       <w:r>
         <w:rPr>
           <w:rFonts w:ascii="Courier New" w:hAnsi="Courier New" w:cs="Courier New"/>
@@ -2733,18 +2492,8 @@
           <w:sz w:val="20"/>
           <w:szCs w:val="20"/>
         </w:rPr>
-        <w:t>)</w:t>
-      </w:r>
-      <w:proofErr w:type="gramStart"/>
-      <w:r>
-        <w:rPr>
-          <w:rFonts w:ascii="Courier New" w:hAnsi="Courier New" w:cs="Courier New"/>
-          <w:sz w:val="20"/>
-          <w:szCs w:val="20"/>
-        </w:rPr>
-        <w:t>);</w:t>
-      </w:r>
-      <w:proofErr w:type="gramEnd"/>
+        <w:t>));</w:t>
+      </w:r>
     </w:p>
     <w:p>
       <w:pPr>
@@ -2889,6 +2638,7 @@
         </w:numPr>
       </w:pPr>
       <w:r>
+        <w:lastRenderedPageBreak/>
         <w:t xml:space="preserve">Cliquez sur le bouton </w:t>
       </w:r>
       <w:r>
@@ -2983,7 +2733,6 @@
     </w:p>
     <w:p>
       <w:r>
-        <w:lastRenderedPageBreak/>
         <w:t xml:space="preserve">Dans ce fichier .zip, vous trouverez un fichier nommé </w:t>
       </w:r>
       <w:r>
@@ -4446,6 +4195,7 @@
   <w:style w:type="character" w:default="1" w:styleId="Policepardfaut">
     <w:name w:val="Default Paragraph Font"/>
     <w:uiPriority w:val="1"/>
+    <w:semiHidden/>
     <w:unhideWhenUsed/>
   </w:style>
   <w:style w:type="table" w:default="1" w:styleId="TableauNormal">

</xml_diff>

<commit_message>
Ajustement icones dans index.html
</commit_message>
<xml_diff>
--- a/readme.docx
+++ b/readme.docx
@@ -172,15 +172,7 @@
         <w:pStyle w:val="Sansinterligne"/>
       </w:pPr>
       <w:r>
-        <w:t xml:space="preserve">Fichier </w:t>
-      </w:r>
-      <w:proofErr w:type="spellStart"/>
-      <w:r>
-        <w:t>manifest.json</w:t>
-      </w:r>
-      <w:proofErr w:type="spellEnd"/>
-      <w:r>
-        <w:t xml:space="preserve"> .</w:t>
+        <w:t>Fichier manifest.json .</w:t>
       </w:r>
     </w:p>
     <w:p>
@@ -203,50 +195,21 @@
       <w:pPr>
         <w:pStyle w:val="Sansinterligne"/>
       </w:pPr>
-      <w:proofErr w:type="spellStart"/>
-      <w:r>
-        <w:t>Fuchier</w:t>
-      </w:r>
-      <w:proofErr w:type="spellEnd"/>
-      <w:r>
-        <w:t xml:space="preserve"> .</w:t>
-      </w:r>
-      <w:proofErr w:type="spellStart"/>
-      <w:r>
-        <w:t>htaccess</w:t>
-      </w:r>
-      <w:proofErr w:type="spellEnd"/>
-      <w:r>
-        <w:t xml:space="preserve"> : force à rester en https (c'était un essai pour héberger sur https://choraleknds.42web.io/ )</w:t>
-      </w:r>
-    </w:p>
-    <w:p>
-      <w:pPr>
-        <w:pStyle w:val="Sansinterligne"/>
-      </w:pPr>
-    </w:p>
-    <w:p>
-      <w:pPr>
-        <w:pStyle w:val="Sansinterligne"/>
-      </w:pPr>
-      <w:r>
-        <w:t xml:space="preserve">Je suis dans un fenêtre de commande cmd, dans le répertoire où j'ai les fichiers de mon application. J'ai un compte </w:t>
-      </w:r>
-      <w:proofErr w:type="spellStart"/>
-      <w:r>
-        <w:t>github</w:t>
-      </w:r>
-      <w:proofErr w:type="spellEnd"/>
-      <w:r>
-        <w:t xml:space="preserve">. </w:t>
-      </w:r>
-      <w:proofErr w:type="spellStart"/>
-      <w:r>
-        <w:t>Quells</w:t>
-      </w:r>
-      <w:proofErr w:type="spellEnd"/>
-      <w:r>
-        <w:t xml:space="preserve"> commandes git dois-je exécuter ?</w:t>
+      <w:r>
+        <w:t>Fuchier .htaccess : force à rester en https (c'était un essai pour héberger sur https://choraleknds.42web.io/ )</w:t>
+      </w:r>
+    </w:p>
+    <w:p>
+      <w:pPr>
+        <w:pStyle w:val="Sansinterligne"/>
+      </w:pPr>
+    </w:p>
+    <w:p>
+      <w:pPr>
+        <w:pStyle w:val="Sansinterligne"/>
+      </w:pPr>
+      <w:r>
+        <w:t>Je suis dans un fenêtre de commande cmd, dans le répertoire où j'ai les fichiers de mon application. J'ai un compte github. Quells commandes git dois-je exécuter ?</w:t>
       </w:r>
     </w:p>
     <w:p>
@@ -306,15 +269,7 @@
         <w:pStyle w:val="Sansinterligne"/>
       </w:pPr>
       <w:r>
-        <w:t xml:space="preserve">Nommez-le par exemple </w:t>
-      </w:r>
-      <w:proofErr w:type="spellStart"/>
-      <w:r>
-        <w:t>solfege</w:t>
-      </w:r>
-      <w:proofErr w:type="spellEnd"/>
-      <w:r>
-        <w:t>.</w:t>
+        <w:t>Nommez-le par exemple solfege.</w:t>
       </w:r>
     </w:p>
     <w:p>
@@ -340,36 +295,20 @@
         <w:pStyle w:val="Sansinterligne"/>
       </w:pPr>
       <w:r>
-        <w:t>Ne cochez aucune case (ni README, ni .</w:t>
-      </w:r>
-      <w:proofErr w:type="spellStart"/>
-      <w:r>
-        <w:t>gitignore</w:t>
-      </w:r>
-      <w:proofErr w:type="spellEnd"/>
-      <w:r>
-        <w:t>).</w:t>
-      </w:r>
-    </w:p>
-    <w:p>
-      <w:pPr>
-        <w:pStyle w:val="Sansinterligne"/>
-      </w:pPr>
-    </w:p>
-    <w:p>
-      <w:pPr>
-        <w:pStyle w:val="Sansinterligne"/>
-      </w:pPr>
-      <w:r>
-        <w:t xml:space="preserve">Cliquez sur </w:t>
-      </w:r>
-      <w:proofErr w:type="spellStart"/>
-      <w:r>
-        <w:t>Create</w:t>
-      </w:r>
-      <w:proofErr w:type="spellEnd"/>
-      <w:r>
-        <w:t xml:space="preserve"> repository.</w:t>
+        <w:t>Ne cochez aucune case (ni README, ni .gitignore).</w:t>
+      </w:r>
+    </w:p>
+    <w:p>
+      <w:pPr>
+        <w:pStyle w:val="Sansinterligne"/>
+      </w:pPr>
+    </w:p>
+    <w:p>
+      <w:pPr>
+        <w:pStyle w:val="Sansinterligne"/>
+      </w:pPr>
+      <w:r>
+        <w:t>Cliquez sur Create repository.</w:t>
       </w:r>
     </w:p>
     <w:p>
@@ -445,39 +384,15 @@
         <w:pStyle w:val="Sansinterligne"/>
       </w:pPr>
       <w:r>
-        <w:t xml:space="preserve">:: Ajoute tous vos fichiers (index.html, </w:t>
-      </w:r>
-      <w:proofErr w:type="spellStart"/>
-      <w:r>
-        <w:t>manifest</w:t>
-      </w:r>
-      <w:proofErr w:type="spellEnd"/>
-      <w:r>
-        <w:t xml:space="preserve">, </w:t>
-      </w:r>
-      <w:proofErr w:type="spellStart"/>
-      <w:r>
-        <w:t>icons</w:t>
-      </w:r>
-      <w:proofErr w:type="spellEnd"/>
-      <w:r>
-        <w:t>, etc.)</w:t>
-      </w:r>
-    </w:p>
-    <w:p>
-      <w:pPr>
-        <w:pStyle w:val="Sansinterligne"/>
-      </w:pPr>
-      <w:r>
-        <w:t xml:space="preserve">git </w:t>
-      </w:r>
-      <w:proofErr w:type="spellStart"/>
-      <w:r>
-        <w:t>add</w:t>
-      </w:r>
-      <w:proofErr w:type="spellEnd"/>
-      <w:r>
-        <w:t xml:space="preserve"> .</w:t>
+        <w:t>:: Ajoute tous vos fichiers (index.html, manifest, icons, etc.)</w:t>
+      </w:r>
+    </w:p>
+    <w:p>
+      <w:pPr>
+        <w:pStyle w:val="Sansinterligne"/>
+      </w:pPr>
+      <w:r>
+        <w:t>git add .</w:t>
       </w:r>
     </w:p>
     <w:p>
@@ -498,15 +413,7 @@
         <w:pStyle w:val="Sansinterligne"/>
       </w:pPr>
       <w:r>
-        <w:t>git commit -m "</w:t>
-      </w:r>
-      <w:proofErr w:type="spellStart"/>
-      <w:r>
-        <w:t>Premiere</w:t>
-      </w:r>
-      <w:proofErr w:type="spellEnd"/>
-      <w:r>
-        <w:t xml:space="preserve"> version PWA"</w:t>
+        <w:t>git commit -m "Premiere version PWA"</w:t>
       </w:r>
     </w:p>
     <w:p>
@@ -527,15 +434,7 @@
         <w:pStyle w:val="Sansinterligne"/>
       </w:pPr>
       <w:r>
-        <w:t xml:space="preserve">git </w:t>
-      </w:r>
-      <w:proofErr w:type="spellStart"/>
-      <w:r>
-        <w:t>branch</w:t>
-      </w:r>
-      <w:proofErr w:type="spellEnd"/>
-      <w:r>
-        <w:t xml:space="preserve"> -M main</w:t>
+        <w:t>git branch -M main</w:t>
       </w:r>
     </w:p>
     <w:p>
@@ -594,15 +493,7 @@
         <w:pStyle w:val="Sansinterligne"/>
       </w:pPr>
       <w:r>
-        <w:t xml:space="preserve">git push -u </w:t>
-      </w:r>
-      <w:proofErr w:type="spellStart"/>
-      <w:r>
-        <w:t>origin</w:t>
-      </w:r>
-      <w:proofErr w:type="spellEnd"/>
-      <w:r>
-        <w:t xml:space="preserve"> main</w:t>
+        <w:t>git push -u origin main</w:t>
       </w:r>
     </w:p>
     <w:p>
@@ -670,23 +561,7 @@
         <w:pStyle w:val="Sansinterligne"/>
       </w:pPr>
       <w:r>
-        <w:t>Sous "</w:t>
-      </w:r>
-      <w:proofErr w:type="spellStart"/>
-      <w:r>
-        <w:t>Build</w:t>
-      </w:r>
-      <w:proofErr w:type="spellEnd"/>
-      <w:r>
-        <w:t xml:space="preserve"> and </w:t>
-      </w:r>
-      <w:proofErr w:type="spellStart"/>
-      <w:r>
-        <w:t>deployment</w:t>
-      </w:r>
-      <w:proofErr w:type="spellEnd"/>
-      <w:r>
-        <w:t>", vérifiez que "Branch" est sur main et le dossier sur /(root).</w:t>
+        <w:t>Sous "Build and deployment", vérifiez que "Branch" est sur main et le dossier sur /(root).</w:t>
       </w:r>
     </w:p>
     <w:p>
@@ -745,29 +620,15 @@
         <w:rPr>
           <w:lang w:val="en-GB"/>
         </w:rPr>
-        <w:t xml:space="preserve">git config --global </w:t>
-      </w:r>
-      <w:proofErr w:type="spellStart"/>
-      <w:r>
+        <w:t>git config --global core.autocrlf true</w:t>
+      </w:r>
+    </w:p>
+    <w:p>
+      <w:pPr>
+        <w:pStyle w:val="Sansinterligne"/>
         <w:rPr>
           <w:lang w:val="en-GB"/>
         </w:rPr>
-        <w:t>core.autocrlf</w:t>
-      </w:r>
-      <w:proofErr w:type="spellEnd"/>
-      <w:r>
-        <w:rPr>
-          <w:lang w:val="en-GB"/>
-        </w:rPr>
-        <w:t xml:space="preserve"> true</w:t>
-      </w:r>
-    </w:p>
-    <w:p>
-      <w:pPr>
-        <w:pStyle w:val="Sansinterligne"/>
-        <w:rPr>
-          <w:lang w:val="en-GB"/>
-        </w:rPr>
       </w:pPr>
     </w:p>
     <w:p>
@@ -792,15 +653,7 @@
       </w:pPr>
       <w:r>
         <w:tab/>
-        <w:t xml:space="preserve">git </w:t>
-      </w:r>
-      <w:proofErr w:type="spellStart"/>
-      <w:r>
-        <w:t>add</w:t>
-      </w:r>
-      <w:proofErr w:type="spellEnd"/>
-      <w:r>
-        <w:t xml:space="preserve"> .</w:t>
+        <w:t>git add .</w:t>
       </w:r>
     </w:p>
     <w:p>
@@ -818,15 +671,7 @@
       </w:pPr>
       <w:r>
         <w:tab/>
-        <w:t xml:space="preserve">git push </w:t>
-      </w:r>
-      <w:proofErr w:type="spellStart"/>
-      <w:r>
-        <w:t>origin</w:t>
-      </w:r>
-      <w:proofErr w:type="spellEnd"/>
-      <w:r>
-        <w:t xml:space="preserve"> main</w:t>
+        <w:t>git push origin main</w:t>
       </w:r>
     </w:p>
     <w:p>
@@ -858,15 +703,7 @@
         <w:pStyle w:val="Sansinterligne"/>
       </w:pPr>
       <w:r>
-        <w:t xml:space="preserve">- ouvrir Google Chrome (sur smartphone ou PC), Safari sur </w:t>
-      </w:r>
-      <w:proofErr w:type="spellStart"/>
-      <w:r>
-        <w:t>IPhone</w:t>
-      </w:r>
-      <w:proofErr w:type="spellEnd"/>
-      <w:r>
-        <w:t xml:space="preserve"> </w:t>
+        <w:t xml:space="preserve">- ouvrir Google Chrome (sur smartphone ou PC), Safari sur IPhone </w:t>
       </w:r>
     </w:p>
     <w:p>
@@ -924,15 +761,7 @@
       </w:r>
       <w:r>
         <w:tab/>
-        <w:t xml:space="preserve">   par le fichier </w:t>
-      </w:r>
-      <w:proofErr w:type="spellStart"/>
-      <w:r>
-        <w:t>manifest.json</w:t>
-      </w:r>
-      <w:proofErr w:type="spellEnd"/>
-      <w:r>
-        <w:t>) alors que sur smartphone son nom est "solfier" dans la</w:t>
+        <w:t xml:space="preserve">   par le fichier manifest.json) alors que sur smartphone son nom est "solfier" dans la</w:t>
       </w:r>
     </w:p>
     <w:p>
@@ -1040,15 +869,7 @@
         <w:t>Action :</w:t>
       </w:r>
       <w:r>
-        <w:t xml:space="preserve"> Augmentez-la (ex: 30) pour forcer un travail de stabilité vocale et de longueur de souffle (idéal pour le travail de </w:t>
-      </w:r>
-      <w:proofErr w:type="spellStart"/>
-      <w:r>
-        <w:t>choeur</w:t>
-      </w:r>
-      <w:proofErr w:type="spellEnd"/>
-      <w:r>
-        <w:t>). Diminuez-la (ex: 10) pour une lecture de notes très rapide et nerveuse.</w:t>
+        <w:t xml:space="preserve"> Augmentez-la (ex: 30) pour forcer un travail de stabilité vocale et de longueur de souffle (idéal pour le travail de choeur). Diminuez-la (ex: 10) pour une lecture de notes très rapide et nerveuse.</w:t>
       </w:r>
     </w:p>
     <w:p>
@@ -1065,11 +886,9 @@
         </w:rPr>
         <w:t xml:space="preserve">Le seuil de bruit (dans la fonction </w:t>
       </w:r>
-      <w:proofErr w:type="spellStart"/>
       <w:r>
         <w:t>autoCorrelate</w:t>
       </w:r>
-      <w:proofErr w:type="spellEnd"/>
       <w:r>
         <w:rPr>
           <w:b/>
@@ -1078,23 +897,7 @@
         <w:t>)</w:t>
       </w:r>
       <w:r>
-        <w:t xml:space="preserve"> (actuellement 0.045 à la ligne if (</w:t>
-      </w:r>
-      <w:proofErr w:type="spellStart"/>
-      <w:r>
-        <w:t>Math.sqrt</w:t>
-      </w:r>
-      <w:proofErr w:type="spellEnd"/>
-      <w:r>
-        <w:t>(</w:t>
-      </w:r>
-      <w:proofErr w:type="spellStart"/>
-      <w:r>
-        <w:t>rms</w:t>
-      </w:r>
-      <w:proofErr w:type="spellEnd"/>
-      <w:r>
-        <w:t>/SIZE) &lt; 0.045) return -1;)</w:t>
+        <w:t xml:space="preserve"> (actuellement 0.045 à la ligne if (Math.sqrt(rms/SIZE) &lt; 0.045) return -1;)</w:t>
       </w:r>
     </w:p>
     <w:p>
@@ -1167,11 +970,9 @@
         </w:rPr>
         <w:t xml:space="preserve">Le seuil de clarté du signal (dans </w:t>
       </w:r>
-      <w:proofErr w:type="spellStart"/>
       <w:r>
         <w:t>autoCorrelate</w:t>
       </w:r>
-      <w:proofErr w:type="spellEnd"/>
       <w:r>
         <w:rPr>
           <w:b/>
@@ -1180,15 +981,7 @@
         <w:t>)</w:t>
       </w:r>
       <w:r>
-        <w:t xml:space="preserve"> (actuellement 0.2 à la ligne let r1=0, r2=SIZE-1, </w:t>
-      </w:r>
-      <w:proofErr w:type="spellStart"/>
-      <w:r>
-        <w:t>thres</w:t>
-      </w:r>
-      <w:proofErr w:type="spellEnd"/>
-      <w:r>
-        <w:t>=0.2;)</w:t>
+        <w:t xml:space="preserve"> (actuellement 0.2 à la ligne let r1=0, r2=SIZE-1, thres=0.2;)</w:t>
       </w:r>
     </w:p>
     <w:p>
@@ -1235,49 +1028,17 @@
       </w:r>
     </w:p>
     <w:p>
-      <w:pPr>
-        <w:rPr>
-          <w:lang w:val="en-GB"/>
-        </w:rPr>
-      </w:pPr>
-      <w:proofErr w:type="spellStart"/>
-      <w:r>
-        <w:rPr>
-          <w:lang w:val="en-GB"/>
-        </w:rPr>
-        <w:t>const</w:t>
-      </w:r>
-      <w:proofErr w:type="spellEnd"/>
-      <w:r>
-        <w:rPr>
-          <w:lang w:val="en-GB"/>
-        </w:rPr>
-        <w:t xml:space="preserve"> VOICE_RANGES = {</w:t>
-      </w:r>
-    </w:p>
-    <w:p>
-      <w:pPr>
-        <w:rPr>
-          <w:lang w:val="en-GB"/>
-        </w:rPr>
-      </w:pPr>
-      <w:r>
-        <w:rPr>
-          <w:lang w:val="en-GB"/>
-        </w:rPr>
+      <w:r>
+        <w:t>const VOICE_RANGES = {</w:t>
+      </w:r>
+    </w:p>
+    <w:p>
+      <w:r>
         <w:t xml:space="preserve">    bass:    { clef: "bass",    min: "e/2", max: "e/4", median: "d/3" }, </w:t>
       </w:r>
     </w:p>
     <w:p>
-      <w:pPr>
-        <w:rPr>
-          <w:lang w:val="en-GB"/>
-        </w:rPr>
-      </w:pPr>
-      <w:r>
-        <w:rPr>
-          <w:lang w:val="en-GB"/>
-        </w:rPr>
+      <w:r>
         <w:lastRenderedPageBreak/>
         <w:t xml:space="preserve">    tenor:   { clef: "treble",  min: "c/4", max: "c/6", median: "b/4" }, </w:t>
       </w:r>
@@ -1289,9 +1050,6 @@
         </w:rPr>
       </w:pPr>
       <w:r>
-        <w:rPr>
-          <w:lang w:val="en-GB"/>
-        </w:rPr>
         <w:t xml:space="preserve">    </w:t>
       </w:r>
       <w:r>
@@ -1353,15 +1111,7 @@
         <w:t xml:space="preserve"> :</w:t>
       </w:r>
       <w:r>
-        <w:t xml:space="preserve"> Définissent les notes extrêmes qui pourront être affichées sur la portée (format </w:t>
-      </w:r>
-      <w:proofErr w:type="spellStart"/>
-      <w:r>
-        <w:t>VexFlow</w:t>
-      </w:r>
-      <w:proofErr w:type="spellEnd"/>
-      <w:r>
-        <w:t xml:space="preserve"> : note/octave). Par exemple, "e/2" est le </w:t>
+        <w:t xml:space="preserve"> Définissent les notes extrêmes qui pourront être affichées sur la portée (format VexFlow : note/octave). Par exemple, "e/2" est le </w:t>
       </w:r>
       <w:r>
         <w:rPr>
@@ -1391,11 +1141,9 @@
           <w:numId w:val="2"/>
         </w:numPr>
       </w:pPr>
-      <w:proofErr w:type="spellStart"/>
       <w:r>
         <w:t>median</w:t>
       </w:r>
-      <w:proofErr w:type="spellEnd"/>
       <w:r>
         <w:rPr>
           <w:b/>
@@ -1439,13 +1187,8 @@
         </w:rPr>
         <w:t xml:space="preserve">3. La logique des niveaux (dans la fonction </w:t>
       </w:r>
-      <w:proofErr w:type="spellStart"/>
-      <w:r>
-        <w:t>drawNote</w:t>
-      </w:r>
-      <w:proofErr w:type="spellEnd"/>
-      <w:r>
-        <w:t>()</w:t>
+      <w:r>
+        <w:t>drawNote()</w:t>
       </w:r>
       <w:r>
         <w:rPr>
@@ -1466,21 +1209,8 @@
       </w:r>
     </w:p>
     <w:p>
-      <w:proofErr w:type="spellStart"/>
-      <w:r>
-        <w:t>const</w:t>
-      </w:r>
-      <w:proofErr w:type="spellEnd"/>
-      <w:r>
-        <w:t xml:space="preserve"> offset = 2 + (</w:t>
-      </w:r>
-      <w:proofErr w:type="spellStart"/>
-      <w:r>
-        <w:t>level</w:t>
-      </w:r>
-      <w:proofErr w:type="spellEnd"/>
-      <w:r>
-        <w:t xml:space="preserve"> - 1);</w:t>
+      <w:r>
+        <w:t>const offset = 2 + (level - 1);</w:t>
       </w:r>
     </w:p>
     <w:p>
@@ -1498,23 +1228,7 @@
         <w:t>Rôle :</w:t>
       </w:r>
       <w:r>
-        <w:t xml:space="preserve"> Au niveau 1, offset vaut 2. L'application choisit donc des notes situées à maximum 2 crans de la note </w:t>
-      </w:r>
-      <w:proofErr w:type="spellStart"/>
-      <w:r>
-        <w:t>median</w:t>
-      </w:r>
-      <w:proofErr w:type="spellEnd"/>
-      <w:r>
-        <w:t xml:space="preserve"> (dans le tableau </w:t>
-      </w:r>
-      <w:proofErr w:type="spellStart"/>
-      <w:r>
-        <w:t>scale</w:t>
-      </w:r>
-      <w:proofErr w:type="spellEnd"/>
-      <w:r>
-        <w:t>). À chaque niveau supplémentaire, l'écart augmente d'une note vers le haut et d'une note vers le bas.</w:t>
+        <w:t xml:space="preserve"> Au niveau 1, offset vaut 2. L'application choisit donc des notes situées à maximum 2 crans de la note median (dans le tableau scale). À chaque niveau supplémentaire, l'écart augmente d'une note vers le haut et d'une note vers le bas.</w:t>
       </w:r>
     </w:p>
     <w:p>
@@ -1532,23 +1246,7 @@
         <w:t>Action :</w:t>
       </w:r>
       <w:r>
-        <w:t xml:space="preserve"> Si vous trouvez que l'écart entre le Niveau 1 et le Niveau 5 est trop brutal, vous pouvez modifier le coefficient multiplicateur, par exemple : </w:t>
-      </w:r>
-      <w:proofErr w:type="spellStart"/>
-      <w:r>
-        <w:t>const</w:t>
-      </w:r>
-      <w:proofErr w:type="spellEnd"/>
-      <w:r>
-        <w:t xml:space="preserve"> offset = 1 + ((</w:t>
-      </w:r>
-      <w:proofErr w:type="spellStart"/>
-      <w:r>
-        <w:t>level</w:t>
-      </w:r>
-      <w:proofErr w:type="spellEnd"/>
-      <w:r>
-        <w:t xml:space="preserve"> - 1) * 2); pour doubler l'écart à chaque palier.</w:t>
+        <w:t xml:space="preserve"> Si vous trouvez que l'écart entre le Niveau 1 et le Niveau 5 est trop brutal, vous pouvez modifier le coefficient multiplicateur, par exemple : const offset = 1 + ((level - 1) * 2); pour doubler l'écart à chaque palier.</w:t>
       </w:r>
     </w:p>
     <w:p>
@@ -1565,11 +1263,9 @@
         </w:rPr>
         <w:t>4. Les paramètres du synthétiseur du clavier (</w:t>
       </w:r>
-      <w:proofErr w:type="spellStart"/>
       <w:r>
         <w:t>playNote</w:t>
       </w:r>
-      <w:proofErr w:type="spellEnd"/>
       <w:r>
         <w:rPr>
           <w:b/>
@@ -1590,13 +1286,8 @@
           <w:numId w:val="4"/>
         </w:numPr>
       </w:pPr>
-      <w:proofErr w:type="spellStart"/>
-      <w:r>
-        <w:t>osc.type</w:t>
-      </w:r>
-      <w:proofErr w:type="spellEnd"/>
-      <w:r>
-        <w:t xml:space="preserve"> (actuellement 'sine')</w:t>
+      <w:r>
+        <w:t>osc.type (actuellement 'sine')</w:t>
       </w:r>
     </w:p>
     <w:p>
@@ -1632,15 +1323,7 @@
         <w:t>Action :</w:t>
       </w:r>
       <w:r>
-        <w:t xml:space="preserve"> Le sinus ('sine') donne un son très pur de sifflement. Vous pouvez le changer en 'triangle' (plus doux, proche d'une flûte), '</w:t>
-      </w:r>
-      <w:proofErr w:type="spellStart"/>
-      <w:r>
-        <w:t>sawtooth</w:t>
-      </w:r>
-      <w:proofErr w:type="spellEnd"/>
-      <w:r>
-        <w:t>' (onde en dent de scie, très riche en harmoniques, style cordes/violon) ou 'square' (onde carrée, style clarinette/vieux jeux vidéo) pour changer le timbre du repère audio.</w:t>
+        <w:t xml:space="preserve"> Le sinus ('sine') donne un son très pur de sifflement. Vous pouvez le changer en 'triangle' (plus doux, proche d'une flûte), 'sawtooth' (onde en dent de scie, très riche en harmoniques, style cordes/violon) ou 'square' (onde carrée, style clarinette/vieux jeux vidéo) pour changer le timbre du repère audio.</w:t>
       </w:r>
     </w:p>
     <w:p>
@@ -1658,15 +1341,7 @@
         <w:t>Le volume initial</w:t>
       </w:r>
       <w:r>
-        <w:t xml:space="preserve"> (actuellement 0.3 à la ligne </w:t>
-      </w:r>
-      <w:proofErr w:type="spellStart"/>
-      <w:r>
-        <w:t>gainNode.gain.setValueAtTime</w:t>
-      </w:r>
-      <w:proofErr w:type="spellEnd"/>
-      <w:r>
-        <w:t>(0.3, ...);)</w:t>
+        <w:t xml:space="preserve"> (actuellement 0.3 à la ligne gainNode.gain.setValueAtTime(0.3, ...);)</w:t>
       </w:r>
     </w:p>
     <w:p>
@@ -1770,31 +1445,7 @@
     </w:p>
     <w:p>
       <w:r>
-        <w:t xml:space="preserve">Les tableaux NOTE_NAMES, </w:t>
-      </w:r>
-      <w:proofErr w:type="spellStart"/>
-      <w:r>
-        <w:t>scale</w:t>
-      </w:r>
-      <w:proofErr w:type="spellEnd"/>
-      <w:r>
-        <w:t xml:space="preserve">, </w:t>
-      </w:r>
-      <w:proofErr w:type="spellStart"/>
-      <w:r>
-        <w:t>toFrench</w:t>
-      </w:r>
-      <w:proofErr w:type="spellEnd"/>
-      <w:r>
-        <w:t xml:space="preserve"> et KEY_ALTERATIONS servent de base de données à l'application pour faire la correspondance entre les fréquences physiques (en Hz), les notations internationales (C, D, E...) et l'affichage sur la portée de </w:t>
-      </w:r>
-      <w:proofErr w:type="spellStart"/>
-      <w:r>
-        <w:t>VexFlow</w:t>
-      </w:r>
-      <w:proofErr w:type="spellEnd"/>
-      <w:r>
-        <w:t>. Il est préférable de les laisser intacts pour éviter de désynchroniser le moteur graphique du moteur audio.</w:t>
+        <w:t>Les tableaux NOTE_NAMES, scale, toFrench et KEY_ALTERATIONS servent de base de données à l'application pour faire la correspondance entre les fréquences physiques (en Hz), les notations internationales (C, D, E...) et l'affichage sur la portée de VexFlow. Il est préférable de les laisser intacts pour éviter de désynchroniser le moteur graphique du moteur audio.</w:t>
       </w:r>
     </w:p>
     <w:p/>
@@ -1827,17 +1478,8 @@
           <w:b/>
           <w:bCs/>
         </w:rPr>
-        <w:t xml:space="preserve">Ajustements pour permettre </w:t>
-      </w:r>
-      <w:proofErr w:type="spellStart"/>
-      <w:r>
-        <w:rPr>
-          <w:b/>
-          <w:bCs/>
-        </w:rPr>
-        <w:t>PWABuilder</w:t>
-      </w:r>
-      <w:proofErr w:type="spellEnd"/>
+        <w:t>Ajustements pour permettre PWABuilder</w:t>
+      </w:r>
     </w:p>
     <w:p>
       <w:pPr>
@@ -1869,43 +1511,7 @@
           <w:sz w:val="20"/>
           <w:szCs w:val="20"/>
         </w:rPr>
-        <w:t>&lt;</w:t>
-      </w:r>
-      <w:proofErr w:type="spellStart"/>
-      <w:r>
-        <w:rPr>
-          <w:rFonts w:ascii="Courier New" w:hAnsi="Courier New" w:cs="Courier New"/>
-          <w:sz w:val="20"/>
-          <w:szCs w:val="20"/>
-        </w:rPr>
-        <w:t>link</w:t>
-      </w:r>
-      <w:proofErr w:type="spellEnd"/>
-      <w:r>
-        <w:rPr>
-          <w:rFonts w:ascii="Courier New" w:hAnsi="Courier New" w:cs="Courier New"/>
-          <w:sz w:val="20"/>
-          <w:szCs w:val="20"/>
-        </w:rPr>
-        <w:t xml:space="preserve"> rel="</w:t>
-      </w:r>
-      <w:proofErr w:type="spellStart"/>
-      <w:r>
-        <w:rPr>
-          <w:rFonts w:ascii="Courier New" w:hAnsi="Courier New" w:cs="Courier New"/>
-          <w:sz w:val="20"/>
-          <w:szCs w:val="20"/>
-        </w:rPr>
-        <w:t>icon</w:t>
-      </w:r>
-      <w:proofErr w:type="spellEnd"/>
-      <w:r>
-        <w:rPr>
-          <w:rFonts w:ascii="Courier New" w:hAnsi="Courier New" w:cs="Courier New"/>
-          <w:sz w:val="20"/>
-          <w:szCs w:val="20"/>
-        </w:rPr>
-        <w:t>" href="data:,"&gt;</w:t>
+        <w:t>&lt;link rel="icon" href="data:,"&gt;</w:t>
       </w:r>
     </w:p>
     <w:p>
@@ -1917,15 +1523,7 @@
         </w:numPr>
       </w:pPr>
       <w:r>
-        <w:t xml:space="preserve">Remplacer les 2 icones au format </w:t>
-      </w:r>
-      <w:proofErr w:type="spellStart"/>
-      <w:r>
-        <w:t>svg</w:t>
-      </w:r>
-      <w:proofErr w:type="spellEnd"/>
-      <w:r>
-        <w:t xml:space="preserve"> </w:t>
+        <w:t xml:space="preserve">Remplacer les 2 icones au format svg </w:t>
       </w:r>
       <w:r>
         <w:t xml:space="preserve">par </w:t>
@@ -1934,26 +1532,16 @@
         <w:t>icon-192.png et icon-512.png</w:t>
       </w:r>
       <w:r>
-        <w:t xml:space="preserve">, et mettre à jour </w:t>
-      </w:r>
-      <w:proofErr w:type="spellStart"/>
-      <w:r>
-        <w:t>manifest.json</w:t>
-      </w:r>
-      <w:proofErr w:type="spellEnd"/>
-      <w:r>
-        <w:t xml:space="preserve"> en conséquence</w:t>
-      </w:r>
-      <w:r>
-        <w:t xml:space="preserve"> ; conversion en ligne de commande avec </w:t>
-      </w:r>
-      <w:proofErr w:type="spellStart"/>
-      <w:r>
-        <w:t>Inkscape</w:t>
-      </w:r>
-      <w:proofErr w:type="spellEnd"/>
-      <w:r>
-        <w:t xml:space="preserve"> :</w:t>
+        <w:t xml:space="preserve">, et mettre à jour manifest.json </w:t>
+      </w:r>
+      <w:r>
+        <w:t xml:space="preserve">et index.html </w:t>
+      </w:r>
+      <w:r>
+        <w:t>en conséquence</w:t>
+      </w:r>
+      <w:r>
+        <w:t xml:space="preserve"> ; conversion en ligne de commande avec Inkscape :</w:t>
       </w:r>
     </w:p>
     <w:p>
@@ -1972,153 +1560,45 @@
           <w:sz w:val="20"/>
           <w:szCs w:val="20"/>
         </w:rPr>
-        <w:t>&amp; "C:\Program Files\</w:t>
-      </w:r>
-      <w:proofErr w:type="spellStart"/>
-      <w:r>
+        <w:t>&amp; "C:\Program Files\Inkscape\bin\inkscape.exe" icon.svg -w 192 -h 192 -o icon-192.png</w:t>
+      </w:r>
+    </w:p>
+    <w:p>
+      <w:pPr>
+        <w:spacing w:after="0"/>
+        <w:ind w:left="1418"/>
         <w:rPr>
           <w:rFonts w:ascii="Courier New" w:hAnsi="Courier New" w:cs="Courier New"/>
           <w:sz w:val="20"/>
           <w:szCs w:val="20"/>
         </w:rPr>
-        <w:t>Inkscape</w:t>
-      </w:r>
-      <w:proofErr w:type="spellEnd"/>
+      </w:pPr>
       <w:r>
         <w:rPr>
           <w:rFonts w:ascii="Courier New" w:hAnsi="Courier New" w:cs="Courier New"/>
           <w:sz w:val="20"/>
           <w:szCs w:val="20"/>
         </w:rPr>
-        <w:t xml:space="preserve">\bin\inkscape.exe" </w:t>
-      </w:r>
-      <w:proofErr w:type="spellStart"/>
-      <w:r>
+        <w:t>&amp; "C:\Program Files\Inkscape\bin\inkscape.exe" icon.svg -w 512 -h 512 -o icon-512.png</w:t>
+      </w:r>
+    </w:p>
+    <w:p>
+      <w:pPr>
+        <w:spacing w:after="0"/>
+        <w:ind w:left="1418"/>
         <w:rPr>
           <w:rFonts w:ascii="Courier New" w:hAnsi="Courier New" w:cs="Courier New"/>
           <w:sz w:val="20"/>
           <w:szCs w:val="20"/>
         </w:rPr>
-        <w:t>icon.svg</w:t>
-      </w:r>
-      <w:proofErr w:type="spellEnd"/>
+      </w:pPr>
       <w:r>
         <w:rPr>
           <w:rFonts w:ascii="Courier New" w:hAnsi="Courier New" w:cs="Courier New"/>
           <w:sz w:val="20"/>
           <w:szCs w:val="20"/>
         </w:rPr>
-        <w:t xml:space="preserve"> -w 192 -h 192 -o icon-192.png</w:t>
-      </w:r>
-    </w:p>
-    <w:p>
-      <w:pPr>
-        <w:spacing w:after="0"/>
-        <w:ind w:left="1418"/>
-        <w:rPr>
-          <w:rFonts w:ascii="Courier New" w:hAnsi="Courier New" w:cs="Courier New"/>
-          <w:sz w:val="20"/>
-          <w:szCs w:val="20"/>
-        </w:rPr>
-      </w:pPr>
-      <w:r>
-        <w:rPr>
-          <w:rFonts w:ascii="Courier New" w:hAnsi="Courier New" w:cs="Courier New"/>
-          <w:sz w:val="20"/>
-          <w:szCs w:val="20"/>
-        </w:rPr>
-        <w:t>&amp; "C:\Program Files\</w:t>
-      </w:r>
-      <w:proofErr w:type="spellStart"/>
-      <w:r>
-        <w:rPr>
-          <w:rFonts w:ascii="Courier New" w:hAnsi="Courier New" w:cs="Courier New"/>
-          <w:sz w:val="20"/>
-          <w:szCs w:val="20"/>
-        </w:rPr>
-        <w:t>Inkscape</w:t>
-      </w:r>
-      <w:proofErr w:type="spellEnd"/>
-      <w:r>
-        <w:rPr>
-          <w:rFonts w:ascii="Courier New" w:hAnsi="Courier New" w:cs="Courier New"/>
-          <w:sz w:val="20"/>
-          <w:szCs w:val="20"/>
-        </w:rPr>
-        <w:t xml:space="preserve">\bin\inkscape.exe" </w:t>
-      </w:r>
-      <w:proofErr w:type="spellStart"/>
-      <w:r>
-        <w:rPr>
-          <w:rFonts w:ascii="Courier New" w:hAnsi="Courier New" w:cs="Courier New"/>
-          <w:sz w:val="20"/>
-          <w:szCs w:val="20"/>
-        </w:rPr>
-        <w:t>icon.svg</w:t>
-      </w:r>
-      <w:proofErr w:type="spellEnd"/>
-      <w:r>
-        <w:rPr>
-          <w:rFonts w:ascii="Courier New" w:hAnsi="Courier New" w:cs="Courier New"/>
-          <w:sz w:val="20"/>
-          <w:szCs w:val="20"/>
-        </w:rPr>
-        <w:t xml:space="preserve"> -w 512 -h 512 -o icon-512.png</w:t>
-      </w:r>
-    </w:p>
-    <w:p>
-      <w:pPr>
-        <w:spacing w:after="0"/>
-        <w:ind w:left="1418"/>
-        <w:rPr>
-          <w:rFonts w:ascii="Courier New" w:hAnsi="Courier New" w:cs="Courier New"/>
-          <w:sz w:val="20"/>
-          <w:szCs w:val="20"/>
-        </w:rPr>
-      </w:pPr>
-      <w:r>
-        <w:rPr>
-          <w:rFonts w:ascii="Courier New" w:hAnsi="Courier New" w:cs="Courier New"/>
-          <w:sz w:val="20"/>
-          <w:szCs w:val="20"/>
-        </w:rPr>
-        <w:t>&amp; "C:\Program Files\</w:t>
-      </w:r>
-      <w:proofErr w:type="spellStart"/>
-      <w:r>
-        <w:rPr>
-          <w:rFonts w:ascii="Courier New" w:hAnsi="Courier New" w:cs="Courier New"/>
-          <w:sz w:val="20"/>
-          <w:szCs w:val="20"/>
-        </w:rPr>
-        <w:t>Inkscape</w:t>
-      </w:r>
-      <w:proofErr w:type="spellEnd"/>
-      <w:r>
-        <w:rPr>
-          <w:rFonts w:ascii="Courier New" w:hAnsi="Courier New" w:cs="Courier New"/>
-          <w:sz w:val="20"/>
-          <w:szCs w:val="20"/>
-        </w:rPr>
-        <w:t>\bin\inkscape.exe" logo-</w:t>
-      </w:r>
-      <w:proofErr w:type="spellStart"/>
-      <w:r>
-        <w:rPr>
-          <w:rFonts w:ascii="Courier New" w:hAnsi="Courier New" w:cs="Courier New"/>
-          <w:sz w:val="20"/>
-          <w:szCs w:val="20"/>
-        </w:rPr>
-        <w:t>header.svg</w:t>
-      </w:r>
-      <w:proofErr w:type="spellEnd"/>
-      <w:r>
-        <w:rPr>
-          <w:rFonts w:ascii="Courier New" w:hAnsi="Courier New" w:cs="Courier New"/>
-          <w:sz w:val="20"/>
-          <w:szCs w:val="20"/>
-        </w:rPr>
-        <w:t xml:space="preserve"> -o logo-header.png</w:t>
+        <w:t>&amp; "C:\Program Files\Inkscape\bin\inkscape.exe" logo-header.svg -o logo-header.png</w:t>
       </w:r>
     </w:p>
     <w:p>
@@ -2140,13 +1620,8 @@
           <w:numId w:val="6"/>
         </w:numPr>
       </w:pPr>
-      <w:proofErr w:type="spellStart"/>
-      <w:r>
-        <w:t>PWABuilder</w:t>
-      </w:r>
-      <w:proofErr w:type="spellEnd"/>
-      <w:r>
-        <w:t xml:space="preserve"> </w:t>
+      <w:r>
+        <w:t xml:space="preserve">PWABuilder </w:t>
       </w:r>
       <w:r>
         <w:t>exige de trouver dans i</w:t>
@@ -2163,7 +1638,6 @@
       <w:r>
         <w:t xml:space="preserve"> ; avant la balise &lt;/script&gt; en fin de fichier, entre la fonction </w:t>
       </w:r>
-      <w:proofErr w:type="spellStart"/>
       <w:r>
         <w:rPr>
           <w:rFonts w:ascii="Courier New" w:hAnsi="Courier New" w:cs="Courier New"/>
@@ -2172,27 +1646,16 @@
         </w:rPr>
         <w:t>window.stop</w:t>
       </w:r>
-      <w:proofErr w:type="spellEnd"/>
       <w:r>
         <w:t xml:space="preserve"> et la ligne </w:t>
       </w:r>
-      <w:proofErr w:type="spellStart"/>
       <w:r>
         <w:rPr>
           <w:rFonts w:ascii="Courier New" w:hAnsi="Courier New" w:cs="Courier New"/>
           <w:sz w:val="20"/>
           <w:szCs w:val="20"/>
         </w:rPr>
-        <w:t>initVisual</w:t>
-      </w:r>
-      <w:proofErr w:type="spellEnd"/>
-      <w:r>
-        <w:rPr>
-          <w:rFonts w:ascii="Courier New" w:hAnsi="Courier New" w:cs="Courier New"/>
-          <w:sz w:val="20"/>
-          <w:szCs w:val="20"/>
-        </w:rPr>
-        <w:t>()</w:t>
+        <w:t>initVisual()</w:t>
       </w:r>
       <w:r>
         <w:t xml:space="preserve"> insérer le code suivant :</w:t>
@@ -2235,19 +1698,20 @@
           <w:szCs w:val="20"/>
           <w:lang w:val="en-GB"/>
         </w:rPr>
-        <w:t>if ('</w:t>
-      </w:r>
-      <w:proofErr w:type="spellStart"/>
-      <w:r>
+        <w:t>if ('serviceWorker' in navigator) {</w:t>
+      </w:r>
+    </w:p>
+    <w:p>
+      <w:pPr>
+        <w:spacing w:after="0"/>
+        <w:ind w:left="1418"/>
         <w:rPr>
           <w:rFonts w:ascii="Courier New" w:hAnsi="Courier New" w:cs="Courier New"/>
           <w:sz w:val="20"/>
           <w:szCs w:val="20"/>
           <w:lang w:val="en-GB"/>
         </w:rPr>
-        <w:t>serviceWorker</w:t>
-      </w:r>
-      <w:proofErr w:type="spellEnd"/>
+      </w:pPr>
       <w:r>
         <w:rPr>
           <w:rFonts w:ascii="Courier New" w:hAnsi="Courier New" w:cs="Courier New"/>
@@ -2255,7 +1719,7 @@
           <w:szCs w:val="20"/>
           <w:lang w:val="en-GB"/>
         </w:rPr>
-        <w:t>' in navigator) {</w:t>
+        <w:t xml:space="preserve">    window.addEventListener('load', () =&gt; {</w:t>
       </w:r>
     </w:p>
     <w:p>
@@ -2276,9 +1740,19 @@
           <w:szCs w:val="20"/>
           <w:lang w:val="en-GB"/>
         </w:rPr>
-        <w:t xml:space="preserve">    </w:t>
-      </w:r>
-      <w:proofErr w:type="spellStart"/>
+        <w:t xml:space="preserve">        navigator.serviceWorker.register('service-worker.js')</w:t>
+      </w:r>
+    </w:p>
+    <w:p>
+      <w:pPr>
+        <w:spacing w:after="0"/>
+        <w:ind w:left="1418"/>
+        <w:rPr>
+          <w:rFonts w:ascii="Courier New" w:hAnsi="Courier New" w:cs="Courier New"/>
+          <w:sz w:val="20"/>
+          <w:szCs w:val="20"/>
+        </w:rPr>
+      </w:pPr>
       <w:r>
         <w:rPr>
           <w:rFonts w:ascii="Courier New" w:hAnsi="Courier New" w:cs="Courier New"/>
@@ -2286,17 +1760,15 @@
           <w:szCs w:val="20"/>
           <w:lang w:val="en-GB"/>
         </w:rPr>
-        <w:t>window.addEventListener</w:t>
-      </w:r>
-      <w:proofErr w:type="spellEnd"/>
+        <w:t xml:space="preserve">            </w:t>
+      </w:r>
       <w:r>
         <w:rPr>
           <w:rFonts w:ascii="Courier New" w:hAnsi="Courier New" w:cs="Courier New"/>
           <w:sz w:val="20"/>
           <w:szCs w:val="20"/>
-          <w:lang w:val="en-GB"/>
-        </w:rPr>
-        <w:t>('load', () =&gt; {</w:t>
+        </w:rPr>
+        <w:t>.then(reg =&gt; console.log('Service Worker enregistré avec succès !', reg.scope))</w:t>
       </w:r>
     </w:p>
     <w:p>
@@ -2307,7 +1779,6 @@
           <w:rFonts w:ascii="Courier New" w:hAnsi="Courier New" w:cs="Courier New"/>
           <w:sz w:val="20"/>
           <w:szCs w:val="20"/>
-          <w:lang w:val="en-GB"/>
         </w:rPr>
       </w:pPr>
       <w:r>
@@ -2315,29 +1786,27 @@
           <w:rFonts w:ascii="Courier New" w:hAnsi="Courier New" w:cs="Courier New"/>
           <w:sz w:val="20"/>
           <w:szCs w:val="20"/>
-          <w:lang w:val="en-GB"/>
-        </w:rPr>
-        <w:t xml:space="preserve">        </w:t>
-      </w:r>
-      <w:proofErr w:type="spellStart"/>
-      <w:r>
+        </w:rPr>
+        <w:t xml:space="preserve">            .catch(err =&gt; console.error('Échec de l\'enregistrement du Service Worker :', err));</w:t>
+      </w:r>
+    </w:p>
+    <w:p>
+      <w:pPr>
+        <w:spacing w:after="0"/>
+        <w:ind w:left="1418"/>
         <w:rPr>
           <w:rFonts w:ascii="Courier New" w:hAnsi="Courier New" w:cs="Courier New"/>
           <w:sz w:val="20"/>
           <w:szCs w:val="20"/>
-          <w:lang w:val="en-GB"/>
-        </w:rPr>
-        <w:t>navigator.serviceWorker.register</w:t>
-      </w:r>
-      <w:proofErr w:type="spellEnd"/>
+        </w:rPr>
+      </w:pPr>
       <w:r>
         <w:rPr>
           <w:rFonts w:ascii="Courier New" w:hAnsi="Courier New" w:cs="Courier New"/>
           <w:sz w:val="20"/>
           <w:szCs w:val="20"/>
-          <w:lang w:val="en-GB"/>
-        </w:rPr>
-        <w:t>('service-worker.js')</w:t>
+        </w:rPr>
+        <w:t xml:space="preserve">    });</w:t>
       </w:r>
     </w:p>
     <w:p>
@@ -2355,180 +1824,6 @@
           <w:rFonts w:ascii="Courier New" w:hAnsi="Courier New" w:cs="Courier New"/>
           <w:sz w:val="20"/>
           <w:szCs w:val="20"/>
-          <w:lang w:val="en-GB"/>
-        </w:rPr>
-        <w:t xml:space="preserve">            </w:t>
-      </w:r>
-      <w:r>
-        <w:rPr>
-          <w:rFonts w:ascii="Courier New" w:hAnsi="Courier New" w:cs="Courier New"/>
-          <w:sz w:val="20"/>
-          <w:szCs w:val="20"/>
-        </w:rPr>
-        <w:t>.</w:t>
-      </w:r>
-      <w:proofErr w:type="spellStart"/>
-      <w:r>
-        <w:rPr>
-          <w:rFonts w:ascii="Courier New" w:hAnsi="Courier New" w:cs="Courier New"/>
-          <w:sz w:val="20"/>
-          <w:szCs w:val="20"/>
-        </w:rPr>
-        <w:t>then</w:t>
-      </w:r>
-      <w:proofErr w:type="spellEnd"/>
-      <w:r>
-        <w:rPr>
-          <w:rFonts w:ascii="Courier New" w:hAnsi="Courier New" w:cs="Courier New"/>
-          <w:sz w:val="20"/>
-          <w:szCs w:val="20"/>
-        </w:rPr>
-        <w:t xml:space="preserve">(reg =&gt; console.log('Service Worker enregistré avec succès !', </w:t>
-      </w:r>
-      <w:proofErr w:type="spellStart"/>
-      <w:r>
-        <w:rPr>
-          <w:rFonts w:ascii="Courier New" w:hAnsi="Courier New" w:cs="Courier New"/>
-          <w:sz w:val="20"/>
-          <w:szCs w:val="20"/>
-        </w:rPr>
-        <w:t>reg.scope</w:t>
-      </w:r>
-      <w:proofErr w:type="spellEnd"/>
-      <w:r>
-        <w:rPr>
-          <w:rFonts w:ascii="Courier New" w:hAnsi="Courier New" w:cs="Courier New"/>
-          <w:sz w:val="20"/>
-          <w:szCs w:val="20"/>
-        </w:rPr>
-        <w:t>))</w:t>
-      </w:r>
-    </w:p>
-    <w:p>
-      <w:pPr>
-        <w:spacing w:after="0"/>
-        <w:ind w:left="1418"/>
-        <w:rPr>
-          <w:rFonts w:ascii="Courier New" w:hAnsi="Courier New" w:cs="Courier New"/>
-          <w:sz w:val="20"/>
-          <w:szCs w:val="20"/>
-        </w:rPr>
-      </w:pPr>
-      <w:r>
-        <w:rPr>
-          <w:rFonts w:ascii="Courier New" w:hAnsi="Courier New" w:cs="Courier New"/>
-          <w:sz w:val="20"/>
-          <w:szCs w:val="20"/>
-        </w:rPr>
-        <w:t xml:space="preserve">            .catch(</w:t>
-      </w:r>
-      <w:proofErr w:type="spellStart"/>
-      <w:r>
-        <w:rPr>
-          <w:rFonts w:ascii="Courier New" w:hAnsi="Courier New" w:cs="Courier New"/>
-          <w:sz w:val="20"/>
-          <w:szCs w:val="20"/>
-        </w:rPr>
-        <w:t>err</w:t>
-      </w:r>
-      <w:proofErr w:type="spellEnd"/>
-      <w:r>
-        <w:rPr>
-          <w:rFonts w:ascii="Courier New" w:hAnsi="Courier New" w:cs="Courier New"/>
-          <w:sz w:val="20"/>
-          <w:szCs w:val="20"/>
-        </w:rPr>
-        <w:t xml:space="preserve"> =&gt; </w:t>
-      </w:r>
-      <w:proofErr w:type="spellStart"/>
-      <w:r>
-        <w:rPr>
-          <w:rFonts w:ascii="Courier New" w:hAnsi="Courier New" w:cs="Courier New"/>
-          <w:sz w:val="20"/>
-          <w:szCs w:val="20"/>
-        </w:rPr>
-        <w:t>console.error</w:t>
-      </w:r>
-      <w:proofErr w:type="spellEnd"/>
-      <w:r>
-        <w:rPr>
-          <w:rFonts w:ascii="Courier New" w:hAnsi="Courier New" w:cs="Courier New"/>
-          <w:sz w:val="20"/>
-          <w:szCs w:val="20"/>
-        </w:rPr>
-        <w:t xml:space="preserve">('Échec de </w:t>
-      </w:r>
-      <w:proofErr w:type="spellStart"/>
-      <w:r>
-        <w:rPr>
-          <w:rFonts w:ascii="Courier New" w:hAnsi="Courier New" w:cs="Courier New"/>
-          <w:sz w:val="20"/>
-          <w:szCs w:val="20"/>
-        </w:rPr>
-        <w:t>l</w:t>
-      </w:r>
-      <w:proofErr w:type="spellEnd"/>
-      <w:r>
-        <w:rPr>
-          <w:rFonts w:ascii="Courier New" w:hAnsi="Courier New" w:cs="Courier New"/>
-          <w:sz w:val="20"/>
-          <w:szCs w:val="20"/>
-        </w:rPr>
-        <w:t xml:space="preserve">\'enregistrement du Service Worker :', </w:t>
-      </w:r>
-      <w:proofErr w:type="spellStart"/>
-      <w:r>
-        <w:rPr>
-          <w:rFonts w:ascii="Courier New" w:hAnsi="Courier New" w:cs="Courier New"/>
-          <w:sz w:val="20"/>
-          <w:szCs w:val="20"/>
-        </w:rPr>
-        <w:t>err</w:t>
-      </w:r>
-      <w:proofErr w:type="spellEnd"/>
-      <w:r>
-        <w:rPr>
-          <w:rFonts w:ascii="Courier New" w:hAnsi="Courier New" w:cs="Courier New"/>
-          <w:sz w:val="20"/>
-          <w:szCs w:val="20"/>
-        </w:rPr>
-        <w:t>));</w:t>
-      </w:r>
-    </w:p>
-    <w:p>
-      <w:pPr>
-        <w:spacing w:after="0"/>
-        <w:ind w:left="1418"/>
-        <w:rPr>
-          <w:rFonts w:ascii="Courier New" w:hAnsi="Courier New" w:cs="Courier New"/>
-          <w:sz w:val="20"/>
-          <w:szCs w:val="20"/>
-        </w:rPr>
-      </w:pPr>
-      <w:r>
-        <w:rPr>
-          <w:rFonts w:ascii="Courier New" w:hAnsi="Courier New" w:cs="Courier New"/>
-          <w:sz w:val="20"/>
-          <w:szCs w:val="20"/>
-        </w:rPr>
-        <w:t xml:space="preserve">    });</w:t>
-      </w:r>
-    </w:p>
-    <w:p>
-      <w:pPr>
-        <w:spacing w:after="0"/>
-        <w:ind w:left="1418"/>
-        <w:rPr>
-          <w:rFonts w:ascii="Courier New" w:hAnsi="Courier New" w:cs="Courier New"/>
-          <w:sz w:val="20"/>
-          <w:szCs w:val="20"/>
-        </w:rPr>
-      </w:pPr>
-      <w:r>
-        <w:rPr>
-          <w:rFonts w:ascii="Courier New" w:hAnsi="Courier New" w:cs="Courier New"/>
-          <w:sz w:val="20"/>
-          <w:szCs w:val="20"/>
         </w:rPr>
         <w:t>}</w:t>
       </w:r>
@@ -2542,17 +1837,8 @@
           <w:b/>
           <w:bCs/>
         </w:rPr>
-        <w:t xml:space="preserve">Générer l'APK avec </w:t>
-      </w:r>
-      <w:proofErr w:type="spellStart"/>
-      <w:r>
-        <w:rPr>
-          <w:b/>
-          <w:bCs/>
-        </w:rPr>
-        <w:t>PWABuilder</w:t>
-      </w:r>
-      <w:proofErr w:type="spellEnd"/>
+        <w:t>Générer l'APK avec PWABuilder</w:t>
+      </w:r>
     </w:p>
     <w:p>
       <w:r>
@@ -2661,21 +1947,12 @@
       <w:r>
         <w:t xml:space="preserve">, cliquez sur </w:t>
       </w:r>
-      <w:proofErr w:type="spellStart"/>
-      <w:r>
-        <w:rPr>
-          <w:b/>
-          <w:bCs/>
-        </w:rPr>
-        <w:t>Generate</w:t>
-      </w:r>
-      <w:proofErr w:type="spellEnd"/>
-      <w:r>
-        <w:rPr>
-          <w:b/>
-          <w:bCs/>
-        </w:rPr>
-        <w:t xml:space="preserve"> Package</w:t>
+      <w:r>
+        <w:rPr>
+          <w:b/>
+          <w:bCs/>
+        </w:rPr>
+        <w:t>Generate Package</w:t>
       </w:r>
       <w:r>
         <w:t>.</w:t>
@@ -2699,15 +1976,7 @@
         <w:t>clés de signature</w:t>
       </w:r>
       <w:r>
-        <w:t xml:space="preserve"> (</w:t>
-      </w:r>
-      <w:proofErr w:type="spellStart"/>
-      <w:r>
-        <w:t>signing</w:t>
-      </w:r>
-      <w:proofErr w:type="spellEnd"/>
-      <w:r>
-        <w:t xml:space="preserve"> key) que le site vous propose de sauvegarder. Elle sera indispensable pour faire de futures mises à jour.</w:t>
+        <w:t xml:space="preserve"> (signing key) que le site vous propose de sauvegarder. Elle sera indispensable pour faire de futures mises à jour.</w:t>
       </w:r>
     </w:p>
     <w:p>
@@ -2740,27 +2009,10 @@
           <w:b/>
           <w:bCs/>
         </w:rPr>
-        <w:t>app-release-</w:t>
-      </w:r>
-      <w:proofErr w:type="spellStart"/>
-      <w:r>
-        <w:rPr>
-          <w:b/>
-          <w:bCs/>
-        </w:rPr>
-        <w:t>unsigned.apk</w:t>
-      </w:r>
-      <w:proofErr w:type="spellEnd"/>
-      <w:r>
-        <w:t xml:space="preserve"> (ou parfois simplement avec l'extension .</w:t>
-      </w:r>
-      <w:proofErr w:type="spellStart"/>
-      <w:r>
-        <w:t>apk</w:t>
-      </w:r>
-      <w:proofErr w:type="spellEnd"/>
-      <w:r>
-        <w:t>). C'est ce précieux fichier qu'il faut envoyer à vos proches.</w:t>
+        <w:t>app-release-unsigned.apk</w:t>
+      </w:r>
+      <w:r>
+        <w:t xml:space="preserve"> (ou parfois simplement avec l'extension .apk). C'est ce précieux fichier qu'il faut envoyer à vos proches.</w:t>
       </w:r>
     </w:p>
     <w:p/>

</xml_diff>